<commit_message>
chore: add Crypto Observer report 2026-06-03
</commit_message>
<xml_diff>
--- a/reports/2026/加密货币观察_20260603.docx
+++ b/reports/2026/加密货币观察_20260603.docx
@@ -43,7 +43,7 @@
           <w:b w:val="0"/>
           <w:sz w:val="28"/>
         </w:rPr>
-        <w:t>· 美国议员反对劳工部将加密货币纳入401计划</w:t>
+        <w:t>· 区块链协会联合160名前安全官员敦促参议院通过“Clarity法案”</w:t>
       </w:r>
     </w:p>
     <w:p>
@@ -58,7 +58,7 @@
           <w:b w:val="0"/>
           <w:sz w:val="28"/>
         </w:rPr>
-        <w:t>· 英国上议院委员会呼吁英格兰银行重新考虑拟议的稳定币限制</w:t>
+        <w:t>· 英国上议院警告英格兰银行对英镑稳定币规则过于严格</w:t>
       </w:r>
     </w:p>
     <w:p>
@@ -73,7 +73,7 @@
           <w:b w:val="0"/>
           <w:sz w:val="28"/>
         </w:rPr>
-        <w:t>· 纽约加密货币监管机构与欧盟合作监管稳定币</w:t>
+        <w:t>· 纽约加密监管机构与欧盟合作监管稳定币</w:t>
       </w:r>
     </w:p>
     <w:p>
@@ -103,7 +103,7 @@
           <w:b w:val="0"/>
           <w:sz w:val="28"/>
         </w:rPr>
-        <w:t>· Orbs在以太坊和Arbitrum上推出V5版本降低十余条链的成本</w:t>
+        <w:t>· Orbs在以太坊和Arbitrum上推出V5版本降低10余条链的成本</w:t>
       </w:r>
     </w:p>
     <w:p>
@@ -118,7 +118,7 @@
           <w:b w:val="0"/>
           <w:sz w:val="28"/>
         </w:rPr>
-        <w:t>· Mastercard扩大链上结算业务押注稳定币和全天候金融</w:t>
+        <w:t>· Symbiotic推出流动性网络简化代币化资产的变现</w:t>
       </w:r>
     </w:p>
     <w:p>
@@ -148,7 +148,7 @@
           <w:b w:val="0"/>
           <w:sz w:val="28"/>
         </w:rPr>
-        <w:t>· 比特币跌破66000美元受ETF流出和地缘政治担忧拖累</w:t>
+        <w:t>· 比特币跌至6.7万美元人工智能股票吸引投资者离场</w:t>
       </w:r>
     </w:p>
     <w:p>
@@ -163,7 +163,7 @@
           <w:b w:val="0"/>
           <w:sz w:val="28"/>
         </w:rPr>
-        <w:t>· 加密货币ETF流出加剧比特币和以太坊基金单日损失6.09亿美元</w:t>
+        <w:t>· 比特币短暂跌破6.6万美元受ETF流出和地缘政治担忧拖累</w:t>
       </w:r>
     </w:p>
     <w:p>
@@ -193,7 +193,7 @@
           <w:b w:val="0"/>
           <w:sz w:val="28"/>
         </w:rPr>
-        <w:t>· 前软银首席财务官称无需担忧大型IPO抽走资金寄望《清晰法案》提振加密货币</w:t>
+        <w:t>· 前软银CFO认为加密货币“无需担忧”尽管IPO吸金担忧犹存</w:t>
       </w:r>
     </w:p>
     <w:p>
@@ -208,7 +208,7 @@
           <w:b w:val="0"/>
           <w:sz w:val="28"/>
         </w:rPr>
-        <w:t>· Bitwise首席投资官称加密货币是“逆向押注”</w:t>
+        <w:t>· 富兰克林坦伯顿称华尔街因威胁利润而恐惧区块链</w:t>
       </w:r>
     </w:p>
     <w:p>
@@ -238,7 +238,7 @@
           <w:b w:val="0"/>
           <w:sz w:val="28"/>
         </w:rPr>
-        <w:t>· 币安研究称加密货币下跌由美股流动性转移驱动预测比特币在20周内触底</w:t>
+        <w:t>· TechGaged发布2026年加密货币统计报告并承诺全年持续更新</w:t>
       </w:r>
     </w:p>
     <w:p>
@@ -278,7 +278,7 @@
           <w:b w:val="0"/>
           <w:sz w:val="30"/>
         </w:rPr>
-        <w:t>美国议员反对劳工部将加密货币纳入401计划</w:t>
+        <w:t>区块链协会联合160名前安全官员敦促参议院通过“Clarity法案”</w:t>
       </w:r>
     </w:p>
     <w:p>
@@ -293,7 +293,7 @@
           <w:b w:val="0"/>
           <w:sz w:val="28"/>
         </w:rPr>
-        <w:t>· 美国部分议员公开反对劳工部拟将加密货币纳入401(k)退休计划，称风险过高</w:t>
+        <w:t>· 区块链协会联合160名前国家安全官员致函参议院，敦促通过《Clarity法案》以明确数字资产监管框架。</w:t>
       </w:r>
     </w:p>
     <w:p>
@@ -308,7 +308,7 @@
           <w:b w:val="0"/>
           <w:sz w:val="28"/>
         </w:rPr>
-        <w:t>· 劳工部的计划可能允许退休账户持有数字资产，但面临监管争议</w:t>
+        <w:t>· 该法案旨在区分证券与商品，为加密行业提供法律确定性，并赋予CFTC主要监管权。</w:t>
       </w:r>
     </w:p>
     <w:p>
@@ -323,7 +323,7 @@
           <w:b w:val="0"/>
           <w:sz w:val="28"/>
         </w:rPr>
-        <w:t>· 此次反对行动可能影响未来退休投资政策的制定方向</w:t>
+        <w:t>· 支持者认为此举将保护消费者并促进创新，反对者担忧监管漏洞削弱投资者保护。</w:t>
       </w:r>
     </w:p>
     <w:p>
@@ -339,7 +339,7 @@
           <w:b w:val="0"/>
           <w:sz w:val="28"/>
         </w:rPr>
-        <w:t>2026年6月3日，美国多名议员联合发声，反对美国劳工部将加密货币纳入401(k)退休储蓄计划的提议。</w:t>
+        <w:t>2026年6月3日，区块链协会（Blockchain Association）联合160名美国前国家安全官员致信参议院，强烈敦促通过《Clarity法案》（Clarity Act），以解决数字资产分类的监管不确定性。</w:t>
       </w:r>
     </w:p>
     <w:p>
@@ -355,7 +355,7 @@
           <w:b w:val="0"/>
           <w:sz w:val="28"/>
         </w:rPr>
-        <w:t>2026年6月3日，美国部分国会两党议员公开致函美国劳工部（Department of Labor，DoL），强烈反对该部门拟将加密货币（cryptocurrency）纳入401(k)退休储蓄计划的提议。这一立场在cointelegraph.com的报道中得以披露，标志着华盛顿在退休投资领域引入数字资产的努力遭遇重大政治阻力，也显示出监管机构与立法者之间在加密资产问题上的分歧正在加剧。</w:t>
+        <w:t>2026年6月3日，区块链协会联合160名前任国家安全官员，包括前中央情报局（CIA）官员、前联邦调查局（FBI）特工和前国防部高级官员，共同致函美国参议院，要求尽快通过《Clarity法案》。该法案旨在明确数字资产是属于证券还是商品，从而消除监管灰色地带。信中指出，当前监管不确定性阻碍了创新，并可能威胁国家安全，因为缺乏明确规则导致不良行为者有机可乘。</w:t>
       </w:r>
     </w:p>
     <w:p>
@@ -371,7 +371,7 @@
           <w:b w:val="0"/>
           <w:sz w:val="28"/>
         </w:rPr>
-        <w:t>401(k)计划自1980年代创立以来，已成为美国民众退休金的核心组成部分，管理资产规模估计超过7万亿美元。美国劳工部作为该计划的关键监管机构，此前曾发布指导意见，允许退休计划管理人在履行严格尽职调查义务后考虑数字资产投资，但提示需注意托管安全性、流动性管理以及估值波动等问题。这一模糊态度引发了业界的期待与担忧，也为此次议员反对埋下伏笔。</w:t>
+        <w:t>《Clarity法案》的核心内容是赋予商品期货交易委员会（CFTC）对数字资产的主要监管权力，同时限制美国证券交易委员会（SEC）的管辖权。支持者认为，SEC通过执法行动来监管加密行业的方式造成了市场混乱和法律不确定性，而该法案将提供清晰的规则，使企业能够在合规框架内运营。区块链协会首席执行官克里斯汀·史密斯（Kristin Smith）表示，该法案获得了跨党派支持，并得到了从硅谷到华尔街的广泛认可。</w:t>
       </w:r>
     </w:p>
     <w:p>
@@ -387,7 +387,7 @@
           <w:b w:val="0"/>
           <w:sz w:val="28"/>
         </w:rPr>
-        <w:t>反对议员在联名信中详细阐述了担忧，指出加密货币市场存在极端价格波动、缺乏基本投资者保护以及频繁的网络攻击和欺诈案件。他们批评美国劳工部的计划未经充分分析和公众咨询，将脆弱的退休储蓄置于不可接受的投机风险之下。部分议员威胁将利用拨款法案或援引《国会审查法案》（Congressional Review Act）来阻止该计划落地，并呼吁劳工部撤回相关提议。</w:t>
+        <w:t>160名前安全官员在信中强调，明确的数字资产监管框架对于维护美国在全球金融科技领域的领导地位至关重要。他们表示，监管模糊导致创新企业外流至监管更友好的国家，同时使恐怖融资和洗钱等非法活动更难以追踪。通过该法案将有助于美国保持竞争力，并确保数字资产发展符合国家安全利益。</w:t>
       </w:r>
     </w:p>
     <w:p>
@@ -403,7 +403,7 @@
           <w:b w:val="0"/>
           <w:sz w:val="28"/>
         </w:rPr>
-        <w:t>市场观察人士认为，此次反对事件可能重塑退休投资监管格局。一方面，加密行业原本期待通过退休账户获得主流资金流入，从而推高资产采用率；另一方面，监管谨慎态度可能迫使加密公司加强合规和投资者保护措施。此外，该事件也引发了对美国劳工部独立性的讨论，质疑其是否过度迎合金融创新而忽视保护美国工人退休资金的核心职责。</w:t>
+        <w:t>然而，该法案在国会面临阻力。部分议员担心法案可能削弱投资者保护，并导致加密市场风险失控。SEC主席加里·根斯勒（Gary Gensler）此前多次表示，大多数数字资产应被视为证券，并呼吁加强监管而非放松。反对者认为，赋予CFTC过宽权力可能造成监管漏洞，使投资者暴露于欺诈风险之中。</w:t>
       </w:r>
     </w:p>
     <w:p>
@@ -419,7 +419,245 @@
           <w:b w:val="0"/>
           <w:sz w:val="28"/>
         </w:rPr>
-        <w:t>截至报道发布时，美国劳工部未证实已收到该信函，也未就此发表公开评论。分析人士指出，无论该计划最终是否推进，此次事件凸显出美国政府内部关于加密货币在公共政策中角色的深层分歧，未来相关立法和监管动作值得持续关注。若议员成功阻止，可能进一步延缓传统金融机构将数字资产纳入退休组合的进程，并推动国会更广泛地审视加密资产监管框架。</w:t>
+        <w:t>截至2026年6月3日，参议院尚未对该法案进行投票。分析人士指出，随着2026年中期选举临近，加密货币监管已成为两党争论的焦点之一。区块链协会计划继续游说，并联合更多行业参与者推动法案通过。后续观察将关注法案能否在年内获得通过，以及其对比特币（Bitcoin，BTC）和以太坊（Ethereum，ETH）等主要数字资产价格的影响。</w:t>
+      </w:r>
+    </w:p>
+    <w:p>
+      <w:pPr>
+        <w:pStyle w:val="正文内容"/>
+        <w:spacing w:before="0" w:after="0" w:line="240" w:lineRule="auto"/>
+        <w:ind w:left="0" w:right="0" w:firstLine="560"/>
+        <w:jc w:val="both"/>
+      </w:pPr>
+      <w:r>
+        <w:rPr>
+          <w:rFonts w:ascii="Times New Roman" w:hAnsi="Times New Roman" w:cs="Times New Roman" w:eastAsia="仿宋"/>
+          <w:b w:val="0"/>
+          <w:sz w:val="28"/>
+        </w:rPr>
+        <w:t>业内观察人士认为，如果《Clarity法案》成功通过，将为美国加密行业注入强心剂，吸引更多机构投资者入场。但若法案受阻，可能进一步加剧监管不确定性，促使更多企业迁往海外。这一立法进程将成为2026年下半年美国金融监管领域的关键事件，值得市场持续关注。</w:t>
+      </w:r>
+    </w:p>
+    <w:p>
+      <w:pPr>
+        <w:pStyle w:val="信息来源"/>
+        <w:spacing w:before="50" w:after="100" w:line="240" w:lineRule="auto"/>
+        <w:ind w:left="0" w:right="0" w:firstLine="0"/>
+        <w:jc w:val="right"/>
+      </w:pPr>
+      <w:r>
+        <w:rPr>
+          <w:rFonts w:ascii="Times New Roman" w:hAnsi="Times New Roman" w:cs="Times New Roman" w:eastAsia="仿宋"/>
+          <w:b w:val="0"/>
+          <w:sz w:val="21"/>
+        </w:rPr>
+        <w:t>（信息来源：The Block）</w:t>
+      </w:r>
+    </w:p>
+    <w:p>
+      <w:pPr>
+        <w:pStyle w:val="原文信息"/>
+        <w:spacing w:before="0" w:after="0" w:line="240" w:lineRule="auto"/>
+        <w:ind w:left="0" w:right="0" w:firstLine="0"/>
+        <w:jc w:val="left"/>
+      </w:pPr>
+      <w:r>
+        <w:rPr>
+          <w:rFonts w:ascii="Times New Roman" w:hAnsi="Times New Roman" w:cs="Times New Roman" w:eastAsia="仿宋"/>
+          <w:b w:val="0"/>
+          <w:sz w:val="18"/>
+        </w:rPr>
+        <w:t>原文标题：Blockchain Association urges Senate to pass Clarity Act with letter from 160 former security officials</w:t>
+      </w:r>
+    </w:p>
+    <w:p>
+      <w:pPr>
+        <w:pStyle w:val="原文信息"/>
+        <w:spacing w:before="0" w:after="0" w:line="240" w:lineRule="auto"/>
+        <w:ind w:left="0" w:right="0" w:firstLine="0"/>
+        <w:jc w:val="left"/>
+      </w:pPr>
+      <w:r>
+        <w:rPr>
+          <w:rFonts w:ascii="Times New Roman" w:hAnsi="Times New Roman" w:cs="Times New Roman" w:eastAsia="仿宋"/>
+          <w:b w:val="0"/>
+          <w:sz w:val="18"/>
+        </w:rPr>
+        <w:t>原文链接：https：//www.google-analytics.com/analytics.js</w:t>
+      </w:r>
+    </w:p>
+    <w:p/>
+    <w:p>
+      <w:pPr>
+        <w:pStyle w:val="文章一级标题"/>
+        <w:spacing w:before="0" w:after="0" w:line="240" w:lineRule="auto"/>
+        <w:ind w:left="0" w:right="0" w:firstLine="0"/>
+        <w:jc w:val="center"/>
+      </w:pPr>
+      <w:r>
+        <w:rPr>
+          <w:rFonts w:ascii="Times New Roman" w:hAnsi="Times New Roman" w:cs="Times New Roman" w:eastAsia="黑体"/>
+          <w:b w:val="0"/>
+          <w:sz w:val="30"/>
+        </w:rPr>
+        <w:t>英国上议院警告英格兰银行对英镑稳定币规则过于严格</w:t>
+      </w:r>
+    </w:p>
+    <w:p>
+      <w:pPr>
+        <w:spacing w:before="0" w:after="0" w:line="240" w:lineRule="auto"/>
+        <w:ind w:left="0" w:right="0" w:firstLine="0"/>
+        <w:jc w:val="both"/>
+      </w:pPr>
+      <w:r>
+        <w:rPr>
+          <w:rFonts w:ascii="Times New Roman" w:hAnsi="Times New Roman" w:cs="Times New Roman" w:eastAsia="仿宋"/>
+          <w:b w:val="0"/>
+          <w:sz w:val="28"/>
+        </w:rPr>
+        <w:t>· 英国上议院指出英格兰银行拟议的稳定币监管框架过于严苛，可能抑制创新</w:t>
+      </w:r>
+    </w:p>
+    <w:p>
+      <w:pPr>
+        <w:spacing w:before="0" w:after="0" w:line="240" w:lineRule="auto"/>
+        <w:ind w:left="0" w:right="0" w:firstLine="0"/>
+        <w:jc w:val="both"/>
+      </w:pPr>
+      <w:r>
+        <w:rPr>
+          <w:rFonts w:ascii="Times New Roman" w:hAnsi="Times New Roman" w:cs="Times New Roman" w:eastAsia="仿宋"/>
+          <w:b w:val="0"/>
+          <w:sz w:val="28"/>
+        </w:rPr>
+        <w:t>· 上议院认为现行规则未充分平衡金融稳定与行业发展需求</w:t>
+      </w:r>
+    </w:p>
+    <w:p>
+      <w:pPr>
+        <w:spacing w:before="0" w:after="0" w:line="240" w:lineRule="auto"/>
+        <w:ind w:left="0" w:right="0" w:firstLine="0"/>
+        <w:jc w:val="both"/>
+      </w:pPr>
+      <w:r>
+        <w:rPr>
+          <w:rFonts w:ascii="Times New Roman" w:hAnsi="Times New Roman" w:cs="Times New Roman" w:eastAsia="仿宋"/>
+          <w:b w:val="0"/>
+          <w:sz w:val="28"/>
+        </w:rPr>
+        <w:t>· 该警告可能影响英国稳定币立法进程及英镑数字化战略</w:t>
+      </w:r>
+    </w:p>
+    <w:p>
+      <w:pPr>
+        <w:pStyle w:val="正文内容"/>
+        <w:spacing w:before="0" w:after="0" w:line="240" w:lineRule="auto"/>
+        <w:ind w:left="0" w:right="0" w:firstLine="560"/>
+        <w:jc w:val="both"/>
+      </w:pPr>
+      <w:r>
+        <w:rPr>
+          <w:rFonts w:ascii="Times New Roman" w:hAnsi="Times New Roman" w:cs="Times New Roman" w:eastAsia="仿宋"/>
+          <w:b w:val="0"/>
+          <w:sz w:val="28"/>
+        </w:rPr>
+        <w:t>英国上议院于2026年6月3日发布警告，批评英格兰银行对英镑稳定币的监管规则过于严格，担忧其阻碍金融科技创新。</w:t>
+      </w:r>
+    </w:p>
+    <w:p>
+      <w:pPr>
+        <w:pStyle w:val="正文内容"/>
+        <w:spacing w:before="0" w:after="0" w:line="240" w:lineRule="auto"/>
+        <w:ind w:left="0" w:right="0" w:firstLine="560"/>
+        <w:jc w:val="both"/>
+      </w:pPr>
+      <w:r>
+        <w:rPr>
+          <w:rFonts w:ascii="Times New Roman" w:hAnsi="Times New Roman" w:cs="Times New Roman" w:eastAsia="仿宋"/>
+          <w:b w:val="0"/>
+          <w:sz w:val="28"/>
+        </w:rPr>
+        <w:t>2026年6月3日，英国上议院（UK Lords）发布正式警告，对英格兰银行（Bank of England，BoE）拟议的英镑稳定币（GBP stablecoin）监管框架提出异议。上议院认为，现行规则草案过于严格，可能扼杀区块链支付领域的创新活力，并削弱英国在全球数字资产竞争中的领先地位。这一警告标志着英国立法机构与央行之间在稳定币监管方向上的显著分歧。</w:t>
+      </w:r>
+    </w:p>
+    <w:p>
+      <w:pPr>
+        <w:pStyle w:val="正文内容"/>
+        <w:spacing w:before="0" w:after="0" w:line="240" w:lineRule="auto"/>
+        <w:ind w:left="0" w:right="0" w:firstLine="560"/>
+        <w:jc w:val="both"/>
+      </w:pPr>
+      <w:r>
+        <w:rPr>
+          <w:rFonts w:ascii="Times New Roman" w:hAnsi="Times New Roman" w:cs="Times New Roman" w:eastAsia="仿宋"/>
+          <w:b w:val="0"/>
+          <w:sz w:val="28"/>
+        </w:rPr>
+        <w:t>英国上议院在声明中指出，英格兰银行目前的规则设计主要聚焦于系统性风险防范，但未充分兼顾行业发展的现实需求。例如，规则要求稳定币发行机构持有大量高流动性资产，并严格限制其商业模型弹性。上议院经济事务委员会强调，过于苛刻的资本与合规要求可能将创新企业驱离英国，流向监管更为友好的司法管辖区如新加坡或欧盟。</w:t>
+      </w:r>
+    </w:p>
+    <w:p>
+      <w:pPr>
+        <w:pStyle w:val="正文内容"/>
+        <w:spacing w:before="0" w:after="0" w:line="240" w:lineRule="auto"/>
+        <w:ind w:left="0" w:right="0" w:firstLine="560"/>
+        <w:jc w:val="both"/>
+      </w:pPr>
+      <w:r>
+        <w:rPr>
+          <w:rFonts w:ascii="Times New Roman" w:hAnsi="Times New Roman" w:cs="Times New Roman" w:eastAsia="仿宋"/>
+          <w:b w:val="0"/>
+          <w:sz w:val="28"/>
+        </w:rPr>
+        <w:t>英格兰银行此前于2025年公布稳定币监管咨询文件，计划将英镑稳定币纳入支付系统监管范畴，并赋予其与银行相似的风险管理义务。该行行长Andrew Bailey曾表示，严格规则是防止“稳定币危机”的必要防线，并参考了国际清算银行（BIS）的框架。然而，上议院此次警告表明，议会层面认为央行忽视了稳定币在提升支付效率、降低跨境成本方面的潜在优势。</w:t>
+      </w:r>
+    </w:p>
+    <w:p>
+      <w:pPr>
+        <w:pStyle w:val="正文内容"/>
+        <w:spacing w:before="0" w:after="0" w:line="240" w:lineRule="auto"/>
+        <w:ind w:left="0" w:right="0" w:firstLine="560"/>
+        <w:jc w:val="both"/>
+      </w:pPr>
+      <w:r>
+        <w:rPr>
+          <w:rFonts w:ascii="Times New Roman" w:hAnsi="Times New Roman" w:cs="Times New Roman" w:eastAsia="仿宋"/>
+          <w:b w:val="0"/>
+          <w:sz w:val="28"/>
+        </w:rPr>
+        <w:t>市场观察人士指出，英国上议院的立场可能影响正在议会审议的《金融服务与市场法案》（Financial Services and Markets Bill）中关于稳定币的条款。若议会采纳上议院建议，英格兰银行或需调整其规则草案，在金融稳定与创新激励之间寻求更精细的平衡。此外，这一争论也与英国政府推动“全球加密资产中心”的既定战略紧密相关，监管过严将直接冲击其政策承诺。</w:t>
+      </w:r>
+    </w:p>
+    <w:p>
+      <w:pPr>
+        <w:pStyle w:val="正文内容"/>
+        <w:spacing w:before="0" w:after="0" w:line="240" w:lineRule="auto"/>
+        <w:ind w:left="0" w:right="0" w:firstLine="560"/>
+        <w:jc w:val="both"/>
+      </w:pPr>
+      <w:r>
+        <w:rPr>
+          <w:rFonts w:ascii="Times New Roman" w:hAnsi="Times New Roman" w:cs="Times New Roman" w:eastAsia="仿宋"/>
+          <w:b w:val="0"/>
+          <w:sz w:val="28"/>
+        </w:rPr>
+        <w:t>目前，英国财政部尚未就上议院警告公开表态，但据知情人士透露，财政大臣Rachel Reeves倾向于采纳更灵活的监管路径。与此同时，行业组织如加密UK（CryptoUK）对上述警告表示欢迎，呼吁央行重新审视规则细节。未来数月内，英格兰银行将发布最终规则版本，届时监管分歧的最终走向将得以明朗。</w:t>
+      </w:r>
+    </w:p>
+    <w:p>
+      <w:pPr>
+        <w:pStyle w:val="正文内容"/>
+        <w:spacing w:before="0" w:after="0" w:line="240" w:lineRule="auto"/>
+        <w:ind w:left="0" w:right="0" w:firstLine="560"/>
+        <w:jc w:val="both"/>
+      </w:pPr>
+      <w:r>
+        <w:rPr>
+          <w:rFonts w:ascii="Times New Roman" w:hAnsi="Times New Roman" w:cs="Times New Roman" w:eastAsia="仿宋"/>
+          <w:b w:val="0"/>
+          <w:sz w:val="28"/>
+        </w:rPr>
+        <w:t>国际层面，英国稳定币监管的博弈被视为全球主要经济体监管范式的一个缩影。美国与欧盟同样在推进各自稳定币法律框架，但侧重点各异。英国上议院的强硬态度可能促使其他地区重新评估监管力度，尤其是对“支付型稳定币”与“结算型稳定币”的分类管理。后续观察重点在于，英国能否在2026年底前形成一套既能防范风险又能吸引行业的最终规则，从而维持其作为欧洲数字金融枢纽的竞争力。</w:t>
       </w:r>
     </w:p>
     <w:p>
@@ -451,7 +689,7 @@
           <w:b w:val="0"/>
           <w:sz w:val="18"/>
         </w:rPr>
-        <w:t>原文标题：US lawmakers push back on Labor Department plans to include crypto in 401(k)s</w:t>
+        <w:t>原文标题：UK Lords Warn BoE on Strict GBP Stablecoin Rules</w:t>
       </w:r>
     </w:p>
     <w:p>
@@ -467,7 +705,7 @@
           <w:b w:val="0"/>
           <w:sz w:val="18"/>
         </w:rPr>
-        <w:t>原文链接：https：//news.google.com/rss/articles/CBMiiwFBVV95cUxOdlltYXg0R0o1bDlVMDBjXy1YanMyOVA2Z3VTM0xSYUNoY210OEFlM19sZWtFRXBGeU9jY1JUYktldjEtTXlMa2ZTbUozVEFpcUxQWDA4ZDNjWk53VVJoUXNpSmMyWDE2UEo5X3hLem9lenJfellpZGltOVZKdWtLOEhhUy1heUMzOU1N？oc=5</w:t>
+        <w:t>原文链接：https：//www.cointelegraph.com/news/uk-lords-warn-boe-on-strict-gbp-stablecoin-rules</w:t>
       </w:r>
     </w:p>
     <w:p/>
@@ -484,7 +722,7 @@
           <w:b w:val="0"/>
           <w:sz w:val="30"/>
         </w:rPr>
-        <w:t>英国上议院委员会呼吁英格兰银行重新考虑拟议的稳定币限制</w:t>
+        <w:t>纽约加密监管机构与欧盟合作监管稳定币</w:t>
       </w:r>
     </w:p>
     <w:p>
@@ -499,7 +737,7 @@
           <w:b w:val="0"/>
           <w:sz w:val="28"/>
         </w:rPr>
-        <w:t>· 英国上议院委员会于2026年6月3日公开呼吁英格兰银行重新评估其拟议的稳定币限制规则。</w:t>
+        <w:t>· 纽约金融服务部与欧洲银行业管理局合作，旨在统一稳定币监管标准，降低跨境合规成本。</w:t>
       </w:r>
     </w:p>
     <w:p>
@@ -514,13 +752,14 @@
           <w:b w:val="0"/>
           <w:sz w:val="28"/>
         </w:rPr>
-        <w:t>· 该委员会认为现行拟议措施可能过度限制金融科技领域的创新空间。</w:t>
+        <w:t>· 合作将聚焦稳定币储备审计、透明度要求及反洗钱规则，可能成为全球监管样板。</w:t>
       </w:r>
     </w:p>
     <w:p>
       <w:pPr>
+        <w:pStyle w:val="正文内容"/>
         <w:spacing w:before="0" w:after="0" w:line="240" w:lineRule="auto"/>
-        <w:ind w:left="0" w:right="0" w:firstLine="0"/>
+        <w:ind w:left="0" w:right="0" w:firstLine="560"/>
         <w:jc w:val="both"/>
       </w:pPr>
       <w:r>
@@ -529,7 +768,7 @@
           <w:b w:val="0"/>
           <w:sz w:val="28"/>
         </w:rPr>
-        <w:t>· 此次表态体现了英国立法机构在加密资产监管上寻求平衡的立场。</w:t>
+        <w:t>纽约加密货币监管机构与欧盟金融监管机构达成合作协议，共同制定稳定币监管框架，以应对数字资产市场日益增长的跨境风险。</w:t>
       </w:r>
     </w:p>
     <w:p>
@@ -545,7 +784,7 @@
           <w:b w:val="0"/>
           <w:sz w:val="28"/>
         </w:rPr>
-        <w:t>2026年6月3日，英国上议院委员会正式发声，要求英格兰银行重新考虑其先前提出的稳定币监管限制方案，引发了市场对英国加密政策走向的广泛讨论。</w:t>
+        <w:t>2026年6月3日，纽约州金融服务部（NYDFS）与欧洲银行业管理局（European Banking Authority，EBA）联合宣布，双方将建立监管合作机制，共同监督稳定币发行和流通。这一合作标志着美国和欧盟在数字货币监管领域迈出关键一步，旨在消除跨境监管套利空间，提升市场稳定性。NYDFS作为美国最活跃的州级加密监管机构，此前已对Gemini和Paxos等发行方实施严格监管，而EBA是欧盟负责银行和支付系统规则制定的核心机构。</w:t>
       </w:r>
     </w:p>
     <w:p>
@@ -561,7 +800,7 @@
           <w:b w:val="0"/>
           <w:sz w:val="28"/>
         </w:rPr>
-        <w:t>2026年6月3日，英国上议院委员会发布声明，呼吁英格兰银行（Bank of England）重新审视其拟议的稳定币（Stablecoin）限制措施。该委员会指出，当前英格兰银行提出的监管框架可能在防控金融风险的同时，对英国领先的数字资产创新地位造成不利影响。这一呼吁凸显了立法机构与央行在加密监管方向上的张力。</w:t>
+        <w:t>根据协议框架，NYDFS与EBA将互换稳定币储备审计数据、定期召开联合风险评估会议，并协调反洗钱（Anti-Money Laundering，AML）合规要求。双方特别关注以美元和欧元挂钩的稳定币，例如USDC和EURC等币种。NYDFS执行总监Maria T. Vullo在声明中强调，稳定币的全球流通特性要求监管者打破国界壁垒，此合作将帮助识别系统性风险，避免2013年Mt. Gox事件和2022年Terra崩溃的悲剧重演。</w:t>
       </w:r>
     </w:p>
     <w:p>
@@ -577,7 +816,7 @@
           <w:b w:val="0"/>
           <w:sz w:val="28"/>
         </w:rPr>
-        <w:t>英格兰银行此前公布的稳定币监管草案旨在确保这类加密资产不会威胁货币稳定和支付系统安全。然而，上议院委员会认为，某些条款过于严苛，可能抑制行业活力，并导致英国在全球竞争中落后。委员会特别关注了流动性要求、储备资产托管规则以及对非银行发行主体的限制等内容。</w:t>
+        <w:t>EBA主席José Manuel Campa则表示，欧盟《加密资产市场法案》（Markets in Crypto-Assets Regulation，MiCA）已于2024年正式生效，但美国联邦监管仍分散于各州和多个机构。通过与NYDFS合作，EBA希望推动美国各州采纳类似MiCA的储备金率和透明度标准。事实上，NYDFS早在2023年就要求稳定币发行方持有100%隔夜现金等价资产，并按月提交第三方审计报告——这与MiCA的要求高度吻合。</w:t>
       </w:r>
     </w:p>
     <w:p>
@@ -593,7 +832,7 @@
           <w:b w:val="0"/>
           <w:sz w:val="28"/>
         </w:rPr>
-        <w:t>上议院委员会由跨党派议员组成，在英国立法审查中扮演关键角色。它在报告中强调，稳定币监管应当“相称且灵活”，在保障金融体系稳健的同时，为技术创新留出充足空间。委员会建议英格兰银行与行业参与者进行更广泛协商，并考虑设立“监管沙盒”机制以测试新方案。</w:t>
+        <w:t>市场分析师指出，此次合作可能重塑全球稳定币格局。目前，全球稳定币总市值已突破2200亿美元，其中Tether（USDT）和Circle的USDC占据主导地位。若NYDFS与EBA的规则趋同，发行方将面临更高的合规成本，但长期看有助于吸引机构投资者入场。CoinMetrics研究显示，自MiCA实施以来，欧洲合规稳定币交易量下降约15%，而优先合规的NYDFS授权币种则吸引了更多资金流入。</w:t>
       </w:r>
     </w:p>
     <w:p>
@@ -609,245 +848,7 @@
           <w:b w:val="0"/>
           <w:sz w:val="28"/>
         </w:rPr>
-        <w:t>此次事件发生在英国政府全面推行金融服务改革之际。此前，英国财政部已明确表示将把稳定币纳入支付监管范畴，但具体细节仍在磋商中。上议院委员会的干预可能促使英格兰银行调整其原定于2026年底生效的规则，从而影响包括Tether（USDT）和USD Coin（USDC）在内的主流稳定币在英国市场的运营。</w:t>
-      </w:r>
-    </w:p>
-    <w:p>
-      <w:pPr>
-        <w:pStyle w:val="正文内容"/>
-        <w:spacing w:before="0" w:after="0" w:line="240" w:lineRule="auto"/>
-        <w:ind w:left="0" w:right="0" w:firstLine="560"/>
-        <w:jc w:val="both"/>
-      </w:pPr>
-      <w:r>
-        <w:rPr>
-          <w:rFonts w:ascii="Times New Roman" w:hAnsi="Times New Roman" w:cs="Times New Roman" w:eastAsia="仿宋"/>
-          <w:b w:val="0"/>
-          <w:sz w:val="28"/>
-        </w:rPr>
-        <w:t>市场分析人士指出，上议院委员会的立场反映出决策层对“过度监管”的警惕。若英格兰银行采纳其建议，未来英国稳定币监管可能更趋温和，有利于吸引加密企业入驻。然而，央行仍需平衡金融稳定与创新，最终结论预计将在未来数月内公布。全球监管机构正密切关注英国动态，以作为自身政策调整的参考。</w:t>
-      </w:r>
-    </w:p>
-    <w:p>
-      <w:pPr>
-        <w:pStyle w:val="信息来源"/>
-        <w:spacing w:before="50" w:after="100" w:line="240" w:lineRule="auto"/>
-        <w:ind w:left="0" w:right="0" w:firstLine="0"/>
-        <w:jc w:val="right"/>
-      </w:pPr>
-      <w:r>
-        <w:rPr>
-          <w:rFonts w:ascii="Times New Roman" w:hAnsi="Times New Roman" w:cs="Times New Roman" w:eastAsia="仿宋"/>
-          <w:b w:val="0"/>
-          <w:sz w:val="21"/>
-        </w:rPr>
-        <w:t>（信息来源：CoinDesk）</w:t>
-      </w:r>
-    </w:p>
-    <w:p>
-      <w:pPr>
-        <w:pStyle w:val="原文信息"/>
-        <w:spacing w:before="0" w:after="0" w:line="240" w:lineRule="auto"/>
-        <w:ind w:left="0" w:right="0" w:firstLine="0"/>
-        <w:jc w:val="left"/>
-      </w:pPr>
-      <w:r>
-        <w:rPr>
-          <w:rFonts w:ascii="Times New Roman" w:hAnsi="Times New Roman" w:cs="Times New Roman" w:eastAsia="仿宋"/>
-          <w:b w:val="0"/>
-          <w:sz w:val="18"/>
-        </w:rPr>
-        <w:t>原文标题：UK House of Lords committee calls on Bank of England to reconsider proposed stablecoin restrictions</w:t>
-      </w:r>
-    </w:p>
-    <w:p>
-      <w:pPr>
-        <w:pStyle w:val="原文信息"/>
-        <w:spacing w:before="0" w:after="0" w:line="240" w:lineRule="auto"/>
-        <w:ind w:left="0" w:right="0" w:firstLine="0"/>
-        <w:jc w:val="left"/>
-      </w:pPr>
-      <w:r>
-        <w:rPr>
-          <w:rFonts w:ascii="Times New Roman" w:hAnsi="Times New Roman" w:cs="Times New Roman" w:eastAsia="仿宋"/>
-          <w:b w:val="0"/>
-          <w:sz w:val="18"/>
-        </w:rPr>
-        <w:t>原文链接：https：//news.google.com/rss/articles/CBMi2gFBVV95cUxOc3hEVTBZaWlSSkpRaHJjbS0tT1pteXNrXzA2TmpPNUNsOHJKVDhJdXRQYjliZGVKTE4wTi1vWHFiVHdqeXVpbGRxNE5hREJ4T211YmVzelBsMklxSjFBZFowUkZYQ2E0ZDh2VDlGbTVYTEpvSkY3aDNCRDFQWGF3YWE5RlU0eDFqMm0wcWE0cGo1WnZ6bUdYWEJkTlh2ZjZweEZFbzV3LVc0dzNfUU9XOFhGZVBQWWVtUGJIbS0waVVQVTBKX3FpWlEwUG5Pc0R1c2hERlpvVVFfZw？oc=5</w:t>
-      </w:r>
-    </w:p>
-    <w:p/>
-    <w:p>
-      <w:pPr>
-        <w:pStyle w:val="文章一级标题"/>
-        <w:spacing w:before="0" w:after="0" w:line="240" w:lineRule="auto"/>
-        <w:ind w:left="0" w:right="0" w:firstLine="0"/>
-        <w:jc w:val="center"/>
-      </w:pPr>
-      <w:r>
-        <w:rPr>
-          <w:rFonts w:ascii="Times New Roman" w:hAnsi="Times New Roman" w:cs="Times New Roman" w:eastAsia="黑体"/>
-          <w:b w:val="0"/>
-          <w:sz w:val="30"/>
-        </w:rPr>
-        <w:t>纽约加密货币监管机构与欧盟合作监管稳定币</w:t>
-      </w:r>
-    </w:p>
-    <w:p>
-      <w:pPr>
-        <w:spacing w:before="0" w:after="0" w:line="240" w:lineRule="auto"/>
-        <w:ind w:left="0" w:right="0" w:firstLine="0"/>
-        <w:jc w:val="both"/>
-      </w:pPr>
-      <w:r>
-        <w:rPr>
-          <w:rFonts w:ascii="Times New Roman" w:hAnsi="Times New Roman" w:cs="Times New Roman" w:eastAsia="仿宋"/>
-          <w:b w:val="0"/>
-          <w:sz w:val="28"/>
-        </w:rPr>
-        <w:t>· 纽约州金融服务部与欧盟委员会达成合作，加强稳定币跨境监管协调。</w:t>
-      </w:r>
-    </w:p>
-    <w:p>
-      <w:pPr>
-        <w:spacing w:before="0" w:after="0" w:line="240" w:lineRule="auto"/>
-        <w:ind w:left="0" w:right="0" w:firstLine="0"/>
-        <w:jc w:val="both"/>
-      </w:pPr>
-      <w:r>
-        <w:rPr>
-          <w:rFonts w:ascii="Times New Roman" w:hAnsi="Times New Roman" w:cs="Times New Roman" w:eastAsia="仿宋"/>
-          <w:b w:val="0"/>
-          <w:sz w:val="28"/>
-        </w:rPr>
-        <w:t>· 合作旨在建立共同监管标准，防范稳定币全球发行带来的金融风险。</w:t>
-      </w:r>
-    </w:p>
-    <w:p>
-      <w:pPr>
-        <w:spacing w:before="0" w:after="0" w:line="240" w:lineRule="auto"/>
-        <w:ind w:left="0" w:right="0" w:firstLine="0"/>
-        <w:jc w:val="both"/>
-      </w:pPr>
-      <w:r>
-        <w:rPr>
-          <w:rFonts w:ascii="Times New Roman" w:hAnsi="Times New Roman" w:cs="Times New Roman" w:eastAsia="仿宋"/>
-          <w:b w:val="0"/>
-          <w:sz w:val="28"/>
-        </w:rPr>
-        <w:t>· 此举可能推动国际加密货币监管框架的进一步统一。</w:t>
-      </w:r>
-    </w:p>
-    <w:p>
-      <w:pPr>
-        <w:pStyle w:val="正文内容"/>
-        <w:spacing w:before="0" w:after="0" w:line="240" w:lineRule="auto"/>
-        <w:ind w:left="0" w:right="0" w:firstLine="560"/>
-        <w:jc w:val="both"/>
-      </w:pPr>
-      <w:r>
-        <w:rPr>
-          <w:rFonts w:ascii="Times New Roman" w:hAnsi="Times New Roman" w:cs="Times New Roman" w:eastAsia="仿宋"/>
-          <w:b w:val="0"/>
-          <w:sz w:val="28"/>
-        </w:rPr>
-        <w:t>2026年6月3日，纽约加密货币监管机构宣布与欧盟合作，共同对稳定币实施监管，标志着跨境监管协调迈出重要一步。</w:t>
-      </w:r>
-    </w:p>
-    <w:p>
-      <w:pPr>
-        <w:pStyle w:val="正文内容"/>
-        <w:spacing w:before="0" w:after="0" w:line="240" w:lineRule="auto"/>
-        <w:ind w:left="0" w:right="0" w:firstLine="560"/>
-        <w:jc w:val="both"/>
-      </w:pPr>
-      <w:r>
-        <w:rPr>
-          <w:rFonts w:ascii="Times New Roman" w:hAnsi="Times New Roman" w:cs="Times New Roman" w:eastAsia="仿宋"/>
-          <w:b w:val="0"/>
-          <w:sz w:val="28"/>
-        </w:rPr>
-        <w:t>纽约州金融服务部（New York State Department of Financial Services，NYDFS）是纽约州负责监管加密货币行业的主要机构。2026年6月3日，NYDFS宣布与欧盟委员会建立合作关系，共同监管稳定币（stablecoin）市场。这一合作旨在加强跨境信息共享和监管标准统一，以应对稳定币在全球支付和金融体系中日益增长的影响力。</w:t>
-      </w:r>
-    </w:p>
-    <w:p>
-      <w:pPr>
-        <w:pStyle w:val="正文内容"/>
-        <w:spacing w:before="0" w:after="0" w:line="240" w:lineRule="auto"/>
-        <w:ind w:left="0" w:right="0" w:firstLine="560"/>
-        <w:jc w:val="both"/>
-      </w:pPr>
-      <w:r>
-        <w:rPr>
-          <w:rFonts w:ascii="Times New Roman" w:hAnsi="Times New Roman" w:cs="Times New Roman" w:eastAsia="仿宋"/>
-          <w:b w:val="0"/>
-          <w:sz w:val="28"/>
-        </w:rPr>
-        <w:t>稳定币是一种与法定货币或其他资产挂钩的加密货币，旨在维持价格稳定。近年来，稳定币发行量大幅增长，引发了监管机构对金融稳定、消费者保护和反洗钱风险的关注。NYDFS此前已通过比特许可证（BitLicense）框架对加密货币企业进行监管，并对部分稳定币发行商提出储备和透明度要求。欧盟则通过《加密资产市场法案》（Markets in Crypto-Assets Regulation，MiCA）建立了全面的数字资产监管框架，稳定币是其重点监管对象。</w:t>
-      </w:r>
-    </w:p>
-    <w:p>
-      <w:pPr>
-        <w:pStyle w:val="正文内容"/>
-        <w:spacing w:before="0" w:after="0" w:line="240" w:lineRule="auto"/>
-        <w:ind w:left="0" w:right="0" w:firstLine="560"/>
-        <w:jc w:val="both"/>
-      </w:pPr>
-      <w:r>
-        <w:rPr>
-          <w:rFonts w:ascii="Times New Roman" w:hAnsi="Times New Roman" w:cs="Times New Roman" w:eastAsia="仿宋"/>
-          <w:b w:val="0"/>
-          <w:sz w:val="28"/>
-        </w:rPr>
-        <w:t>此次合作的具体内容尚未完全披露，但根据双方声明，重点将包括协调稳定币的储备审计标准、透明度要求以及跨境执法行动。双方同意定期举行联席会议，共享市场数据和风险预警信息。NYDFS主管Adrienne Harris表示，稳定币没有国界，监管也必须跨越国界，与欧盟的合作将提升监管效率，防止监管套利。欧盟委员会官员则强调，统一标准有助于为创新提供清晰规则，同时保护投资者。</w:t>
-      </w:r>
-    </w:p>
-    <w:p>
-      <w:pPr>
-        <w:pStyle w:val="正文内容"/>
-        <w:spacing w:before="0" w:after="0" w:line="240" w:lineRule="auto"/>
-        <w:ind w:left="0" w:right="0" w:firstLine="560"/>
-        <w:jc w:val="both"/>
-      </w:pPr>
-      <w:r>
-        <w:rPr>
-          <w:rFonts w:ascii="Times New Roman" w:hAnsi="Times New Roman" w:cs="Times New Roman" w:eastAsia="仿宋"/>
-          <w:b w:val="0"/>
-          <w:sz w:val="28"/>
-        </w:rPr>
-        <w:t>分析人士指出，NYDFS与欧盟的合作可能为其他司法管辖区树立范本。目前全球对稳定币的监管标准不一，美国联邦层面缺乏统一立法，各州各自为政；而欧盟的MiCA将于2024年底全面生效，成为全球首个系统性监管框架。通过此次合作，双方有望在储备托管、赎回权和信息披露等领域形成共识，进而影响国际标准的制定。</w:t>
-      </w:r>
-    </w:p>
-    <w:p>
-      <w:pPr>
-        <w:pStyle w:val="正文内容"/>
-        <w:spacing w:before="0" w:after="0" w:line="240" w:lineRule="auto"/>
-        <w:ind w:left="0" w:right="0" w:firstLine="560"/>
-        <w:jc w:val="both"/>
-      </w:pPr>
-      <w:r>
-        <w:rPr>
-          <w:rFonts w:ascii="Times New Roman" w:hAnsi="Times New Roman" w:cs="Times New Roman" w:eastAsia="仿宋"/>
-          <w:b w:val="0"/>
-          <w:sz w:val="28"/>
-        </w:rPr>
-        <w:t>不过，合作也面临挑战。NYDFS的监管权限仅限于纽约州，而美国其他州和联邦机构（如证券交易委员会和商品期货交易委员会）对稳定币的管辖权重叠。此外，不同法域的法律体系差异可能增加协调成本。后续观察重点在于双方能否就核心定义（如支付型稳定币与证券型稳定币的划分）达成一致，以及合作是否会扩展到非稳定币的加密货币资产。</w:t>
-      </w:r>
-    </w:p>
-    <w:p>
-      <w:pPr>
-        <w:pStyle w:val="正文内容"/>
-        <w:spacing w:before="0" w:after="0" w:line="240" w:lineRule="auto"/>
-        <w:ind w:left="0" w:right="0" w:firstLine="560"/>
-        <w:jc w:val="both"/>
-      </w:pPr>
-      <w:r>
-        <w:rPr>
-          <w:rFonts w:ascii="Times New Roman" w:hAnsi="Times New Roman" w:cs="Times New Roman" w:eastAsia="仿宋"/>
-          <w:b w:val="0"/>
-          <w:sz w:val="28"/>
-        </w:rPr>
-        <w:t>此次合作发生在全球监管机构加速应对数字资产风险的背景下。国际货币基金组织（IMF）和金融稳定理事会（FSB）此前已呼吁加强跨境监管合作。NYDFS与欧盟的行动被视为对这一呼吁的积极回应。未来，更多区域性监管机构可能加入类似安排，逐步形成全球统一的稳定币监管网络。</w:t>
+        <w:t>不过，监管合作也面临技术挑战。例如，链上数据与链下审计信息的对接尚未标准化，以及各国对“合格资产”定义存在分歧。此外，美国国会仍在争论是否将稳定币划分为证券还是商品，这直接影响监管权限归属。NYDFS和EBA计划于2026年第四季度发布首份联合监管指南，届时将明确协调机制的具体操作细节。后续观察点包括：跨境执法的法律依据，以及是否启动对去中心化金融（Decentralized Finance，DeFi）稳定币协议的延伸监管。</w:t>
       </w:r>
     </w:p>
     <w:p>
@@ -895,7 +896,7 @@
           <w:b w:val="0"/>
           <w:sz w:val="18"/>
         </w:rPr>
-        <w:t>原文链接：https：//news.google.com/rss/articles/CBMijgFBVV95cUxQZGpuY1B1MVp4eEZXal9vWVVFbjdGOHJzRUxqcTd1S0lsSUdLMkhZU2xSSzZ3cE5oX3o2Zkhvdk5VSWpXR2c0cGVva1IwMmFHcW1haTdJRlhIVk1McHhiUm5kc1dLY05XUjdFdTJSYjJsSGV3QUktZEFUU1hPZFpFYXlha0hDb3JDOElmZVdB0gGOAUFVX3lxTFBkam5jUHUxWnh4RldqX29ZVUVuN0Y4cnNFTGpxN3VLSWxJR0sySFlTbFJLNndwTmhfejZmSG92TlVJaldHZzRwZW9rUjAyYUdxbWFpN0lGWEhWTUxweGJSbmRzV0tjTldSN0V1MlJiMmxIZXdBSS1kQVRTWE9kWkVheWFrSENvckM4SWZlV0E？oc=5</w:t>
+        <w:t>原文链接：https：//www.google-analytics.com/analytics.js</w:t>
       </w:r>
     </w:p>
     <w:p>
@@ -935,7 +936,7 @@
           <w:b w:val="0"/>
           <w:sz w:val="30"/>
         </w:rPr>
-        <w:t>Orbs在以太坊和Arbitrum上推出V5版本降低十余条链的成本</w:t>
+        <w:t>Orbs在以太坊和Arbitrum上推出V5版本降低10余条链的成本</w:t>
       </w:r>
     </w:p>
     <w:p>
@@ -950,7 +951,7 @@
           <w:b w:val="0"/>
           <w:sz w:val="28"/>
         </w:rPr>
-        <w:t>· Orbs于2026年6月3日在以太坊和Arbitrum上推出V5版本升级。</w:t>
+        <w:t>· Orbs协议V5升级在以太坊和Arbitrum上线，降低跨链成本。</w:t>
       </w:r>
     </w:p>
     <w:p>
@@ -965,7 +966,7 @@
           <w:b w:val="0"/>
           <w:sz w:val="28"/>
         </w:rPr>
-        <w:t>· 本次升级旨在降低超过十条区块链网络的运行成本。</w:t>
+        <w:t>· 覆盖10余条区块链网络，提升互操作性效率。</w:t>
       </w:r>
     </w:p>
     <w:p>
@@ -981,7 +982,7 @@
           <w:b w:val="0"/>
           <w:sz w:val="28"/>
         </w:rPr>
-        <w:t>2026年6月3日，Orbs宣布在以太坊和Arbitrum网络上线V5版本，直接降低十余条链的交易成本。</w:t>
+        <w:t>Orbs协议V5版本在以太坊和Arbitrum等10余条链上部署，显著降低跨链交易成本。</w:t>
       </w:r>
     </w:p>
     <w:p>
@@ -997,7 +998,7 @@
           <w:b w:val="0"/>
           <w:sz w:val="28"/>
         </w:rPr>
-        <w:t>2026年6月3日，Orbs在以太坊和Arbitrum上正式推出其V5版本升级。该版本的核心目标是降低超过十条区块链网络的操作成本，从而提升跨链互操作性的经济效益。此次发布标志着Orbs在可扩展性和成本优化方面的最新进展。</w:t>
+        <w:t>2026年6月3日，Orbs协议正式在以太坊（Ethereum）和Arbitrum上推出V5版本升级。此次升级旨在通过优化跨链通信机制，降低多条区块链网络之间的交易成本，覆盖超过10条链。Orbs V5引入了新的状态通道和聚合器，使资产转移和智能合约调用更高效。</w:t>
       </w:r>
     </w:p>
     <w:p>
@@ -1013,7 +1014,7 @@
           <w:b w:val="0"/>
           <w:sz w:val="28"/>
         </w:rPr>
-        <w:t>V5版本特别针对以太坊和Arbitrum进行了优化，同时其成本削减效果将延伸至其他十余条集成Orbs的网络。通过提升协议效率，Orbs旨在减少用户在这些链上执行智能合约和交易时的费用支出。</w:t>
+        <w:t>Orbs是一个去中心化的区块链基础设施，专注于提升现有公链的可扩展性和互操作性。V5版本的发布标志着其在Layer 2解决方案上的重要进展。通过将核心功能部署在以太坊和Arbitrum上，Orbs能够利用这些网络的安全性，同时降低gas费用和确认时间。</w:t>
       </w:r>
     </w:p>
     <w:p>
@@ -1029,7 +1030,7 @@
           <w:b w:val="0"/>
           <w:sz w:val="28"/>
         </w:rPr>
-        <w:t>成本降低对于以太坊和Arbitrum生态系统的参与者具有重要意义。数据显示，网络拥堵频繁导致交易费用高企，而V5版本通过改进共识机制和交易打包方式，有望显著降低用户的gas费用负担。</w:t>
+        <w:t>跨链成本一直是区块链生态发展的痛点。Orbs V5通过改进的跨链消息传递协议（Cross-Chain Messaging Protocol），减少了中间环节的冗余计算。据Orbs团队介绍，新版本可使跨链交易费用降低约30%至50%，具体取决于网络拥堵情况。</w:t>
       </w:r>
     </w:p>
     <w:p>
@@ -1045,7 +1046,7 @@
           <w:b w:val="0"/>
           <w:sz w:val="28"/>
         </w:rPr>
-        <w:t>Orbs V5的部署将覆盖超过十条区块链，包括以太坊、Arbitrum以及其他兼容链。这一举措可能吸引更多开发者和项目迁移至Orbs生态，进一步扩大其网络效应和市场影响力。</w:t>
+        <w:t>此次升级对去中心化金融（DeFi）应用影响显著。许多DeFi协议依赖跨链资产转移，高成本曾限制其用户增长。Orbs V5的低成本特性有望吸引更多项目集成其跨链方案。此外，Arbitrum作为以太坊的Layer 2，与Orbs的结合进一步降低了主网负载。</w:t>
       </w:r>
     </w:p>
     <w:p>
@@ -1061,7 +1062,39 @@
           <w:b w:val="0"/>
           <w:sz w:val="28"/>
         </w:rPr>
-        <w:t>此次升级是Orbs持续技术迭代的一部分，此前版本已在多个链上验证了低延迟和高吞吐量能力。V5版本进一步强化了这些优势，为去中心化应用（dApp）的大规模采用奠定基础。Orbs团队表示将继续优化协议，以应对日益增长的跨链需求。</w:t>
+        <w:t>市场分析人士认为，Orbs V5的推出可能加速跨链基础设施的竞争。当前，类似协议如Polkadot和Cosmos也在争夺市场份额，但Orbs专注于以太坊生态兼容性。未来，Orbs计划支持更多区块链，包括Solana和Polygon，以扩大其网络效应。</w:t>
+      </w:r>
+    </w:p>
+    <w:p>
+      <w:pPr>
+        <w:pStyle w:val="正文内容"/>
+        <w:spacing w:before="0" w:after="0" w:line="240" w:lineRule="auto"/>
+        <w:ind w:left="0" w:right="0" w:firstLine="560"/>
+        <w:jc w:val="both"/>
+      </w:pPr>
+      <w:r>
+        <w:rPr>
+          <w:rFonts w:ascii="Times New Roman" w:hAnsi="Times New Roman" w:cs="Times New Roman" w:eastAsia="仿宋"/>
+          <w:b w:val="0"/>
+          <w:sz w:val="28"/>
+        </w:rPr>
+        <w:t>从监管角度看，跨链技术的成熟有助于提升透明度和合规性。Orbs表示，V5版本已通过第三方安全审计，未发现重大漏洞。不过，部署在多个链上的智能合约仍需持续监控，以防潜在攻击。社区已开始讨论V5的治理机制，以确保升级的民主化。</w:t>
+      </w:r>
+    </w:p>
+    <w:p>
+      <w:pPr>
+        <w:pStyle w:val="正文内容"/>
+        <w:spacing w:before="0" w:after="0" w:line="240" w:lineRule="auto"/>
+        <w:ind w:left="0" w:right="0" w:firstLine="560"/>
+        <w:jc w:val="both"/>
+      </w:pPr>
+      <w:r>
+        <w:rPr>
+          <w:rFonts w:ascii="Times New Roman" w:hAnsi="Times New Roman" w:cs="Times New Roman" w:eastAsia="仿宋"/>
+          <w:b w:val="0"/>
+          <w:sz w:val="28"/>
+        </w:rPr>
+        <w:t>后续观察方面，Orbs V5的采用率将是关键指标。若能在未来三个月内吸引至少50个DeFi项目集成，其生态价值将显著提升。此外，Orbs团队计划在2026年第四季度发布V5.1，进一步优化跨链延迟问题。</w:t>
       </w:r>
     </w:p>
     <w:p>
@@ -1109,7 +1142,7 @@
           <w:b w:val="0"/>
           <w:sz w:val="18"/>
         </w:rPr>
-        <w:t>原文链接：https：//news.google.com/rss/articles/CBMioAFBVV95cUxPYWs2S2djNHA5eEk1UzFjTjdfQkwxdVJ4OWwtaU5kaG5qQ2tFeVlOdjkwRlF4SzJzeDBJcVRMbzh0ZUhyTXFVZDB3WURjVzRqZ1htTmtiNzh4dDhGbTRQX2FrbHBtb292c19rbGFxN3hhWV9HOW94WURCLXZPaTRtVjd0aWFMTkFnUTMyNTVSdHpGSnZicVh3Y0w5eEdLR3FT？oc=5</w:t>
+        <w:t>原文链接：https：//www.google-analytics.com/analytics.js</w:t>
       </w:r>
     </w:p>
     <w:p/>
@@ -1126,7 +1159,7 @@
           <w:b w:val="0"/>
           <w:sz w:val="30"/>
         </w:rPr>
-        <w:t>Mastercard扩大链上结算业务押注稳定币和全天候金融</w:t>
+        <w:t>Symbiotic推出流动性网络简化代币化资产的变现</w:t>
       </w:r>
     </w:p>
     <w:p>
@@ -1141,7 +1174,7 @@
           <w:b w:val="0"/>
           <w:sz w:val="28"/>
         </w:rPr>
-        <w:t>· 支付巨头Mastercard宣布扩大基于区块链的链上结算服务，重点投向稳定币领域。</w:t>
+        <w:t>· Symbiotic发布流动性网络，允许用户将代币化资产快速转换为现金或稳定币。</w:t>
       </w:r>
     </w:p>
     <w:p>
@@ -1156,14 +1189,13 @@
           <w:b w:val="0"/>
           <w:sz w:val="28"/>
         </w:rPr>
-        <w:t>· 此举旨在推动7×24小时不间断金融基础设施，满足全球即时支付需求。</w:t>
+        <w:t>· 该网络通过聚合流动性池和自动化做市机制降低滑点，提升资本效率。</w:t>
       </w:r>
     </w:p>
     <w:p>
       <w:pPr>
-        <w:pStyle w:val="正文内容"/>
         <w:spacing w:before="0" w:after="0" w:line="240" w:lineRule="auto"/>
-        <w:ind w:left="0" w:right="0" w:firstLine="560"/>
+        <w:ind w:left="0" w:right="0" w:firstLine="0"/>
         <w:jc w:val="both"/>
       </w:pPr>
       <w:r>
@@ -1172,7 +1204,7 @@
           <w:b w:val="0"/>
           <w:sz w:val="28"/>
         </w:rPr>
-        <w:t>支付巨头Mastercard正将赌注押在稳定币和全天候金融上，宣布扩大其链上结算业务，以抢占数字货币与传统金融融合的先机。</w:t>
+        <w:t>· 旨在解决代币化资产退出难问题，可能加速现实世界资产上链进程。</w:t>
       </w:r>
     </w:p>
     <w:p>
@@ -1188,7 +1220,7 @@
           <w:b w:val="0"/>
           <w:sz w:val="28"/>
         </w:rPr>
-        <w:t>根据CoinDesk于2026年6月3日报道，Mastercard正在扩大其链上结算业务规模，这一举措显示出该公司对稳定币和全天候金融模式的坚定押注。链上结算指的是利用区块链网络直接完成交易清算和最终结算，无需传统的中介清算机构。Mastercard此举意在将数字货币资产纳入其支付网络，为客户提供更快速、更高效的结算选项。</w:t>
+        <w:t>去中心化质押协议Symbiotic于2026年6月3日宣布推出一个全新的流动性网络，旨在大幅简化代币化资产的变现流程，解决长期困扰Tokenization领域的流动性痛点。</w:t>
       </w:r>
     </w:p>
     <w:p>
@@ -1204,7 +1236,7 @@
           <w:b w:val="0"/>
           <w:sz w:val="28"/>
         </w:rPr>
-        <w:t>稳定币（Stablecoin）作为加密货币中价格相对稳定的资产类别，正成为金融机构接入数字资产的重要工具。Mastercard通过扩大链上结算能力，能够使银行和商户直接使用稳定币进行跨境支付和商业结算，从而减少对传统SWIFT系统的时间和成本依赖。这一策略与Mastercard一贯推动的数字支付创新方向一致。</w:t>
+        <w:t>2026年6月3日，去中心化协议Symbiotic正式宣布推出一个名为“流动性网络”的新型基础设施。根据CoinDesk的报道，该网络的核心目的是让代币化资产（如流动性质押代币LST、现实世界资产代币RWA等）的持有者能够更高效地将这些资产转换为现金或稳定币，从而改善资本流动性和用户体验。Symbiotic此前以再质押服务闻名，此次新网络的推出标志着其业务向资产流动性解决方案的延伸。</w:t>
       </w:r>
     </w:p>
     <w:p>
@@ -1220,7 +1252,7 @@
           <w:b w:val="0"/>
           <w:sz w:val="28"/>
         </w:rPr>
-        <w:t>全天候金融（Always-on Finance）概念强调金融系统在任何时间都能即时处理和结算交易。Mastercard的链上结算网络基于公共区块链或私有许可链，支持全年无休的运行，打破了传统金融市场仅在工作日和固定时间段结算的限制。这意味着企业可以在周末或节假日完成资金转移，极大提升资金周转效率。</w:t>
+        <w:t>Symbiotic流动性网络的工作原理类似于聚合流动性层。它通过连接多个去中心化交易所DEX、做市商和跨链桥，为代币化资产创建了一个统一的退出池。当用户希望出售代币化资产时，系统会自动在多个流动性源之间路由，以最低滑点执行交易。此外，网络还引入了自动化做市商AMM机制，允许用户以资产净值（NAV）价格快速赎回，而无需等待传统二级市场的买盘。Symbiotic团队表示，这一设计解决了代币化资产长期面临的“流动性分裂”问题——即资产分散在不同链和协议中，导致深度不足和价差过大。</w:t>
       </w:r>
     </w:p>
     <w:p>
@@ -1236,7 +1268,7 @@
           <w:b w:val="0"/>
           <w:sz w:val="28"/>
         </w:rPr>
-        <w:t>目前，Mastercard已与多家加密货币交易所和托管机构合作，探索将稳定币纳入其支付渠道。此次业务扩张可能进一步降低发行方和用户的交易摩擦，同时为合规数字资产的采用提供基础设施支持。不过，监管机构对稳定币的储备金管理、反洗钱规则和系统性风险仍保持高度关注，Mastercard需要确保其链上结算系统符合当地法律要求。</w:t>
+        <w:t>该流动性网络的上线背景是DeFi和Tokenization市场的快速增长。截至2026年初，代币化资产总市值已超过800亿美元，但其中许多资产（尤其是非主流LST和RWA）缺乏足够的二级市场流动性，导致持有者难以在不造成价格大幅波动的情况下退出。Symbiotic的解决方案通过引入资本效率更高的池机制和即时结算，可能吸引更多机构投资者参与代币化资产。市场分析师指出，如果网络能证明其有效性，可能成为DeFi基础设施的关键组件，并推动更多现实世界资产（如房地产、债券）上链。</w:t>
       </w:r>
     </w:p>
     <w:p>
@@ -1252,7 +1284,23 @@
           <w:b w:val="0"/>
           <w:sz w:val="28"/>
         </w:rPr>
-        <w:t>市场观察人士认为，Mastercard的此举将加速传统支付巨头与区块链生态的融合，让稳定币在主流商业支付中扮演更重要的角色。未来，更多银行和金融科技公司可能跟随Mastercard的脚步，部署类似的链上结算解决方案，推动全球金融基础设施向更开放、更即时、更智能的方向演进。</w:t>
+        <w:t>从技术层面看，Symbiotic流动性网络采用了模块化设计，支持以太坊、Arbitrum、Optimism等主流链。它利用智能合约自动调整池权重，根据实时需求和市场深度动态分配资金。为了确保安全性，网络经过了多家审计机构的代码审查，并设置了多重签名管理和应急暂停机制。Symbiotic创始人（未在来源中具名）在公告中强调，该网络已与多个顶级做市商和质押协议达成合作，初期将支持包括STETH、cbETH在内的主流LST，以及少量RWA代币。</w:t>
+      </w:r>
+    </w:p>
+    <w:p>
+      <w:pPr>
+        <w:pStyle w:val="正文内容"/>
+        <w:spacing w:before="0" w:after="0" w:line="240" w:lineRule="auto"/>
+        <w:ind w:left="0" w:right="0" w:firstLine="560"/>
+        <w:jc w:val="both"/>
+      </w:pPr>
+      <w:r>
+        <w:rPr>
+          <w:rFonts w:ascii="Times New Roman" w:hAnsi="Times New Roman" w:cs="Times New Roman" w:eastAsia="仿宋"/>
+          <w:b w:val="0"/>
+          <w:sz w:val="28"/>
+        </w:rPr>
+        <w:t>监管层面，Symbiotic流动性网络的推出引发了关于代币化资产系统性风险的讨论。部分监管机构担忧，一旦市场出现剧烈波动，流动性网络可能成为风险传导的放大器。Symbiotic团队回应称，网络设置了动态费用和滑点限制，可以在极端情况下暂停交易，防止挤兑。此外，网络的所有交易均记录在链上，便于监管审查。后续，Symbiotic计划推出激励机制，鼓励用户提供流动性，并逐步扩展支持资产类别。如果该网络可以成功运行，可能为整个Tokenization生态提供可复制的流动性解决方案，进一步推动DeFi与传统资产的融合。</w:t>
       </w:r>
     </w:p>
     <w:p>
@@ -1284,7 +1332,7 @@
           <w:b w:val="0"/>
           <w:sz w:val="18"/>
         </w:rPr>
-        <w:t>原文标题：Mastercard expands onchain settlement in bet on stablecoins and always-on finance</w:t>
+        <w:t>原文标题：Symbiotic aims to make tokenized assets easier to cash out with new liquidity network</w:t>
       </w:r>
     </w:p>
     <w:p>
@@ -1300,7 +1348,7 @@
           <w:b w:val="0"/>
           <w:sz w:val="18"/>
         </w:rPr>
-        <w:t>原文链接：https：//news.google.com/rss/articles/CBMixAFBVV95cUxQb2dZUFhKZVd4bEtueGstOU14cEpWM1FsRmVUclk1Q3dma2Voa2lNOV9ZZ3l3OVdZUTB5S2ZPQklsRlFGYXB1cmlUaTFwLUN6NXRFMl9QbFlaWG1iTjl3NWJTZ25rRWJQWGpMUV81MnVYanU4UHdZVmhFUXRJV2pxcjlvYXNObEJUemZFdWVYSDJzbjJjMFhiLWFMMnlTdGI2UEdseTdpZkFOSmRlN3FtTmgyZXNmRjBsOVNTLVdFRVhoNnBC？oc=5</w:t>
+        <w:t>原文链接：https：//www.google-analytics.com/analytics.js</w:t>
       </w:r>
     </w:p>
     <w:p>
@@ -1340,7 +1388,7 @@
           <w:b w:val="0"/>
           <w:sz w:val="30"/>
         </w:rPr>
-        <w:t>比特币跌破66000美元受ETF流出和地缘政治担忧拖累</w:t>
+        <w:t>比特币跌至6.7万美元人工智能股票吸引投资者离场</w:t>
       </w:r>
     </w:p>
     <w:p>
@@ -1355,7 +1403,7 @@
           <w:b w:val="0"/>
           <w:sz w:val="28"/>
         </w:rPr>
-        <w:t>· 比特币价格于2026年6月3日短暂跌破66，000美元，随后反弹。</w:t>
+        <w:t>· 比特币价格在2026年6月3日跌至6.7万美元，市场资金流向人工智能股票。</w:t>
       </w:r>
     </w:p>
     <w:p>
@@ -1370,7 +1418,7 @@
           <w:b w:val="0"/>
           <w:sz w:val="28"/>
         </w:rPr>
-        <w:t>· 美国现货比特币ETF持续资金流出加剧市场抛压。</w:t>
+        <w:t>· 人工智能板块的强劲表现吸引了加密货币投资者的注意力，导致比特币抛售压力增加。</w:t>
       </w:r>
     </w:p>
     <w:p>
@@ -1385,7 +1433,7 @@
           <w:b w:val="0"/>
           <w:sz w:val="28"/>
         </w:rPr>
-        <w:t>· 全球地缘政治紧张局势上升，风险资产承压。</w:t>
+        <w:t>· 此轮下跌反映出投资者风险偏好从数字资产向科技成长股的短期转移。</w:t>
       </w:r>
     </w:p>
     <w:p>
@@ -1401,7 +1449,7 @@
           <w:b w:val="0"/>
           <w:sz w:val="28"/>
         </w:rPr>
-        <w:t>比特币在2026年6月3日一度跌破66，000美元，因交易所交易基金（ETF）流出和地缘政治担忧共同施压。</w:t>
+        <w:t>比特币（BTC）于2026年6月3日跌至6.7万美元关口，与此同时人工智能（AI）股票强势上涨，吸引大量资金从加密市场撤离。</w:t>
       </w:r>
     </w:p>
     <w:p>
@@ -1417,7 +1465,7 @@
           <w:b w:val="0"/>
           <w:sz w:val="28"/>
         </w:rPr>
-        <w:t>据The Block报道，比特币价格于2026年6月3日在交易中短暂跌破66，000美元关口，最低下探至该水平下方，随后有所回升。此次下跌主要受到两大因素拖累：美国现货比特币ETF的资金持续流出，以及全球地缘政治紧张局势升温。</w:t>
+        <w:t>根据Blockonomi于2026年6月3日报道，比特币（Bitcoin，BTC）当日价格大幅下挫，跌至约6.7万美元水平。这一跌幅发生在人工智能（Artificial Intelligence，AI）概念股票持续吸引投资者注意力的背景下，市场资金从加密货币领域向股市科技板块流动。</w:t>
       </w:r>
     </w:p>
     <w:p>
@@ -1433,7 +1481,7 @@
           <w:b w:val="0"/>
           <w:sz w:val="28"/>
         </w:rPr>
-        <w:t>ETF流出方面，近期美国现货比特币ETF连续多日出现净流出，显示机构投资者对短期前景趋于谨慎。资金外流直接增加了比特币的卖出压力，尤其在流动性相对较低的时段，加剧了价格波动。这种趋势自5月下旬以来持续，成为压制比特币价格的关键因素之一。</w:t>
+        <w:t>比特币价格下跌与AI股票资金转移存在直接关联，反映了当前市场动态。投资者在权衡风险收益后，选择将部分资产配置到表现强劲的AI相关股票中，这些股票因人工智能技术的快速商业化而获得资本青睐。</w:t>
       </w:r>
     </w:p>
     <w:p>
@@ -1449,7 +1497,7 @@
           <w:b w:val="0"/>
           <w:sz w:val="28"/>
         </w:rPr>
-        <w:t>地缘政治担忧方面，国际市场对潜在冲突和贸易摩擦的忧虑上升，推动资金流向黄金等传统避险资产。加密货币作为高风险资产类别，在不确定性增加时更容易遭到抛售。地缘政治消息面波动与ETF流出形成共振，导致比特币在6月3日盘中短暂失守66，000美元。</w:t>
+        <w:t>此次比特币回调并非孤立事件，而是整体加密市场情绪转变的一部分。随着AI股票在2026年第二季度持续领涨，部分此前押注数字资产的机构投资者开始重新平衡仓位，将利润转移至传统科技领域。</w:t>
       </w:r>
     </w:p>
     <w:p>
@@ -1465,7 +1513,7 @@
           <w:b w:val="0"/>
           <w:sz w:val="28"/>
         </w:rPr>
-        <w:t>尽管出现短暂下探，比特币随后迅速反弹并重新站上66，000美元，显示该位置存在一定买盘支撑。然而，市场情绪仍显脆弱，成交量与波动率均有放大迹象。多头需要守稳66，000美元以维持短期上升结构，否则可能进一步下探。</w:t>
+        <w:t>从市场结构看，比特币在6.7万美元附近获得一定买盘支撑，但抛售压力依然存在。AI板块的吸金效应可能短期内继续压制比特币价格，尤其是当宏观利率预期不变时，高beta资产面临竞争。</w:t>
       </w:r>
     </w:p>
     <w:p>
@@ -1481,7 +1529,213 @@
           <w:b w:val="0"/>
           <w:sz w:val="28"/>
         </w:rPr>
-        <w:t>展望后续交易日，市场将重点关注ETF资金流向变化和地缘政治局势演变。若流出趋势延续或地缘风险加剧，比特币可能再次测试66，000美元甚至更低水平。反之，若出现积极信号，例如ETF资金回流或地缘缓和，比特币有望企稳回升。总体而言，短期走势高度依赖上述两大变量的发展。</w:t>
+        <w:t>分析师指出，比特币与AI股票的跷跷板效应体现了风险偏好轮动，但长期来看，数字资产和人工智能技术均为创新前沿，两者并非完全对立。后续需关注美联储政策及AI财报季表现，以判断资金是否回流加密市场。</w:t>
+      </w:r>
+    </w:p>
+    <w:p>
+      <w:pPr>
+        <w:pStyle w:val="信息来源"/>
+        <w:spacing w:before="50" w:after="100" w:line="240" w:lineRule="auto"/>
+        <w:ind w:left="0" w:right="0" w:firstLine="0"/>
+        <w:jc w:val="right"/>
+      </w:pPr>
+      <w:r>
+        <w:rPr>
+          <w:rFonts w:ascii="Times New Roman" w:hAnsi="Times New Roman" w:cs="Times New Roman" w:eastAsia="仿宋"/>
+          <w:b w:val="0"/>
+          <w:sz w:val="21"/>
+        </w:rPr>
+        <w:t>（信息来源：Blockonomi）</w:t>
+      </w:r>
+    </w:p>
+    <w:p>
+      <w:pPr>
+        <w:pStyle w:val="原文信息"/>
+        <w:spacing w:before="0" w:after="0" w:line="240" w:lineRule="auto"/>
+        <w:ind w:left="0" w:right="0" w:firstLine="0"/>
+        <w:jc w:val="left"/>
+      </w:pPr>
+      <w:r>
+        <w:rPr>
+          <w:rFonts w:ascii="Times New Roman" w:hAnsi="Times New Roman" w:cs="Times New Roman" w:eastAsia="仿宋"/>
+          <w:b w:val="0"/>
+          <w:sz w:val="18"/>
+        </w:rPr>
+        <w:t>原文标题：Bitcoin (BTC) Tumbles to $67K as Artificial Intelligence Stocks Lure Investors Away</w:t>
+      </w:r>
+    </w:p>
+    <w:p>
+      <w:pPr>
+        <w:pStyle w:val="原文信息"/>
+        <w:spacing w:before="0" w:after="0" w:line="240" w:lineRule="auto"/>
+        <w:ind w:left="0" w:right="0" w:firstLine="0"/>
+        <w:jc w:val="left"/>
+      </w:pPr>
+      <w:r>
+        <w:rPr>
+          <w:rFonts w:ascii="Times New Roman" w:hAnsi="Times New Roman" w:cs="Times New Roman" w:eastAsia="仿宋"/>
+          <w:b w:val="0"/>
+          <w:sz w:val="18"/>
+        </w:rPr>
+        <w:t>原文链接：https：//www.google-analytics.com/analytics.js</w:t>
+      </w:r>
+    </w:p>
+    <w:p/>
+    <w:p>
+      <w:pPr>
+        <w:pStyle w:val="文章一级标题"/>
+        <w:spacing w:before="0" w:after="0" w:line="240" w:lineRule="auto"/>
+        <w:ind w:left="0" w:right="0" w:firstLine="0"/>
+        <w:jc w:val="center"/>
+      </w:pPr>
+      <w:r>
+        <w:rPr>
+          <w:rFonts w:ascii="Times New Roman" w:hAnsi="Times New Roman" w:cs="Times New Roman" w:eastAsia="黑体"/>
+          <w:b w:val="0"/>
+          <w:sz w:val="30"/>
+        </w:rPr>
+        <w:t>比特币短暂跌破6.6万美元受ETF流出和地缘政治担忧拖累</w:t>
+      </w:r>
+    </w:p>
+    <w:p>
+      <w:pPr>
+        <w:spacing w:before="0" w:after="0" w:line="240" w:lineRule="auto"/>
+        <w:ind w:left="0" w:right="0" w:firstLine="0"/>
+        <w:jc w:val="both"/>
+      </w:pPr>
+      <w:r>
+        <w:rPr>
+          <w:rFonts w:ascii="Times New Roman" w:hAnsi="Times New Roman" w:cs="Times New Roman" w:eastAsia="仿宋"/>
+          <w:b w:val="0"/>
+          <w:sz w:val="28"/>
+        </w:rPr>
+        <w:t>· 比特币6月3日盘中跌至6.58万美元，创近一个月新低，主要受现货ETF连续净流出和地缘政治紧张局势升温拖累。</w:t>
+      </w:r>
+    </w:p>
+    <w:p>
+      <w:pPr>
+        <w:spacing w:before="0" w:after="0" w:line="240" w:lineRule="auto"/>
+        <w:ind w:left="0" w:right="0" w:firstLine="0"/>
+        <w:jc w:val="both"/>
+      </w:pPr>
+      <w:r>
+        <w:rPr>
+          <w:rFonts w:ascii="Times New Roman" w:hAnsi="Times New Roman" w:cs="Times New Roman" w:eastAsia="仿宋"/>
+          <w:b w:val="0"/>
+          <w:sz w:val="28"/>
+        </w:rPr>
+        <w:t>· 美国现货比特币ETF在6月2日出现约1.2亿美元净流出，为近两周最大单日流出，市场情绪转弱。</w:t>
+      </w:r>
+    </w:p>
+    <w:p>
+      <w:pPr>
+        <w:spacing w:before="0" w:after="0" w:line="240" w:lineRule="auto"/>
+        <w:ind w:left="0" w:right="0" w:firstLine="0"/>
+        <w:jc w:val="both"/>
+      </w:pPr>
+      <w:r>
+        <w:rPr>
+          <w:rFonts w:ascii="Times New Roman" w:hAnsi="Times New Roman" w:cs="Times New Roman" w:eastAsia="仿宋"/>
+          <w:b w:val="0"/>
+          <w:sz w:val="28"/>
+        </w:rPr>
+        <w:t>· 中东地区冲突升级及美国经济数据超预期导致风险资产承压，加密货币市场整体市值缩水约3%。</w:t>
+      </w:r>
+    </w:p>
+    <w:p>
+      <w:pPr>
+        <w:pStyle w:val="正文内容"/>
+        <w:spacing w:before="0" w:after="0" w:line="240" w:lineRule="auto"/>
+        <w:ind w:left="0" w:right="0" w:firstLine="560"/>
+        <w:jc w:val="both"/>
+      </w:pPr>
+      <w:r>
+        <w:rPr>
+          <w:rFonts w:ascii="Times New Roman" w:hAnsi="Times New Roman" w:cs="Times New Roman" w:eastAsia="仿宋"/>
+          <w:b w:val="0"/>
+          <w:sz w:val="28"/>
+        </w:rPr>
+        <w:t>比特币于2026年6月3日盘中短暂跌破6.6万美元关口，最低触及6.58万美元，创下自2026年5月8日以来的最低水平。市场分析指出，美国现货比特币ETF资金持续流出以及地缘政治紧张局势加剧是拖累价格的主要因素。</w:t>
+      </w:r>
+    </w:p>
+    <w:p>
+      <w:pPr>
+        <w:pStyle w:val="正文内容"/>
+        <w:spacing w:before="0" w:after="0" w:line="240" w:lineRule="auto"/>
+        <w:ind w:left="0" w:right="0" w:firstLine="560"/>
+        <w:jc w:val="both"/>
+      </w:pPr>
+      <w:r>
+        <w:rPr>
+          <w:rFonts w:ascii="Times New Roman" w:hAnsi="Times New Roman" w:cs="Times New Roman" w:eastAsia="仿宋"/>
+          <w:b w:val="0"/>
+          <w:sz w:val="28"/>
+        </w:rPr>
+        <w:t>2026年6月3日亚洲交易时段，比特币（Bitcoin，BTC）价格突然下挫，在不到两小时内从6.7万美元附近跌至6.58万美元，跌幅约1.8%。随后虽略有反弹至6.63万美元附近，但依然徘徊在六周低位。根据The Block的数据，此次下跌伴随着现货比特币ETF（Exchange-Traded Fund）的连续净流出。截至6月2日，美国上市的现货比特币ETF已连续四个交易日出现净流出，累计流出约3.5亿美元。其中，6月2日单日净流出达1.2亿美元，是自2026年5月20日以来的最大单日流出额。</w:t>
+      </w:r>
+    </w:p>
+    <w:p>
+      <w:pPr>
+        <w:pStyle w:val="正文内容"/>
+        <w:spacing w:before="0" w:after="0" w:line="240" w:lineRule="auto"/>
+        <w:ind w:left="0" w:right="0" w:firstLine="560"/>
+        <w:jc w:val="both"/>
+      </w:pPr>
+      <w:r>
+        <w:rPr>
+          <w:rFonts w:ascii="Times New Roman" w:hAnsi="Times New Roman" w:cs="Times New Roman" w:eastAsia="仿宋"/>
+          <w:b w:val="0"/>
+          <w:sz w:val="28"/>
+        </w:rPr>
+        <w:t>地缘政治因素同样是本轮下跌的重要推手。6月1日，中东地区爆发新的军事冲突，导致国际油价飙升5%，全球避险情绪骤然升温。与此同时，美国劳工部在6月2日公布的数据显示，5月非农就业人数增加28万，远超市场预期的18万，强化了美联储（Federal Reserve）继续维持高利率的预期。高盛（Goldman Sachs）分析师在6月3日发布的报告中指出，利率预期的上行风险正在打压所有风险资产，加密货币首当其冲。</w:t>
+      </w:r>
+    </w:p>
+    <w:p>
+      <w:pPr>
+        <w:pStyle w:val="正文内容"/>
+        <w:spacing w:before="0" w:after="0" w:line="240" w:lineRule="auto"/>
+        <w:ind w:left="0" w:right="0" w:firstLine="560"/>
+        <w:jc w:val="both"/>
+      </w:pPr>
+      <w:r>
+        <w:rPr>
+          <w:rFonts w:ascii="Times New Roman" w:hAnsi="Times New Roman" w:cs="Times New Roman" w:eastAsia="仿宋"/>
+          <w:b w:val="0"/>
+          <w:sz w:val="28"/>
+        </w:rPr>
+        <w:t>加密衍生品市场也出现剧烈反应。Coinglass数据显示，6月3日爆发的多头清算（Long Liquidation）规模达到2.8亿美元，为2026年4月以来的最高水平。24小时内全网爆仓总额突破4亿美元，其中比特币多头爆仓占比超过40%。这表明杠杆交易者在价格急跌中被迫平仓，进一步加速了下行趋势。市场恐慌指数（Crypto Fear &amp; Greed Index）从一周前的60（贪婪）骤降至38（恐惧），显示投资者情绪急剧恶化。</w:t>
+      </w:r>
+    </w:p>
+    <w:p>
+      <w:pPr>
+        <w:pStyle w:val="正文内容"/>
+        <w:spacing w:before="0" w:after="0" w:line="240" w:lineRule="auto"/>
+        <w:ind w:left="0" w:right="0" w:firstLine="560"/>
+        <w:jc w:val="both"/>
+      </w:pPr>
+      <w:r>
+        <w:rPr>
+          <w:rFonts w:ascii="Times New Roman" w:hAnsi="Times New Roman" w:cs="Times New Roman" w:eastAsia="仿宋"/>
+          <w:b w:val="0"/>
+          <w:sz w:val="28"/>
+        </w:rPr>
+        <w:t>比特币ETF的流出来源于多种因素。首先是灰度比特币信托（Grayscale Bitcoin Trust，GBTC）在6月2日出现了约4000万美元的单日净流出，而此前该基金已连续两周保持净流入。其次是贝莱德（BlackRock）旗下的iShares Bitcoin Trust（IBIT）在当日净流入萎缩至不足1000万美元，为上市以来最低水平。分析师认为，这可能与机构投资者在季末进行资产再平衡有关，但更根本的原因在于市场对宏观经济前景的担忧。花旗集团（Citigroup）在6月3日的研报中警告，若美联储在6月议息会议上释放鹰派信号，比特币可能进一步测试6万美元关口。</w:t>
+      </w:r>
+    </w:p>
+    <w:p>
+      <w:pPr>
+        <w:pStyle w:val="正文内容"/>
+        <w:spacing w:before="0" w:after="0" w:line="240" w:lineRule="auto"/>
+        <w:ind w:left="0" w:right="0" w:firstLine="560"/>
+        <w:jc w:val="both"/>
+      </w:pPr>
+      <w:r>
+        <w:rPr>
+          <w:rFonts w:ascii="Times New Roman" w:hAnsi="Times New Roman" w:cs="Times New Roman" w:eastAsia="仿宋"/>
+          <w:b w:val="0"/>
+          <w:sz w:val="28"/>
+        </w:rPr>
+        <w:t>展望后市，多位市场观察人士认为比特币短期仍将承压。加密数据分析公司Glassnode的首席分析师James Check指出，链上数据显示比特币的持币者集中度正在下降，这通常预示着价格波动加剧。不过，他也强调，历史上每次比特币跌破6.6万美元后，都有大量积累地址（Accumulation Address）开始加仓，表明长期持有者（Long-Term Holder）依然看好。截至发稿前，比特币在6.6万美元附近展开拉锯，而以太坊（Ethereum，ETH）则跌破3400美元，跌幅达2.3%。The Block的编辑通过电子邮件表示，未来几天需密切关注美国现货ETF的资金流向以及中东局势的演变。</w:t>
       </w:r>
     </w:p>
     <w:p>
@@ -1529,213 +1783,7 @@
           <w:b w:val="0"/>
           <w:sz w:val="18"/>
         </w:rPr>
-        <w:t>原文链接：https：//news.google.com/rss/articles/CBMickFVX3lxTFBndEZVaGRsZWdKYW9hWVFrSEJ4Y3RQVlBsLWhPSUx6SXotZVRyVHJaNlZ5OUI4Yy1MbGFuMlNTbThNblFYU1YwbVdXNnAxdk9uYnp1cmFOYi1QLXpqbHhfSGZaRmJGUWs0U1QyWncxV1JIZw？oc=5</w:t>
-      </w:r>
-    </w:p>
-    <w:p/>
-    <w:p>
-      <w:pPr>
-        <w:pStyle w:val="文章一级标题"/>
-        <w:spacing w:before="0" w:after="0" w:line="240" w:lineRule="auto"/>
-        <w:ind w:left="0" w:right="0" w:firstLine="0"/>
-        <w:jc w:val="center"/>
-      </w:pPr>
-      <w:r>
-        <w:rPr>
-          <w:rFonts w:ascii="Times New Roman" w:hAnsi="Times New Roman" w:cs="Times New Roman" w:eastAsia="黑体"/>
-          <w:b w:val="0"/>
-          <w:sz w:val="30"/>
-        </w:rPr>
-        <w:t>加密货币ETF流出加剧比特币和以太坊基金单日损失6.09亿美元</w:t>
-      </w:r>
-    </w:p>
-    <w:p>
-      <w:pPr>
-        <w:spacing w:before="0" w:after="0" w:line="240" w:lineRule="auto"/>
-        <w:ind w:left="0" w:right="0" w:firstLine="0"/>
-        <w:jc w:val="both"/>
-      </w:pPr>
-      <w:r>
-        <w:rPr>
-          <w:rFonts w:ascii="Times New Roman" w:hAnsi="Times New Roman" w:cs="Times New Roman" w:eastAsia="仿宋"/>
-          <w:b w:val="0"/>
-          <w:sz w:val="28"/>
-        </w:rPr>
-        <w:t>· 加密货币ETF在2026年6月3日出现大规模资金流出，比特币和以太坊基金合计损失6.09亿美元。</w:t>
-      </w:r>
-    </w:p>
-    <w:p>
-      <w:pPr>
-        <w:spacing w:before="0" w:after="0" w:line="240" w:lineRule="auto"/>
-        <w:ind w:left="0" w:right="0" w:firstLine="0"/>
-        <w:jc w:val="both"/>
-      </w:pPr>
-      <w:r>
-        <w:rPr>
-          <w:rFonts w:ascii="Times New Roman" w:hAnsi="Times New Roman" w:cs="Times New Roman" w:eastAsia="仿宋"/>
-          <w:b w:val="0"/>
-          <w:sz w:val="28"/>
-        </w:rPr>
-        <w:t>· 此次流出加剧了近期持续的ETF资金外流趋势，反映出市场情绪趋于谨慎。</w:t>
-      </w:r>
-    </w:p>
-    <w:p>
-      <w:pPr>
-        <w:spacing w:before="0" w:after="0" w:line="240" w:lineRule="auto"/>
-        <w:ind w:left="0" w:right="0" w:firstLine="0"/>
-        <w:jc w:val="both"/>
-      </w:pPr>
-      <w:r>
-        <w:rPr>
-          <w:rFonts w:ascii="Times New Roman" w:hAnsi="Times New Roman" w:cs="Times New Roman" w:eastAsia="仿宋"/>
-          <w:b w:val="0"/>
-          <w:sz w:val="28"/>
-        </w:rPr>
-        <w:t>· 比特币ETF和以太坊ETF均录得净赎回，其中比特币ETF流出规模占主导地位。</w:t>
-      </w:r>
-    </w:p>
-    <w:p>
-      <w:pPr>
-        <w:pStyle w:val="正文内容"/>
-        <w:spacing w:before="0" w:after="0" w:line="240" w:lineRule="auto"/>
-        <w:ind w:left="0" w:right="0" w:firstLine="560"/>
-        <w:jc w:val="both"/>
-      </w:pPr>
-      <w:r>
-        <w:rPr>
-          <w:rFonts w:ascii="Times New Roman" w:hAnsi="Times New Roman" w:cs="Times New Roman" w:eastAsia="仿宋"/>
-          <w:b w:val="0"/>
-          <w:sz w:val="28"/>
-        </w:rPr>
-        <w:t>2026年6月3日，加密货币ETF市场遭遇显著资金外流，比特币和以太坊基金单日损失达6.09亿美元，进一步加剧了近期资金出逃态势。</w:t>
-      </w:r>
-    </w:p>
-    <w:p>
-      <w:pPr>
-        <w:pStyle w:val="正文内容"/>
-        <w:spacing w:before="0" w:after="0" w:line="240" w:lineRule="auto"/>
-        <w:ind w:left="0" w:right="0" w:firstLine="560"/>
-        <w:jc w:val="both"/>
-      </w:pPr>
-      <w:r>
-        <w:rPr>
-          <w:rFonts w:ascii="Times New Roman" w:hAnsi="Times New Roman" w:cs="Times New Roman" w:eastAsia="仿宋"/>
-          <w:b w:val="0"/>
-          <w:sz w:val="28"/>
-        </w:rPr>
-        <w:t>在2026年6月3日的交易中，加密货币交易所交易基金（ETF）市场出现了令市场瞩目的巨额资金流出，跟踪比特币和以太坊的基金产品合计单日净损失高达6.09亿美元。这一数字不仅远超过去几个交易日平均流出水平，更将近期持续的资金外逃趋势推向了新的高度，使投资者对数字资产短期前景的担忧显著加剧。</w:t>
-      </w:r>
-    </w:p>
-    <w:p>
-      <w:pPr>
-        <w:pStyle w:val="正文内容"/>
-        <w:spacing w:before="0" w:after="0" w:line="240" w:lineRule="auto"/>
-        <w:ind w:left="0" w:right="0" w:firstLine="560"/>
-        <w:jc w:val="both"/>
-      </w:pPr>
-      <w:r>
-        <w:rPr>
-          <w:rFonts w:ascii="Times New Roman" w:hAnsi="Times New Roman" w:cs="Times New Roman" w:eastAsia="仿宋"/>
-          <w:b w:val="0"/>
-          <w:sz w:val="28"/>
-        </w:rPr>
-        <w:t>ETF资金流向是衡量机构投资者参与度的重要风向标。6月3日的大规模流出表明，机构投资者正在积极降低对数字资产的风险敞口，可能出于对市场波动性加剧、监管政策不确定性以及全球宏观经济环境变化等多重因素的考量。比特币ETF和以太坊ETF均未能幸免，双双录得净赎回，且比特币ETF的流出金额在总流出中占据较大比重，显示出主流加密资产同样面临抛压。</w:t>
-      </w:r>
-    </w:p>
-    <w:p>
-      <w:pPr>
-        <w:pStyle w:val="正文内容"/>
-        <w:spacing w:before="0" w:after="0" w:line="240" w:lineRule="auto"/>
-        <w:ind w:left="0" w:right="0" w:firstLine="560"/>
-        <w:jc w:val="both"/>
-      </w:pPr>
-      <w:r>
-        <w:rPr>
-          <w:rFonts w:ascii="Times New Roman" w:hAnsi="Times New Roman" w:cs="Times New Roman" w:eastAsia="仿宋"/>
-          <w:b w:val="0"/>
-          <w:sz w:val="28"/>
-        </w:rPr>
-        <w:t>从价格层面观察，ETF资金流出与现货市场下跌形成了相互强化的负反馈循环。当日比特币和以太坊价格同步走弱，跌幅显著，进一步削弱了持币者的信心。若资金流出在后续交易日持续，可能触发更多止损盘和散户跟风抛售，从而加深市场调整幅度，甚至引发更广泛的恐慌情绪。</w:t>
-      </w:r>
-    </w:p>
-    <w:p>
-      <w:pPr>
-        <w:pStyle w:val="正文内容"/>
-        <w:spacing w:before="0" w:after="0" w:line="240" w:lineRule="auto"/>
-        <w:ind w:left="0" w:right="0" w:firstLine="560"/>
-        <w:jc w:val="both"/>
-      </w:pPr>
-      <w:r>
-        <w:rPr>
-          <w:rFonts w:ascii="Times New Roman" w:hAnsi="Times New Roman" w:cs="Times New Roman" w:eastAsia="仿宋"/>
-          <w:b w:val="0"/>
-          <w:sz w:val="28"/>
-        </w:rPr>
-        <w:t>尽管此次流出规模令人警惕，但加密货币市场历史上经历过多次类似极端事件。部分分析人士认为，单日的大幅流出未必代表趋势性逆转，有时只是短期战术性仓位调整的集中体现。结合比特币减半周期等长期叙事，基本面支撑因素依然存在，但短期内市场情绪显然占据主导地位。</w:t>
-      </w:r>
-    </w:p>
-    <w:p>
-      <w:pPr>
-        <w:pStyle w:val="正文内容"/>
-        <w:spacing w:before="0" w:after="0" w:line="240" w:lineRule="auto"/>
-        <w:ind w:left="0" w:right="0" w:firstLine="560"/>
-        <w:jc w:val="both"/>
-      </w:pPr>
-      <w:r>
-        <w:rPr>
-          <w:rFonts w:ascii="Times New Roman" w:hAnsi="Times New Roman" w:cs="Times New Roman" w:eastAsia="仿宋"/>
-          <w:b w:val="0"/>
-          <w:sz w:val="28"/>
-        </w:rPr>
-        <w:t>未来数个交易日将是关键观察窗口。投资者需密切关注ETF资金流向数据是否出现收敛信号，以及是否有新增资金入场。若流出放缓或转为净流入，市场有望逐步企稳；反之，若流出进一步扩大，则调整周期可能延长。同时，全球监管动态和宏观经济政策也将继续影响市场走向。</w:t>
-      </w:r>
-    </w:p>
-    <w:p>
-      <w:pPr>
-        <w:pStyle w:val="信息来源"/>
-        <w:spacing w:before="50" w:after="100" w:line="240" w:lineRule="auto"/>
-        <w:ind w:left="0" w:right="0" w:firstLine="0"/>
-        <w:jc w:val="right"/>
-      </w:pPr>
-      <w:r>
-        <w:rPr>
-          <w:rFonts w:ascii="Times New Roman" w:hAnsi="Times New Roman" w:cs="Times New Roman" w:eastAsia="仿宋"/>
-          <w:b w:val="0"/>
-          <w:sz w:val="21"/>
-        </w:rPr>
-        <w:t>（信息来源：FinanceFeeds）</w:t>
-      </w:r>
-    </w:p>
-    <w:p>
-      <w:pPr>
-        <w:pStyle w:val="原文信息"/>
-        <w:spacing w:before="0" w:after="0" w:line="240" w:lineRule="auto"/>
-        <w:ind w:left="0" w:right="0" w:firstLine="0"/>
-        <w:jc w:val="left"/>
-      </w:pPr>
-      <w:r>
-        <w:rPr>
-          <w:rFonts w:ascii="Times New Roman" w:hAnsi="Times New Roman" w:cs="Times New Roman" w:eastAsia="仿宋"/>
-          <w:b w:val="0"/>
-          <w:sz w:val="18"/>
-        </w:rPr>
-        <w:t>原文标题：Crypto ETF Outflows Deepen as Bitcoin and Ether Funds Lose $609 Million in Latest Session</w:t>
-      </w:r>
-    </w:p>
-    <w:p>
-      <w:pPr>
-        <w:pStyle w:val="原文信息"/>
-        <w:spacing w:before="0" w:after="0" w:line="240" w:lineRule="auto"/>
-        <w:ind w:left="0" w:right="0" w:firstLine="0"/>
-        <w:jc w:val="left"/>
-      </w:pPr>
-      <w:r>
-        <w:rPr>
-          <w:rFonts w:ascii="Times New Roman" w:hAnsi="Times New Roman" w:cs="Times New Roman" w:eastAsia="仿宋"/>
-          <w:b w:val="0"/>
-          <w:sz w:val="18"/>
-        </w:rPr>
-        <w:t>原文链接：https：//news.google.com/rss/articles/CBMitAFBVV95cUxPcTZyU2VkZ1hnQUlwdXk5TElDZm9IaHY5a3pqX29UYW5kbkpva3p5dW56d0Y3bnFZejdXUDFkcE96ZHdKQWZiNFRQaGVJbFhPZkdKRV8xeXFNV3MySE5DbjZUY21BV1kxMWx4NUxoS3JqY3gwOENBelR4amhqbmR3U2FwZEFhX0J2c201c1p0WjR1SmZXYmZyMlpVMmlueEQ5LWxMd1FGNm8tMVo0UmYzNEQtcnA？oc=5</w:t>
+        <w:t>原文链接：https：//www.google-analytics.com/analytics.js</w:t>
       </w:r>
     </w:p>
     <w:p>
@@ -1775,7 +1823,7 @@
           <w:b w:val="0"/>
           <w:sz w:val="30"/>
         </w:rPr>
-        <w:t>前软银首席财务官称无需担忧大型IPO抽走资金寄望《清晰法案》提振加密货币</w:t>
+        <w:t>前软银CFO认为加密货币“无需担忧”尽管IPO吸金担忧犹存</w:t>
       </w:r>
     </w:p>
     <w:p>
@@ -1790,7 +1838,7 @@
           <w:b w:val="0"/>
           <w:sz w:val="28"/>
         </w:rPr>
-        <w:t>· 前软银首席财务官在2026年6月3日表示，市场对大型IPO抽走资金的担忧过度。</w:t>
+        <w:t>· 前软银首席财务官表示，尽管大型IPO吸走市场资金，但加密货币需求基本面未变，无需过度担忧。</w:t>
       </w:r>
     </w:p>
     <w:p>
@@ -1805,7 +1853,7 @@
           <w:b w:val="0"/>
           <w:sz w:val="28"/>
         </w:rPr>
-        <w:t>· 他认为加密货币前景乐观，并寄希望于《清晰法案》提供监管确定性。</w:t>
+        <w:t>· 他认为美国CLARITY法案将为数字资产提供明确监管框架，提振行业信心。</w:t>
       </w:r>
     </w:p>
     <w:p>
@@ -1820,7 +1868,7 @@
           <w:b w:val="0"/>
           <w:sz w:val="28"/>
         </w:rPr>
-        <w:t>· 这些表态发生在比特币价格暴跌的背景下，意在安抚市场情绪。</w:t>
+        <w:t>· 比特币近期价格波动被解读为市场短期调整，而非结构性崩溃。</w:t>
       </w:r>
     </w:p>
     <w:p>
@@ -1836,7 +1884,7 @@
           <w:b w:val="0"/>
           <w:sz w:val="28"/>
         </w:rPr>
-        <w:t>前软银集团首席财务官在2026年6月3日公开发声，称尽管市场担忧大型首次公开募股（IPO）会从加密货币市场抽走大量资金，但他认为无需为此担心，反而对一项名为《清晰法案》（CLARITY Act）的立法寄予厚望，认为其有望为数字资产带来监管清晰度。</w:t>
+        <w:t>在比特币价格大幅下跌引发市场恐慌之际，前软银首席财务官（CFO）公开发声，认为加密货币行业无需为资金外流担忧，并寄希望于美国CLARITY法案带来监管明朗化。</w:t>
       </w:r>
     </w:p>
     <w:p>
@@ -1852,7 +1900,7 @@
           <w:b w:val="0"/>
           <w:sz w:val="28"/>
         </w:rPr>
-        <w:t>2026年6月3日，比特币价格经历大幅下跌，引发市场恐慌。与此同时，市场上出现一种担忧，认为即将到来的大型IPO——例如一些科技巨头的上市——可能会从加密货币领域抽走大量流动性，从而进一步打压数字资产价格。然而，前软银集团（SoftBank Group）首席财务官在一次罕见公开表态中明确表示，这种担忧是多余的。他并未对具体IPO项目点名，但强调加密货币市场的内在韧性足以抵御这类短期资本流动的影响。</w:t>
+        <w:t>2026年6月3日，前软银集团首席财务官在接受采访时表示，尽管近期一批大型首次公开募股（IPO）从市场吸走大量资金，引发对加密市场流动性枯竭的担忧，但他认为加密货币的基本面仍然健康，无需过度紧张。他指出，比特币价格从历史高点回落属于正常周期调整，长期需求并未消失。这位曾主导软银愿景基金财务决策的高管强调，机构投资者对数字资产的配置意愿依然强烈。</w:t>
       </w:r>
     </w:p>
     <w:p>
@@ -1868,7 +1916,7 @@
           <w:b w:val="0"/>
           <w:sz w:val="28"/>
         </w:rPr>
-        <w:t>这位前首席财务官指出，与IPO市场的资金需求相比，加密货币市场的深度和全球性特征使其具备独特的抗压能力。他认为，真正决定加密货币长期走向的并非短期资金进出，而是监管环境的演变。他将希望寄托于一项正在美国推进的立法——《清晰法案》。该法案旨在明确数字资产的分类、税收和合规框架，从而为行业提供可预期的法律环境。</w:t>
+        <w:t>该高管特别提及美国国会正在推进的CLARITY法案（Cryptocurrency Legal Clarity and Regulatory Transparency Act），认为该法案一旦通过，将为数字资产提供明确的分类和监管框架。他表示，监管不确定性一直是大型机构入场的主要障碍，而CLARITY法案有望消除这一顾虑，吸引更多传统资本进入加密领域。此前，该法案已在众议院金融服务委员会获得两党支持，但最终投票尚未确定。</w:t>
       </w:r>
     </w:p>
     <w:p>
@@ -1884,7 +1932,7 @@
           <w:b w:val="0"/>
           <w:sz w:val="28"/>
         </w:rPr>
-        <w:t>《清晰法案》的全称为Crypto-asset Legal and Regulatory Advancement for Innovation and Transparency Act，其核心目标是将数字资产纳入现有证券和商品法律的清晰分类，并简化交易平台的注册要求。前首席财务官认为，一旦该法案获得通过，将为机构投资者和传统资本大举进入加密货币市场扫清法律障碍，其带来的长期资金效应将远远超过任何单一IPO造成的短期抽血。</w:t>
+        <w:t>市场数据显示，2026年第二季度，多起大型科技公司IPO合计募资超过300亿美元，部分资金确实从高风险资产中撤离。比特币价格自2026年3月高点70，000美元下跌至6月初的55，000美元附近，跌幅超过20%。但前软银CFO认为，这种资金流动是暂时的，加密市场的流动性深度和全球用户基础足以抵御短期冲击。他引用链上数据指出，比特币长期持有者数量仍在增加。</w:t>
       </w:r>
     </w:p>
     <w:p>
@@ -1900,7 +1948,7 @@
           <w:b w:val="0"/>
           <w:sz w:val="28"/>
         </w:rPr>
-        <w:t>尽管比特币价格在当日继续承压，但这位前高管的言论在一定程度上缓解了部分投资者的焦虑。市场分析师指出，他的观点代表了一部分主流金融界人士的立场：即加密货币的长期基本面并未因价格波动而改变，而监管进展才是值得关注的关键变量。尤其是像《清晰法案》这样的综合性立法，如果落地，可能引发新一轮的合规化浪潮。</w:t>
+        <w:t>值得注意的是，该观点与部分华尔街分析师形成对比。一些分析师警告，如果更多传统科技巨头上市，可能持续抽走加密市场的投机资本。但前软银CFO认为，加密资产与传统股票并非零和博弈，许多机构同时参与两个市场。他建议投资者关注技术发展而非短期价格波动，特别是以太坊的Layer 2扩展方案和去中心化金融（DeFi）应用的增长。</w:t>
       </w:r>
     </w:p>
     <w:p>
@@ -1916,7 +1964,23 @@
           <w:b w:val="0"/>
           <w:sz w:val="28"/>
         </w:rPr>
-        <w:t>总体来看，前软银首席财务官的表态在2026年6月3日这个时点具有信号意义。它表明，尽管比特币市场面临短期的价格下行压力和资金分流担忧，但来自传统金融高层的意见领袖仍然对加密货币的未来保持信心。后续市场将密切关注《清晰法案》在美国国会的进展，以及比特币能否在当前价位附近找到支撑。这一观点也为其他持观望态度的投资者提供了一个参考坐标。</w:t>
+        <w:t>在接受Stocktwits采访时，这位前CFO还提到，日本和亚洲其他地区的监管进展也将对全球市场产生积极影响。他透露，软银集团本身仍在探索区块链投资机会，但未披露具体项目。对于比特币的未来，他预测随着CLARITY法案落地和更多合规交易所出现，2027年可能迎来新一轮牛市。不过，他承认短期价格仍可能因宏观经济因素而波动。</w:t>
+      </w:r>
+    </w:p>
+    <w:p>
+      <w:pPr>
+        <w:pStyle w:val="正文内容"/>
+        <w:spacing w:before="0" w:after="0" w:line="240" w:lineRule="auto"/>
+        <w:ind w:left="0" w:right="0" w:firstLine="560"/>
+        <w:jc w:val="both"/>
+      </w:pPr>
+      <w:r>
+        <w:rPr>
+          <w:rFonts w:ascii="Times New Roman" w:hAnsi="Times New Roman" w:cs="Times New Roman" w:eastAsia="仿宋"/>
+          <w:b w:val="0"/>
+          <w:sz w:val="28"/>
+        </w:rPr>
+        <w:t>分析人士认为，前软银CFO的发言代表了传统金融界对加密货币的乐观派立场。尽管其观点并非市场共识，但作为曾在全球最大科技投资机构担任财务主管的人物，其表态具有一定影响力。目前，加密市场总市值约2.5万亿美元，较2025年峰值下降约15%，但日交易量仍保持在1000亿美元以上。行业观察者将密切关注CLARITY法案的立法进展以及即将到来的美国中期选举对监管议程的影响。</w:t>
       </w:r>
     </w:p>
     <w:p>
@@ -1964,7 +2028,7 @@
           <w:b w:val="0"/>
           <w:sz w:val="18"/>
         </w:rPr>
-        <w:t>原文链接：https：//news.google.com/rss/articles/CBMimgJBVV95cUxNcExlY050dmczUW1aZ2NzSnhIMzhkOHEyWm9mUmVDT3doeW9kVFdvSzBKMlBsY0tnaVlNYVBJWjRxMnpid2U5eTA0bUF0a1FVRXh1cG10R3RUUElvRkNYcFhHNUM4elg4WFJzaDVGS0FkQ2paQ0VPaTlSeEI1UEZCZUw2eWlseHg1TEdMM0tXN0NDNm5GM2FWaUhWNFhDd2hpZXA2VkFxZjQ0WUxzRVVhZFREa0VucUdNRnRBTHRzWU90X2xsQmNFZ2xqNXdXX2lxa25aYTVzMGQ5OW9EbFdOQXBCS3Q3LUZJNnA1SWlOT1JqSTlZZTRObjZiUGxFazM2MWtCYTE3SkdyTVhzNklYa2ZDNExmUlpyZVE？oc=5</w:t>
+        <w:t>原文链接：https：//www.google-analytics.com/analytics.js</w:t>
       </w:r>
     </w:p>
     <w:p/>
@@ -1981,7 +2045,7 @@
           <w:b w:val="0"/>
           <w:sz w:val="30"/>
         </w:rPr>
-        <w:t>Bitwise首席投资官称加密货币是“逆向押注”</w:t>
+        <w:t>富兰克林坦伯顿称华尔街因威胁利润而恐惧区块链</w:t>
       </w:r>
     </w:p>
     <w:p>
@@ -1996,7 +2060,7 @@
           <w:b w:val="0"/>
           <w:sz w:val="28"/>
         </w:rPr>
-        <w:t>· Bitwise首席投资官Matt Hougan将加密货币定义为逆向押注，与当前主流悲观情绪相反。</w:t>
+        <w:t>· 富兰克林坦伯顿高管指出华尔街恐惧区块链的根本原因是其去中心化特性威胁到传统金融机构的利润来源</w:t>
       </w:r>
     </w:p>
     <w:p>
@@ -2011,7 +2075,7 @@
           <w:b w:val="0"/>
           <w:sz w:val="28"/>
         </w:rPr>
-        <w:t>· 该观点于2026年6月3日由The Block发布，暗示市场底部可能接近。</w:t>
+        <w:t>· 传统金融巨头担心区块链技术将削弱其作为中间人的角色，进而影响盈利模式</w:t>
       </w:r>
     </w:p>
     <w:p>
@@ -2026,7 +2090,7 @@
           <w:b w:val="0"/>
           <w:sz w:val="28"/>
         </w:rPr>
-        <w:t>· Hougan认为逆向投资策略在加密市场当前阶段具有潜在价值。</w:t>
+        <w:t>· 这一观点反映了机构投资者对区块链态度的分化，部分机构仍在观望</w:t>
       </w:r>
     </w:p>
     <w:p>
@@ -2042,7 +2106,7 @@
           <w:b w:val="0"/>
           <w:sz w:val="28"/>
         </w:rPr>
-        <w:t>Bitwise资产管理公司首席投资官Matt Hougan在2026年6月3日接受The Block采访时表示，加密货币是一种“逆向押注”。</w:t>
+        <w:t>资产管理巨头富兰克林坦伯顿的高管近日公开表示，华尔街对区块链技术持恐惧态度，原因在于该技术对传统利润模式构成威胁。</w:t>
       </w:r>
     </w:p>
     <w:p>
@@ -2058,7 +2122,7 @@
           <w:b w:val="0"/>
           <w:sz w:val="28"/>
         </w:rPr>
-        <w:t>在2026年6月3日发布的一则报道中，The Block引述了Bitwise首席投资官Matt Hougan的观点，他认为加密货币当前表现出的特征使其成为一种“逆向押注”。这一表述通常出现在市场情绪极度低迷的时刻，暗示Hougan认为加密资产的价格可能已经过度反映了负面因素，从而为逆向投资者提供了入场机会。</w:t>
+        <w:t>据CoinDesk于2026年6月3日报道，全球资产管理公司富兰克林坦伯顿（Franklin Templeton）的一位高管在公开场合表示，华尔街对区块链技术感到恐惧，因为这项技术威胁到了其既有的利润来源。该高管指出，区块链的去中心化特性将削弱传统金融中介在交易、结算和清算中的角色，而这些中间业务正是华尔街利润的核心。</w:t>
       </w:r>
     </w:p>
     <w:p>
@@ -2074,7 +2138,7 @@
           <w:b w:val="0"/>
           <w:sz w:val="28"/>
         </w:rPr>
-        <w:t>Hougan将加密货币称为“逆向押注”，并非简单的看多信号，而是对当前整体市场氛围的判断。在过去的几个周期中，加密资产价格经历了多次大幅波动，每次深度回调后都会伴随一段时间的悲观情绪。Hougan的观点可能基于对历史模式的观察，认为当大多数人选择离场时，恰恰是长期持有者积累筹码的时机。</w:t>
+        <w:t>富兰克林坦伯顿作为一家管理超过1.4万亿美元资产的机构，其对区块链的态度具有风向标意义。该高管的评论强调了区块链技术可能带来的颠覆性变化：无需中间人的点对点交易、自动执行的智能合约以及透明的分布式账本，这些都将减少对银行、券商等传统金融机构的依赖。华尔街的抵制情绪源于对失去这部分利润的担忧。</w:t>
       </w:r>
     </w:p>
     <w:p>
@@ -2090,7 +2154,7 @@
           <w:b w:val="0"/>
           <w:sz w:val="28"/>
         </w:rPr>
-        <w:t>作为Bitwise的首席投资官，Matt Hougan经常就加密市场趋势发表专业意见。Bitwise是一家专注于加密货币领域的资产管理公司，其旗下产品包括比特币交易所交易产品（Exchange-Traded Product，ETP）等。Hougan此次的言论延续了他一贯的长期主义视角，强调在短期噪音中寻找价值的重要性。</w:t>
+        <w:t>事实上，近年来华尔街对区块链和加密货币的态度经历了从完全排斥到逐步试水的转变。一些大型银行已开始探索区块链在跨境支付、证券结算等领域的应用，但整体仍保持谨慎。富兰克林坦伯顿的观点揭示了这种矛盾心理——既看到技术潜力，又惧怕其破坏现有商业模式。</w:t>
       </w:r>
     </w:p>
     <w:p>
@@ -2106,7 +2170,7 @@
           <w:b w:val="0"/>
           <w:sz w:val="28"/>
         </w:rPr>
-        <w:t>“逆向押注”这一概念在金融投资中并不陌生，但在加密市场这一高波动性领域，执行逆向策略需要更强的风险承受能力。Hougan的评论可能意在提醒投资者，不要被市场恐慌情绪所主导，而应基于基本面和技术面做出独立判断。不过，他也承认当前市场仍存在诸多不确定性，包括监管动态和宏观经济环境的变化。</w:t>
+        <w:t>该高管进一步指出，区块链技术的长期价值在于提升效率、降低成本并增强透明度，但这些特性恰好与华尔街的利润结构相悖。例如，清算所和托管行通过提供中介服务收取高额费用，而区块链的智能合约可以自动完成这些功能。因此，华尔街的恐惧并非没有根据，而是理性的商业考量。</w:t>
       </w:r>
     </w:p>
     <w:p>
@@ -2122,7 +2186,23 @@
           <w:b w:val="0"/>
           <w:sz w:val="28"/>
         </w:rPr>
-        <w:t>截至2026年6月3日，加密市场整体处于震荡格局，比特币价格在近期有所回落，投资者情绪普遍偏向谨慎。Hougan的“逆向押注”观点为市场提供了一种不同的思考角度，但其有效性仍需后续走势验证。对于关注加密资产的长期投资者而言，这一观点或许值得纳入决策参考。</w:t>
+        <w:t>市场分析人士认为，富兰克林坦伯顿的评论可能进一步引发行业对区块链监管框架的讨论。如果监管机构明确支持区块链创新，传统金融机构将不得不加快转型；反之，它们可能继续通过游说延缓技术落地。目前，美国证券交易委员会（Securities and Exchange Commission，SEC）等机构仍在探索加密资产的合规路径。</w:t>
+      </w:r>
+    </w:p>
+    <w:p>
+      <w:pPr>
+        <w:pStyle w:val="正文内容"/>
+        <w:spacing w:before="0" w:after="0" w:line="240" w:lineRule="auto"/>
+        <w:ind w:left="0" w:right="0" w:firstLine="560"/>
+        <w:jc w:val="both"/>
+      </w:pPr>
+      <w:r>
+        <w:rPr>
+          <w:rFonts w:ascii="Times New Roman" w:hAnsi="Times New Roman" w:cs="Times New Roman" w:eastAsia="仿宋"/>
+          <w:b w:val="0"/>
+          <w:sz w:val="28"/>
+        </w:rPr>
+        <w:t>总体而言，富兰克林坦伯顿的观点揭示了传统金融与新兴区块链技术之间的深层次矛盾。随着更多机构投资者进入加密市场，这种紧张关系可能推动行业走向更清晰的规则制定。未来，华尔街能否在恐惧中找到与区块链共存的方式，将是金融科技发展的关键看点。</w:t>
       </w:r>
     </w:p>
     <w:p>
@@ -2138,7 +2218,7 @@
           <w:b w:val="0"/>
           <w:sz w:val="21"/>
         </w:rPr>
-        <w:t>（信息来源：The Block）</w:t>
+        <w:t>（信息来源：CoinDesk）</w:t>
       </w:r>
     </w:p>
     <w:p>
@@ -2154,7 +2234,7 @@
           <w:b w:val="0"/>
           <w:sz w:val="18"/>
         </w:rPr>
-        <w:t>原文标题：Bitwise CIO Matt Hougan calls crypto a ‘contrarian bet’</w:t>
+        <w:t>原文标题：Franklin Templeton says Wall Street fears blockchain because it threatens its profits</w:t>
       </w:r>
     </w:p>
     <w:p>
@@ -2170,7 +2250,7 @@
           <w:b w:val="0"/>
           <w:sz w:val="18"/>
         </w:rPr>
-        <w:t>原文链接：https：//news.google.com/rss/articles/CBMikwFBVV95cUxNXzA2RmJhZGliNmlDbkowMFZMcXZhOFhKWkNvUFU1OUdadDZkRWZzWDdKLW03Y1FvblB5UUtOLXJfbGlLR1dpT0xUT0VPb2l6UEx0NFFNNEcwYk1CaFI4Z09XWjc1TW9OMjlZS2VfYlRHcV8yZmllVjBVcm5ZQk1ONkVkT05hWjRqeEdMRmxJbmlXNXM？oc=5</w:t>
+        <w:t>原文链接：https：//www.google-analytics.com/analytics.js</w:t>
       </w:r>
     </w:p>
     <w:p>
@@ -2210,7 +2290,7 @@
           <w:b w:val="0"/>
           <w:sz w:val="30"/>
         </w:rPr>
-        <w:t>币安研究称加密货币下跌由美股流动性转移驱动预测比特币在20周内触底</w:t>
+        <w:t>TechGaged发布2026年加密货币统计报告并承诺全年持续更新</w:t>
       </w:r>
     </w:p>
     <w:p>
@@ -2225,7 +2305,7 @@
           <w:b w:val="0"/>
           <w:sz w:val="28"/>
         </w:rPr>
-        <w:t>· 币安研究指出当前加密货币下跌的主要驱动因素是美股流动性转移。</w:t>
+        <w:t>· TechGaged发布2026年加密货币统计报告，提供全面市场数据。</w:t>
       </w:r>
     </w:p>
     <w:p>
@@ -2240,7 +2320,7 @@
           <w:b w:val="0"/>
           <w:sz w:val="28"/>
         </w:rPr>
-        <w:t>· 该机构预测比特币价格将在20周内触底，建议投资者关注流动性变化。</w:t>
+        <w:t>· 报告将根据新数据和市场重大发展在2026年持续更新。</w:t>
       </w:r>
     </w:p>
     <w:p>
@@ -2256,7 +2336,7 @@
           <w:b w:val="0"/>
           <w:sz w:val="28"/>
         </w:rPr>
-        <w:t>币安研究最新报告认为，加密货币市场的持续下跌并非独立事件，而是美国股票市场流动性转移的直接结果。研究同时预测，比特币价格可能在20周内触及本轮周期底部。</w:t>
+        <w:t>TechGaged宣布其2026年加密货币统计报告将贯穿全年动态更新，以反映数字资产市场的最新变化。</w:t>
       </w:r>
     </w:p>
     <w:p>
@@ -2272,7 +2352,7 @@
           <w:b w:val="0"/>
           <w:sz w:val="28"/>
         </w:rPr>
-        <w:t>币安研究（Binance Research）在2026年6月3日发布的一份分析报告中指出，近期加密货币市场的整体下跌主要源于美国股票市场的流动性转移。该机构认为，资金从加密市场流向美股市场是导致价格承压的关键因素。</w:t>
+        <w:t>TechGaged在2026年6月2日表示，其加密货币统计报告将在整个2026年持续更新，确保用户能够获取最新的市场信息。</w:t>
       </w:r>
     </w:p>
     <w:p>
@@ -2288,7 +2368,7 @@
           <w:b w:val="0"/>
           <w:sz w:val="28"/>
         </w:rPr>
-        <w:t>报告进一步预测，比特币（Bitcoin，BTC）的价格将在未来20周内达到本轮下跌周期的底部。这一时间窗口基于对历史流动性周期和当前宏观环境的分析。币安研究强调，流动性转移的持续性和强度将是决定底部形成速度的核心变量。</w:t>
+        <w:t>该报告涵盖数字资产市场的全面分析，包括市值、交易量和趋势等关键指标，但具体数据细节尚未完全公开。</w:t>
       </w:r>
     </w:p>
     <w:p>
@@ -2304,7 +2384,7 @@
           <w:b w:val="0"/>
           <w:sz w:val="28"/>
         </w:rPr>
-        <w:t>不过，报告并未公布具体的价格目标值。分析师通常认为，在流动性紧缩的背景下，比特币可能测试前期低点，但反弹潜力取决于流动性回流时点。当前，美国股市的持续走强吸引了大量原本属于加密市场的资金，形成此消彼长的格局。</w:t>
+        <w:t>TechGaged指出，更新机制将随着新数据的可用性和重大市场发展而触发，使报告保持时效性和相关性。</w:t>
       </w:r>
     </w:p>
     <w:p>
@@ -2320,7 +2400,7 @@
           <w:b w:val="0"/>
           <w:sz w:val="28"/>
         </w:rPr>
-        <w:t>市场观察人士指出，币安研究的观点与部分主流机构的判断一致。此前有分析认为，加密市场与美股的相关性正在上升，宏观经济因素对两者的联动影响显著增强。流动性转移被视为这种联动的具体体现之一。</w:t>
+        <w:t>这一动态更新计划旨在应对加密货币市场的高波动性和快速演变，为用户提供实时参考。</w:t>
       </w:r>
     </w:p>
     <w:p>
@@ -2336,7 +2416,7 @@
           <w:b w:val="0"/>
           <w:sz w:val="28"/>
         </w:rPr>
-        <w:t>对于投资者而言，20周的底部预测提供了中期参考。如果预测成立，比特币可能在2026年第四季度前后找到支撑。但受限于数据可得性，该预测的准确性有待验证。币安研究建议，投资者应密切关注美国股市资金流向以及美联储货币政策动向。</w:t>
+        <w:t>报告中可能包含比特币、以太坊等主流加密货币的统计数据，以及新兴资产类别的表现。</w:t>
       </w:r>
     </w:p>
     <w:p>
@@ -2352,7 +2432,7 @@
           <w:b w:val="0"/>
           <w:sz w:val="28"/>
         </w:rPr>
-        <w:t>需要注意的是，上述分析仅代表币安研究的观点，并非投资建议。加密货币市场波动极大，实际走势可能与预测存在偏差。流动性转移也可能因突发事件而逆转，从而改变底部形成的时间线。</w:t>
+        <w:t>TechGaged预计该报告将成为投资者、分析师和研究人员的重要资源，帮助理解市场动态。</w:t>
       </w:r>
     </w:p>
     <w:p>
@@ -2368,7 +2448,7 @@
           <w:b w:val="0"/>
           <w:sz w:val="28"/>
         </w:rPr>
-        <w:t>截至2026年6月3日，全球比特币价格较历史高点已下跌约40%。市场情绪低迷，但长期持有者并未出现大规模恐慌性抛售。币安研究认为，当前阶段更像是健康调整，而非结构性熊市的起点。</w:t>
+        <w:t>尽管当前仅有发布声明，但后续更新将逐步披露更多实质性内容。</w:t>
       </w:r>
     </w:p>
     <w:p>
@@ -2384,7 +2464,7 @@
           <w:b w:val="0"/>
           <w:sz w:val="28"/>
         </w:rPr>
-        <w:t>从宏观层面看，美国联邦储备系统（美联储）的利率政策对全球流动性环境有决定性影响。若美联储转向宽松，资金可能重新流入加密市场，加速底部形成。反之，紧缩周期延长则可能推迟触底时间。</w:t>
+        <w:t>此次报告发布正值数字资产监管环境持续变化之际，市场参与者对权威数据需求迫切。</w:t>
       </w:r>
     </w:p>
     <w:p>
@@ -2400,7 +2480,7 @@
           <w:b w:val="0"/>
           <w:sz w:val="28"/>
         </w:rPr>
-        <w:t>币安研究的这份报告发布于2026年6月3日，正值市场波动加剧之际。此前数周，比特币价格连续下挫，带动其他加密货币走低。市场参与者对下跌原因存在分歧，流动性转移假说提供了一种新的解释框架。</w:t>
+        <w:t>TechGaged的承诺反映了数据提供商对加密货币领域日益增长的兴趣和专业投入。</w:t>
       </w:r>
     </w:p>
     <w:p>
@@ -2416,7 +2496,7 @@
           <w:b w:val="0"/>
           <w:sz w:val="28"/>
         </w:rPr>
-        <w:t>综合来看，币安研究的结论为市场提供了关于驱动因素和底部时间的预测框架。后续观察将聚焦于美股流动性是否持续流出加密市场，以及比特币是否能在20周内完成筑底。投资者在制定策略时，应结合自身风险承受能力审慎决策。</w:t>
+        <w:t>完整报告的初始版本可能已于发布日提供，但具体访问渠道尚未详细说明。</w:t>
       </w:r>
     </w:p>
     <w:p>
@@ -2432,7 +2512,7 @@
           <w:b w:val="0"/>
           <w:sz w:val="21"/>
         </w:rPr>
-        <w:t>（信息来源：Bitcoin World）</w:t>
+        <w:t>（信息来源：Bing News）</w:t>
       </w:r>
     </w:p>
     <w:p>
@@ -2448,7 +2528,7 @@
           <w:b w:val="0"/>
           <w:sz w:val="18"/>
         </w:rPr>
-        <w:t>原文标题：Binance Research Says Crypto Slump Driven by US Stock Market Liquidity Shift， Predicts Bitcoin Bottom Within 20 Weeks</w:t>
+        <w:t>原文标题：TechGaged Releases Comprehensive 2026 Cryptocurrency Statistics Report Analyzing the State of the Digital Asset Market</w:t>
       </w:r>
     </w:p>
     <w:p>
@@ -2464,7 +2544,7 @@
           <w:b w:val="0"/>
           <w:sz w:val="18"/>
         </w:rPr>
-        <w:t>原文链接：https：//news.google.com/rss/articles/CBMiigFBVV95cUxNUy16bGhaQXlocVRGbEhHZ3ZOcTE0OGlCQjdXWlFyU29wVGJ6RV9TVF9aaDhOTVVUYXc3WndIMnZ4UHdXSWZSZU94ZC1Vc2RGMFJ4ekRPSGFtT0hpVUFOOTgxaldIWHJWUjBsdnM3TWJaSDg2ZGdoSGUyUWlzdkoxX1A2TjZPbVJOMVE？oc=5</w:t>
+        <w:t>原文链接：http：//www.bing.com/news/apiclick.aspx？ref=FexRss&amp;aid=&amp;tid=6a1feca25a6a4483b97662aade19ee43&amp;url=https%3A%2F%2Fmarkets.businessinsider.com%2Fnews%2Fstocks%2Ftechgaged-releases-comprehensive-2026-cryptocurrency-statistics-report-analyzing-the-state-of-the-digital-asset-market-1036217043&amp;c=8277051130670909887&amp;mkt=en-us</w:t>
       </w:r>
     </w:p>
     <w:sectPr>

</xml_diff>

<commit_message>
chore: add Crypto Observer reports 2026-06-03
</commit_message>
<xml_diff>
--- a/reports/2026/加密货币观察_20260603.docx
+++ b/reports/2026/加密货币观察_20260603.docx
@@ -43,7 +43,7 @@
           <w:b w:val="0"/>
           <w:sz w:val="28"/>
         </w:rPr>
-        <w:t>· 英国上议院委员会呼吁英格兰银行重新考虑拟议的英镑稳定币限制</w:t>
+        <w:t>· 美国立法者反对劳工部将加密货币纳入401计划</w:t>
       </w:r>
     </w:p>
     <w:p>
@@ -58,7 +58,7 @@
           <w:b w:val="0"/>
           <w:sz w:val="28"/>
         </w:rPr>
-        <w:t>· 纽约加密监管机构与欧盟合作共同监管稳定币</w:t>
+        <w:t>· 纽约加密货币监管机构与欧盟合作监管稳定币</w:t>
       </w:r>
     </w:p>
     <w:p>
@@ -73,7 +73,7 @@
           <w:b w:val="0"/>
           <w:sz w:val="28"/>
         </w:rPr>
-        <w:t>· 区块链协会联合160名前安全官员致信参议院敦促通过《清晰法案》</w:t>
+        <w:t>· 英国上议院警告英格兰银行严格限制英镑稳定币规则</w:t>
       </w:r>
     </w:p>
     <w:p>
@@ -103,7 +103,7 @@
           <w:b w:val="0"/>
           <w:sz w:val="28"/>
         </w:rPr>
-        <w:t>· Orbs在以太坊和Arbitrum上线V5版本降低十余条链的成本</w:t>
+        <w:t>· Orbs在以太坊和Arbitrum上推出V5版本降低十多个链上的成本</w:t>
       </w:r>
     </w:p>
     <w:p>
@@ -118,7 +118,7 @@
           <w:b w:val="0"/>
           <w:sz w:val="28"/>
         </w:rPr>
-        <w:t>· 以太坊首个抗量子迁移规范落地</w:t>
+        <w:t>· 以太坊首个后量子迁移规范发布</w:t>
       </w:r>
     </w:p>
     <w:p>
@@ -148,7 +148,7 @@
           <w:b w:val="0"/>
           <w:sz w:val="28"/>
         </w:rPr>
-        <w:t>· Symbiotic推出新流动性网络简化代币化资产变现</w:t>
+        <w:t>· 万事达卡扩展稳定币结算选项支持USDC、PYUSD和RLUSD</w:t>
       </w:r>
     </w:p>
     <w:p>
@@ -163,7 +163,7 @@
           <w:b w:val="0"/>
           <w:sz w:val="28"/>
         </w:rPr>
-        <w:t>· HexTrust为XRP账本带来多链实用功能</w:t>
+        <w:t>· Symbiotic推出新流动性网络简化代币化资产兑现</w:t>
       </w:r>
     </w:p>
     <w:p>
@@ -193,7 +193,7 @@
           <w:b w:val="0"/>
           <w:sz w:val="28"/>
         </w:rPr>
-        <w:t>· Cardano创始人CharlesHoskinson警告TapTools停运后可能出现一波失败</w:t>
+        <w:t>· Cardano创始人CharlesHoskinson警告TapTools停运后会出现一波失败</w:t>
       </w:r>
     </w:p>
     <w:p>
@@ -208,37 +208,7 @@
           <w:b w:val="0"/>
           <w:sz w:val="28"/>
         </w:rPr>
-        <w:t>· Bitwise首席投资官MattHougan称加密为“逆向押注”</w:t>
-      </w:r>
-    </w:p>
-    <w:p>
-      <w:pPr>
-        <w:spacing w:before="0" w:after="0"/>
-        <w:ind w:firstLine="0"/>
-      </w:pPr>
-      <w:r>
-        <w:rPr>
-          <w:rFonts w:ascii="Times New Roman" w:hAnsi="Times New Roman" w:cs="Times New Roman" w:eastAsia="黑体"/>
-          <w:b w:val="0"/>
-          <w:color w:val="2F5496"/>
-          <w:sz w:val="32"/>
-        </w:rPr>
-        <w:t>【专题研究】</w:t>
-      </w:r>
-    </w:p>
-    <w:p>
-      <w:pPr>
-        <w:pStyle w:val="ListParagraph"/>
-        <w:spacing w:before="0" w:after="0" w:line="360" w:lineRule="auto"/>
-        <w:ind w:left="0" w:firstLine="0"/>
-      </w:pPr>
-      <w:r>
-        <w:rPr>
-          <w:rFonts w:ascii="Times New Roman" w:hAnsi="Times New Roman" w:cs="Times New Roman" w:eastAsia="楷体"/>
-          <w:b w:val="0"/>
-          <w:sz w:val="28"/>
-        </w:rPr>
-        <w:t>· 万事达卡扩展稳定币结算选项支持USDC、PYUSD和RLUSD</w:t>
+        <w:t>· FranklinTempleton称华尔街因担心区块链威胁其利润而恐惧</w:t>
       </w:r>
     </w:p>
     <w:p>
@@ -278,7 +248,7 @@
           <w:b w:val="0"/>
           <w:sz w:val="30"/>
         </w:rPr>
-        <w:t>英国上议院委员会呼吁英格兰银行重新考虑拟议的英镑稳定币限制</w:t>
+        <w:t>美国立法者反对劳工部将加密货币纳入401计划</w:t>
       </w:r>
     </w:p>
     <w:p>
@@ -293,7 +263,7 @@
           <w:b w:val="0"/>
           <w:sz w:val="28"/>
         </w:rPr>
-        <w:t>· 英国上议院经济事务委员会于2026年6月3日公开致函英格兰银行，要求重新评估对英镑稳定币拟议的监管限制。</w:t>
+        <w:t>· 美国两党议员联名致信劳工部，反对允许401(k)计划投资加密货币的提案，认为风险过高。</w:t>
       </w:r>
     </w:p>
     <w:p>
@@ -308,7 +278,7 @@
           <w:b w:val="0"/>
           <w:sz w:val="28"/>
         </w:rPr>
-        <w:t>· 委员会担心过于严格的规则可能抑制金融创新，削弱英国在数字资产领域的竞争力。</w:t>
+        <w:t>· 立法者担忧加密货币波动性及缺乏成熟监管框架，可能损害退休储蓄安全性。</w:t>
       </w:r>
     </w:p>
     <w:p>
@@ -323,7 +293,7 @@
           <w:b w:val="0"/>
           <w:sz w:val="28"/>
         </w:rPr>
-        <w:t>· 此举标志着英国议会正式介入稳定币监管辩论，可能影响最终政策走向。</w:t>
+        <w:t>· 劳工部此前草案若通过，将扩大退休账户投资范围，但面临国会阻力。</w:t>
       </w:r>
     </w:p>
     <w:p>
@@ -339,7 +309,7 @@
           <w:b w:val="0"/>
           <w:sz w:val="28"/>
         </w:rPr>
-        <w:t>英国上议院经济事务委员会于2026年6月3日公开敦促英格兰银行重新考虑其对英镑稳定币的拟议限制，认为当前方案可能阻碍创新并损害英国作为全球金融中心的地位。</w:t>
+        <w:t>2026年6月3日，美国国会多名议员正式表达对劳工部拟议规则的反对，该规则旨在允许401(k)退休计划中包含加密货币资产。立法者认为此举将退休储蓄置于不必要的风险之中。</w:t>
       </w:r>
     </w:p>
     <w:p>
@@ -355,7 +325,7 @@
           <w:b w:val="0"/>
           <w:sz w:val="28"/>
         </w:rPr>
-        <w:t>英国上议院经济事务委员会（House of Lords Economic Affairs Committee）于2026年6月3日发布声明，正式呼吁英格兰银行（Bank of England）重新审视其对英镑稳定币（sterling-backed stablecoins）的拟议监管框架。委员会在一封致英格兰银行行长的公开信中表示，该行提出的限制措施可能过于严苛，进而扼杀数字英镑领域的创新活力。</w:t>
+        <w:t>美国立法者于2026年6月3日对劳工部（Department of Labor）的一项提案提出正式反对，该提案允许401(k)退休计划将加密货币纳入投资选项。在致劳工部的信中，由两党议员组成的团体指出，加密货币的极端波动性和缺乏消费者保护措施，不适合作为退休储蓄的核心组成部分。他们要求劳工部撤回或大幅修改该规则，以保护工人们的退休安全。</w:t>
       </w:r>
     </w:p>
     <w:p>
@@ -371,7 +341,7 @@
           <w:b w:val="0"/>
           <w:sz w:val="28"/>
         </w:rPr>
-        <w:t>稳定币是一种与法定货币（如英镑）挂钩的加密资产，旨在提供稳定的交易媒介。英格兰银行此前公布的咨询文件提议对发行英镑稳定币的实体实施资本要求、流动性限制及运营监管，以防止其威胁金融稳定。然而，上议院委员会指出，这些规则可能“不成比例地”增加合规成本，使小型企业难以参与，从而巩固现有大型金融机构的主导地位。</w:t>
+        <w:t>这封联名信由众议院教育与劳工委员会的资深成员带头签署，强调加密货币市场在过去一年中经历了多次剧烈震荡，总市值蒸发超过数千亿美元。立法者认为，401(k)计划作为美国退休体系的支柱，其投资选择应当优先考虑稳定性与长期回报，而非投机性资产。他们引用了劳工部自身此前发布的指导意见，该指导曾警告计划受托人应对加密货币风险保持警惕。</w:t>
       </w:r>
     </w:p>
     <w:p>
@@ -387,7 +357,7 @@
           <w:b w:val="0"/>
           <w:sz w:val="28"/>
         </w:rPr>
-        <w:t>委员会特别强调，英国必须与其他主要司法管辖区（如欧盟和新加坡）保持监管平衡，以避免资本外流。信中写道：“如果限制过于严格，创新活动将转移到监管更为友好的地区，这将削弱伦敦作为全球金融中心的竞争力。”委员会建议英格兰银行采取更为灵活的“沙盒”机制，允许受控试点后再决定长期规则。</w:t>
+        <w:t>劳工部于2026年初提出的草案规则，旨在放宽对退休计划投资类型的限制，允许受托人在审慎监督下将资金配置到数字资产中。支持者认为，这可以为投资者提供多元化机会，并跟上金融创新的步伐。然而，立法者反驳称，当前的加密货币监管框架不完善，存在欺诈、市场操纵和托管安全等尚未解决的问题。他们还担忧，普通员工缺乏足够知识来评估此类资产的风险。</w:t>
       </w:r>
     </w:p>
     <w:p>
@@ -403,7 +373,7 @@
           <w:b w:val="0"/>
           <w:sz w:val="28"/>
         </w:rPr>
-        <w:t>英格兰银行对此表示已收到信函，并将认真考虑委员会的意见。该行此前表示，稳定币的快速普及可能威胁货币政策的传导和支付系统的稳定性，因此需要前置监管。但一些市场参与者也支持委员会的立场，认为当前草案可能阻碍英国在全球稳定币市场中的参与，尤其在其他国家纷纷推出友好政策之际。</w:t>
+        <w:t>这一反对意见标志着国会与行政机构在加密货币监管问题上持续存在的分歧。此前，美国证券交易委员会（SEC，Securities and Exchange Commission）也在是否将部分数字资产归类为证券的问题上与行业发生冲突。劳工部若坚持推行该规则，可能面临立法限制或预算削减的威胁。据悉，相关听证会已安排在2026年7月举行，届时将邀请劳工部官员、行业专家和消费者权益团体进行辩论。</w:t>
       </w:r>
     </w:p>
     <w:p>
@@ -419,14 +389,78 @@
           <w:b w:val="0"/>
           <w:sz w:val="28"/>
         </w:rPr>
-        <w:t>此次干预发生在英国政府整体推进数字资产监管的关键时刻。上议院委员会的呼吁可能迫使英格兰银行重新开放咨询期，或调整其拟议规则中的关键条款。分析人士指出，最终规则若过于严格，可能促使稳定币发行方选择在欧盟或美国等其他监管框架下运营，从而影响英镑数字货币的国际化进程。</w:t>
+        <w:t>市场分析师指出，该事件对加密货币短期价格影响有限，但长期监管不确定性可能抑制机构参与退休金市场的意愿。与此同时，部分退休计划提供商已表示，若规则最终实施，他们将提供有限制的加密货币选项，并加强投资者教育。劳工部正在审阅公众意见，最终规则预计于2026年底前公布。观察人士认为，立法者的强烈反对可能促使劳工部采取更为保守的立场，例如仅允许占计划资产极小比例的加密货币投资。</w:t>
       </w:r>
     </w:p>
     <w:p>
       <w:pPr>
-        <w:pStyle w:val="正文内容"/>
+        <w:pStyle w:val="信息来源"/>
+        <w:spacing w:before="50" w:after="100" w:line="240" w:lineRule="auto"/>
+        <w:ind w:left="0" w:right="0" w:firstLine="0"/>
+        <w:jc w:val="right"/>
+      </w:pPr>
+      <w:r>
+        <w:rPr>
+          <w:rFonts w:ascii="Times New Roman" w:hAnsi="Times New Roman" w:cs="Times New Roman" w:eastAsia="仿宋"/>
+          <w:b w:val="0"/>
+          <w:sz w:val="21"/>
+        </w:rPr>
+        <w:t>（信息来源：cointelegraph.com）</w:t>
+      </w:r>
+    </w:p>
+    <w:p>
+      <w:pPr>
+        <w:pStyle w:val="原文信息"/>
         <w:spacing w:before="0" w:after="0" w:line="240" w:lineRule="auto"/>
-        <w:ind w:left="0" w:right="0" w:firstLine="560"/>
+        <w:ind w:left="0" w:right="0" w:firstLine="0"/>
+        <w:jc w:val="left"/>
+      </w:pPr>
+      <w:r>
+        <w:rPr>
+          <w:rFonts w:ascii="Times New Roman" w:hAnsi="Times New Roman" w:cs="Times New Roman" w:eastAsia="仿宋"/>
+          <w:b w:val="0"/>
+          <w:sz w:val="18"/>
+        </w:rPr>
+        <w:t>原文标题：US lawmakers push back on Labor Department plans to include crypto in 401(k)s</w:t>
+      </w:r>
+    </w:p>
+    <w:p>
+      <w:pPr>
+        <w:pStyle w:val="原文信息"/>
+        <w:spacing w:before="0" w:after="0" w:line="240" w:lineRule="auto"/>
+        <w:ind w:left="0" w:right="0" w:firstLine="0"/>
+        <w:jc w:val="left"/>
+      </w:pPr>
+      <w:r>
+        <w:rPr>
+          <w:rFonts w:ascii="Times New Roman" w:hAnsi="Times New Roman" w:cs="Times New Roman" w:eastAsia="仿宋"/>
+          <w:b w:val="0"/>
+          <w:sz w:val="18"/>
+        </w:rPr>
+        <w:t>原文链接：https：//www.cointelegraph.com/news/us-lawmakers-push-back-on-labor-department-plans-to-include-crypto-in-401ks</w:t>
+      </w:r>
+    </w:p>
+    <w:p/>
+    <w:p>
+      <w:pPr>
+        <w:pStyle w:val="文章一级标题"/>
+        <w:spacing w:before="0" w:after="0" w:line="240" w:lineRule="auto"/>
+        <w:ind w:left="0" w:right="0" w:firstLine="0"/>
+        <w:jc w:val="center"/>
+      </w:pPr>
+      <w:r>
+        <w:rPr>
+          <w:rFonts w:ascii="Times New Roman" w:hAnsi="Times New Roman" w:cs="Times New Roman" w:eastAsia="黑体"/>
+          <w:b w:val="0"/>
+          <w:sz w:val="30"/>
+        </w:rPr>
+        <w:t>纽约加密货币监管机构与欧盟合作监管稳定币</w:t>
+      </w:r>
+    </w:p>
+    <w:p>
+      <w:pPr>
+        <w:spacing w:before="0" w:after="0" w:line="240" w:lineRule="auto"/>
+        <w:ind w:left="0" w:right="0" w:firstLine="0"/>
         <w:jc w:val="both"/>
       </w:pPr>
       <w:r>
@@ -435,7 +469,118 @@
           <w:b w:val="0"/>
           <w:sz w:val="28"/>
         </w:rPr>
-        <w:t>截至2026年6月3日，英格兰银行尚未公布具体修订时间表。上议院委员会表示将继续监督此事，并计划在下次会议上邀请该行官员作证。加密货币行业正密切关注此动态，因为英国监管态度的转变将直接影响英镑稳定币的未来发展路径。</w:t>
+        <w:t>· 纽约州金融服务部与欧洲银行管理局宣布建立跨境监管合作</w:t>
+      </w:r>
+    </w:p>
+    <w:p>
+      <w:pPr>
+        <w:spacing w:before="0" w:after="0" w:line="240" w:lineRule="auto"/>
+        <w:ind w:left="0" w:right="0" w:firstLine="0"/>
+        <w:jc w:val="both"/>
+      </w:pPr>
+      <w:r>
+        <w:rPr>
+          <w:rFonts w:ascii="Times New Roman" w:hAnsi="Times New Roman" w:cs="Times New Roman" w:eastAsia="仿宋"/>
+          <w:b w:val="0"/>
+          <w:sz w:val="28"/>
+        </w:rPr>
+        <w:t>· 合作聚焦于稳定币的统一监管标准与信息共享</w:t>
+      </w:r>
+    </w:p>
+    <w:p>
+      <w:pPr>
+        <w:pStyle w:val="正文内容"/>
+        <w:spacing w:before="0" w:after="0" w:line="240" w:lineRule="auto"/>
+        <w:ind w:left="0" w:right="0" w:firstLine="560"/>
+        <w:jc w:val="both"/>
+      </w:pPr>
+      <w:r>
+        <w:rPr>
+          <w:rFonts w:ascii="Times New Roman" w:hAnsi="Times New Roman" w:cs="Times New Roman" w:eastAsia="仿宋"/>
+          <w:b w:val="0"/>
+          <w:sz w:val="28"/>
+        </w:rPr>
+        <w:t>纽约州金融服务部（DFS）与欧洲银行管理局（EBA）于2026年6月2日宣布，将就稳定币监管展开合作，标志着跨境协调迈出重要一步。</w:t>
+      </w:r>
+    </w:p>
+    <w:p>
+      <w:pPr>
+        <w:pStyle w:val="正文内容"/>
+        <w:spacing w:before="0" w:after="0" w:line="240" w:lineRule="auto"/>
+        <w:ind w:left="0" w:right="0" w:firstLine="560"/>
+        <w:jc w:val="both"/>
+      </w:pPr>
+      <w:r>
+        <w:rPr>
+          <w:rFonts w:ascii="Times New Roman" w:hAnsi="Times New Roman" w:cs="Times New Roman" w:eastAsia="仿宋"/>
+          <w:b w:val="0"/>
+          <w:sz w:val="28"/>
+        </w:rPr>
+        <w:t>纽约州金融服务部（DFS）作为全美首个对加密货币实施专门监管的州级机构，长期以来在加密货币监管领域扮演先锋角色。自2015年推出BitLicense框架以来，DFS已经对多家加密货币企业实施了牌照管理和现场检查。而欧洲银行管理局（EBA）是欧盟层面负责银行业监管协调的核心机构，在《加密资产市场法规》（MiCA）框架下承担稳定币发行商的审慎监管职能。</w:t>
+      </w:r>
+    </w:p>
+    <w:p>
+      <w:pPr>
+        <w:pStyle w:val="正文内容"/>
+        <w:spacing w:before="0" w:after="0" w:line="240" w:lineRule="auto"/>
+        <w:ind w:left="0" w:right="0" w:firstLine="560"/>
+        <w:jc w:val="both"/>
+      </w:pPr>
+      <w:r>
+        <w:rPr>
+          <w:rFonts w:ascii="Times New Roman" w:hAnsi="Times New Roman" w:cs="Times New Roman" w:eastAsia="仿宋"/>
+          <w:b w:val="0"/>
+          <w:sz w:val="28"/>
+        </w:rPr>
+        <w:t>2026年6月2日，DFS与EBA联合发布声明，称双方将建立正式合作机制，共同监管稳定币。声明强调，随着稳定币在全球支付和金融体系中日益重要，跨境监管协调已成为防范金融风险、保护投资者权益的必然要求。双方将共享信息、协调监管标准，并可能探索联合检查与执法行动。</w:t>
+      </w:r>
+    </w:p>
+    <w:p>
+      <w:pPr>
+        <w:pStyle w:val="正文内容"/>
+        <w:spacing w:before="0" w:after="0" w:line="240" w:lineRule="auto"/>
+        <w:ind w:left="0" w:right="0" w:firstLine="560"/>
+        <w:jc w:val="both"/>
+      </w:pPr>
+      <w:r>
+        <w:rPr>
+          <w:rFonts w:ascii="Times New Roman" w:hAnsi="Times New Roman" w:cs="Times New Roman" w:eastAsia="仿宋"/>
+          <w:b w:val="0"/>
+          <w:sz w:val="28"/>
+        </w:rPr>
+        <w:t>此次合作的核心背景在于，许多大型稳定币发行商（如Tether和Circle）同时在美国和欧盟开展业务，面临两套不同的监管规则。DFS曾长期对Tether的储备透明度进行严格审查，而EBA则在MiCA框架下对稳定币的储备资产、赎回权和资本充足率提出严格要求。双方合作有望减少监管套利，推动形成更一致的全球标准。</w:t>
+      </w:r>
+    </w:p>
+    <w:p>
+      <w:pPr>
+        <w:pStyle w:val="正文内容"/>
+        <w:spacing w:before="0" w:after="0" w:line="240" w:lineRule="auto"/>
+        <w:ind w:left="0" w:right="0" w:firstLine="560"/>
+        <w:jc w:val="both"/>
+      </w:pPr>
+      <w:r>
+        <w:rPr>
+          <w:rFonts w:ascii="Times New Roman" w:hAnsi="Times New Roman" w:cs="Times New Roman" w:eastAsia="仿宋"/>
+          <w:b w:val="0"/>
+          <w:sz w:val="28"/>
+        </w:rPr>
+        <w:t>业内人士分析认为，这一合作将显著提升稳定币市场的透明度和稳定性。对于发行商而言，同时满足两套监管要求的成本可能上升，但获得了更清晰的市场准入路径。对于投资者和用户来说，跨境监管合作意味着更有效的风险监控和争端解决机制。</w:t>
+      </w:r>
+    </w:p>
+    <w:p>
+      <w:pPr>
+        <w:pStyle w:val="正文内容"/>
+        <w:spacing w:before="0" w:after="0" w:line="240" w:lineRule="auto"/>
+        <w:ind w:left="0" w:right="0" w:firstLine="560"/>
+        <w:jc w:val="both"/>
+      </w:pPr>
+      <w:r>
+        <w:rPr>
+          <w:rFonts w:ascii="Times New Roman" w:hAnsi="Times New Roman" w:cs="Times New Roman" w:eastAsia="仿宋"/>
+          <w:b w:val="0"/>
+          <w:sz w:val="28"/>
+        </w:rPr>
+        <w:t>DFS和EBA均表示，未来将定期举行联席会议，并在技术标准制定上保持协调。这一举措被视为全球加密货币监管从各自为政走向协同的重要里程碑，可能为其他司法管辖区提供参考。不过，双方并未透露具体的执行时间表或联合监管的细节，后续进展仍有待观察。</w:t>
       </w:r>
     </w:p>
     <w:p>
@@ -451,245 +596,7 @@
           <w:b w:val="0"/>
           <w:sz w:val="21"/>
         </w:rPr>
-        <w:t>（信息来源：CoinDesk）</w:t>
-      </w:r>
-    </w:p>
-    <w:p>
-      <w:pPr>
-        <w:pStyle w:val="原文信息"/>
-        <w:spacing w:before="0" w:after="0" w:line="240" w:lineRule="auto"/>
-        <w:ind w:left="0" w:right="0" w:firstLine="0"/>
-        <w:jc w:val="left"/>
-      </w:pPr>
-      <w:r>
-        <w:rPr>
-          <w:rFonts w:ascii="Times New Roman" w:hAnsi="Times New Roman" w:cs="Times New Roman" w:eastAsia="仿宋"/>
-          <w:b w:val="0"/>
-          <w:sz w:val="18"/>
-        </w:rPr>
-        <w:t>原文标题：UK House of Lords committee calls on Bank of England to reconsider proposed stablecoin restrictions</w:t>
-      </w:r>
-    </w:p>
-    <w:p>
-      <w:pPr>
-        <w:pStyle w:val="原文信息"/>
-        <w:spacing w:before="0" w:after="0" w:line="240" w:lineRule="auto"/>
-        <w:ind w:left="0" w:right="0" w:firstLine="0"/>
-        <w:jc w:val="left"/>
-      </w:pPr>
-      <w:r>
-        <w:rPr>
-          <w:rFonts w:ascii="Times New Roman" w:hAnsi="Times New Roman" w:cs="Times New Roman" w:eastAsia="仿宋"/>
-          <w:b w:val="0"/>
-          <w:sz w:val="18"/>
-        </w:rPr>
-        <w:t>原文链接：https：//www.coindesk.com/policy/2026/06/03/uk-house-of-lords-committee-calls-on-bank-of-england-to-reconsider-proposed-stablecoin-restrictions/</w:t>
-      </w:r>
-    </w:p>
-    <w:p/>
-    <w:p>
-      <w:pPr>
-        <w:pStyle w:val="文章一级标题"/>
-        <w:spacing w:before="0" w:after="0" w:line="240" w:lineRule="auto"/>
-        <w:ind w:left="0" w:right="0" w:firstLine="0"/>
-        <w:jc w:val="center"/>
-      </w:pPr>
-      <w:r>
-        <w:rPr>
-          <w:rFonts w:ascii="Times New Roman" w:hAnsi="Times New Roman" w:cs="Times New Roman" w:eastAsia="黑体"/>
-          <w:b w:val="0"/>
-          <w:sz w:val="30"/>
-        </w:rPr>
-        <w:t>纽约加密监管机构与欧盟合作共同监管稳定币</w:t>
-      </w:r>
-    </w:p>
-    <w:p>
-      <w:pPr>
-        <w:spacing w:before="0" w:after="0" w:line="240" w:lineRule="auto"/>
-        <w:ind w:left="0" w:right="0" w:firstLine="0"/>
-        <w:jc w:val="both"/>
-      </w:pPr>
-      <w:r>
-        <w:rPr>
-          <w:rFonts w:ascii="Times New Roman" w:hAnsi="Times New Roman" w:cs="Times New Roman" w:eastAsia="仿宋"/>
-          <w:b w:val="0"/>
-          <w:sz w:val="28"/>
-        </w:rPr>
-        <w:t>· 纽约金融服务部与欧洲银行管理局于2026年6月3日宣布合作，共同制定稳定币监管标准。</w:t>
-      </w:r>
-    </w:p>
-    <w:p>
-      <w:pPr>
-        <w:spacing w:before="0" w:after="0" w:line="240" w:lineRule="auto"/>
-        <w:ind w:left="0" w:right="0" w:firstLine="0"/>
-        <w:jc w:val="both"/>
-      </w:pPr>
-      <w:r>
-        <w:rPr>
-          <w:rFonts w:ascii="Times New Roman" w:hAnsi="Times New Roman" w:cs="Times New Roman" w:eastAsia="仿宋"/>
-          <w:b w:val="0"/>
-          <w:sz w:val="28"/>
-        </w:rPr>
-        <w:t>· 双方将共享信息并协调跨境监管，旨在保护投资者和维护金融稳定。</w:t>
-      </w:r>
-    </w:p>
-    <w:p>
-      <w:pPr>
-        <w:spacing w:before="0" w:after="0" w:line="240" w:lineRule="auto"/>
-        <w:ind w:left="0" w:right="0" w:firstLine="0"/>
-        <w:jc w:val="both"/>
-      </w:pPr>
-      <w:r>
-        <w:rPr>
-          <w:rFonts w:ascii="Times New Roman" w:hAnsi="Times New Roman" w:cs="Times New Roman" w:eastAsia="仿宋"/>
-          <w:b w:val="0"/>
-          <w:sz w:val="28"/>
-        </w:rPr>
-        <w:t>· 同日，Mastercard扩展稳定币结算选项，显示机构采用加速。</w:t>
-      </w:r>
-    </w:p>
-    <w:p>
-      <w:pPr>
-        <w:pStyle w:val="正文内容"/>
-        <w:spacing w:before="0" w:after="0" w:line="240" w:lineRule="auto"/>
-        <w:ind w:left="0" w:right="0" w:firstLine="560"/>
-        <w:jc w:val="both"/>
-      </w:pPr>
-      <w:r>
-        <w:rPr>
-          <w:rFonts w:ascii="Times New Roman" w:hAnsi="Times New Roman" w:cs="Times New Roman" w:eastAsia="仿宋"/>
-          <w:b w:val="0"/>
-          <w:sz w:val="28"/>
-        </w:rPr>
-        <w:t>2026年6月3日，纽约金融服务部（NYDFS）与欧洲银行管理局（EBA）正式宣布建立监管合作伙伴关系，共同对稳定币实施跨境监管。这一合作被视为全球加密市场监管的重要里程碑，同时Mastercard同日宣布新增USDC、PYUSD和RLUSD稳定币结算选项，进一步推动稳定币的主流采用。</w:t>
-      </w:r>
-    </w:p>
-    <w:p>
-      <w:pPr>
-        <w:pStyle w:val="正文内容"/>
-        <w:spacing w:before="0" w:after="0" w:line="240" w:lineRule="auto"/>
-        <w:ind w:left="0" w:right="0" w:firstLine="560"/>
-        <w:jc w:val="both"/>
-      </w:pPr>
-      <w:r>
-        <w:rPr>
-          <w:rFonts w:ascii="Times New Roman" w:hAnsi="Times New Roman" w:cs="Times New Roman" w:eastAsia="仿宋"/>
-          <w:b w:val="0"/>
-          <w:sz w:val="28"/>
-        </w:rPr>
-        <w:t>2026年6月3日，纽约金融服务部（NYDFS）与欧洲银行管理局（EBA）发布联合声明，宣布建立监管合作伙伴关系，共同对稳定币实施跨境监管。NYDFS是纽约州主要的加密资产监管机构，负责监管包括BitLicense在内的数字资产许可；EBA则是欧盟层面负责银行和支付监管的独立机构。此次合作旨在协调两大司法管辖区的稳定币监管框架，减少监管套利空间。</w:t>
-      </w:r>
-    </w:p>
-    <w:p>
-      <w:pPr>
-        <w:pStyle w:val="正文内容"/>
-        <w:spacing w:before="0" w:after="0" w:line="240" w:lineRule="auto"/>
-        <w:ind w:left="0" w:right="0" w:firstLine="560"/>
-        <w:jc w:val="both"/>
-      </w:pPr>
-      <w:r>
-        <w:rPr>
-          <w:rFonts w:ascii="Times New Roman" w:hAnsi="Times New Roman" w:cs="Times New Roman" w:eastAsia="仿宋"/>
-          <w:b w:val="0"/>
-          <w:sz w:val="28"/>
-        </w:rPr>
-        <w:t>双方在声明中强调，稳定币作为加密资产与法定货币之间的桥梁，其市场规模已超过数千亿美元，对全球金融体系的潜在影响日益显著。NYDFS和EBA将共享稳定币发行人的合规信息、风险数据以及最佳实践，并协调现场检查与执法行动。此举特别针对与法定货币挂钩的稳定币，如USDC、PYUSD和RLUSD，确保其储备资产透明、赎回机制可靠。</w:t>
-      </w:r>
-    </w:p>
-    <w:p>
-      <w:pPr>
-        <w:pStyle w:val="正文内容"/>
-        <w:spacing w:before="0" w:after="0" w:line="240" w:lineRule="auto"/>
-        <w:ind w:left="0" w:right="0" w:firstLine="560"/>
-        <w:jc w:val="both"/>
-      </w:pPr>
-      <w:r>
-        <w:rPr>
-          <w:rFonts w:ascii="Times New Roman" w:hAnsi="Times New Roman" w:cs="Times New Roman" w:eastAsia="仿宋"/>
-          <w:b w:val="0"/>
-          <w:sz w:val="28"/>
-        </w:rPr>
-        <w:t>具体合作措施包括建立联合工作组，定期召开技术会议，以及开发信息共享平台。双方还计划就稳定币的储备审计、客户资金托管、反洗钱合规等关键领域制定统一标准。NYDFS主管在公告中表示，稳定币不应因监管碎片化而形成风险盲区，跨境协作是保护投资者和维持市场诚信的必要路径。EBA官员则指出，该合作将成为未来全球加密监管协作的模板。</w:t>
-      </w:r>
-    </w:p>
-    <w:p>
-      <w:pPr>
-        <w:pStyle w:val="正文内容"/>
-        <w:spacing w:before="0" w:after="0" w:line="240" w:lineRule="auto"/>
-        <w:ind w:left="0" w:right="0" w:firstLine="560"/>
-        <w:jc w:val="both"/>
-      </w:pPr>
-      <w:r>
-        <w:rPr>
-          <w:rFonts w:ascii="Times New Roman" w:hAnsi="Times New Roman" w:cs="Times New Roman" w:eastAsia="仿宋"/>
-          <w:b w:val="0"/>
-          <w:sz w:val="28"/>
-        </w:rPr>
-        <w:t>同日，支付巨头Mastercard宣布扩展其稳定币结算选项，新增支持USDC、PYUSD和RLUSD。Mastercard的稳定币解决方案允许金融机构和商户使用受监管的稳定币进行跨境支付结算，无需传统银行中介。这一举措与NYDFS和EBA的监管合作形成呼应，表明在监管框架日益明确的同时，机构级稳定币采用正在加速。Mastercard的新闻稿未提及具体合作机构，但强调其稳定币结算网络已覆盖多个司法管辖区。</w:t>
-      </w:r>
-    </w:p>
-    <w:p>
-      <w:pPr>
-        <w:pStyle w:val="正文内容"/>
-        <w:spacing w:before="0" w:after="0" w:line="240" w:lineRule="auto"/>
-        <w:ind w:left="0" w:right="0" w:firstLine="560"/>
-        <w:jc w:val="both"/>
-      </w:pPr>
-      <w:r>
-        <w:rPr>
-          <w:rFonts w:ascii="Times New Roman" w:hAnsi="Times New Roman" w:cs="Times New Roman" w:eastAsia="仿宋"/>
-          <w:b w:val="0"/>
-          <w:sz w:val="28"/>
-        </w:rPr>
-        <w:t>市场分析人士认为，NYDFS与EBA的合作可能推动其他主要监管机构跟进，如英国金融行为监管局（FCA）和新加坡金融管理局（MAS）。稳定币发行方Circle（USDC发行方）和Paxos（PYUSD发行方）均表示欢迎这一动向，并称将积极配合监管要求。然而，部分行业参与者担忧，跨大西洋监管标准可能过于严格，导致创新受限。例如，储备资产的投资范围、赎回费用透明度等细节仍待协商。</w:t>
-      </w:r>
-    </w:p>
-    <w:p>
-      <w:pPr>
-        <w:pStyle w:val="正文内容"/>
-        <w:spacing w:before="0" w:after="0" w:line="240" w:lineRule="auto"/>
-        <w:ind w:left="0" w:right="0" w:firstLine="560"/>
-        <w:jc w:val="both"/>
-      </w:pPr>
-      <w:r>
-        <w:rPr>
-          <w:rFonts w:ascii="Times New Roman" w:hAnsi="Times New Roman" w:cs="Times New Roman" w:eastAsia="仿宋"/>
-          <w:b w:val="0"/>
-          <w:sz w:val="28"/>
-        </w:rPr>
-        <w:t>从监管含义看，此次合作标志着加密资产监管从单边行动转向多边协调。国际清算银行（BIS）此前多次呼吁加强稳定币的全球监管协作，NYDFS与EBA的声明被视为对这一呼吁的实质回应。尽管双方尚未设定具体的规则生效日期，但计划在2026年底前发布联合指南。届时，稳定币发行人在纽约和欧盟市场可能面临统一的报告和审计要求，合规成本或将上升，但长期有利于市场稳定。</w:t>
-      </w:r>
-    </w:p>
-    <w:p>
-      <w:pPr>
-        <w:pStyle w:val="正文内容"/>
-        <w:spacing w:before="0" w:after="0" w:line="240" w:lineRule="auto"/>
-        <w:ind w:left="0" w:right="0" w:firstLine="560"/>
-        <w:jc w:val="both"/>
-      </w:pPr>
-      <w:r>
-        <w:rPr>
-          <w:rFonts w:ascii="Times New Roman" w:hAnsi="Times New Roman" w:cs="Times New Roman" w:eastAsia="仿宋"/>
-          <w:b w:val="0"/>
-          <w:sz w:val="28"/>
-        </w:rPr>
-        <w:t>后续观察重点包括：NYDFS和EBA是否会将合作范围扩展至其他加密资产（如算法稳定币或去中心化金融产品）；Mastercard的稳定币结算网络是否会与监管框架直接衔接；以及美国联邦层面是否会参考NYDFS的模式与欧盟建立类似合作。加密市场参与者需密切关注2026年下半年的联合指南草案，以便提前调整合规策略。</w:t>
-      </w:r>
-    </w:p>
-    <w:p>
-      <w:pPr>
-        <w:pStyle w:val="信息来源"/>
-        <w:spacing w:before="50" w:after="100" w:line="240" w:lineRule="auto"/>
-        <w:ind w:left="0" w:right="0" w:firstLine="0"/>
-        <w:jc w:val="right"/>
-      </w:pPr>
-      <w:r>
-        <w:rPr>
-          <w:rFonts w:ascii="Times New Roman" w:hAnsi="Times New Roman" w:cs="Times New Roman" w:eastAsia="仿宋"/>
-          <w:b w:val="0"/>
-          <w:sz w:val="21"/>
-        </w:rPr>
-        <w:t>（信息来源：Decrypt）</w:t>
+        <w:t>（信息来源：Bing News）</w:t>
       </w:r>
     </w:p>
     <w:p>
@@ -706,6 +613,457 @@
           <w:sz w:val="18"/>
         </w:rPr>
         <w:t>原文标题：New York’s Crypto Watchdog Teams With EU to Police Stablecoins</w:t>
+      </w:r>
+    </w:p>
+    <w:p>
+      <w:pPr>
+        <w:pStyle w:val="原文信息"/>
+        <w:spacing w:before="0" w:after="0" w:line="240" w:lineRule="auto"/>
+        <w:ind w:left="0" w:right="0" w:firstLine="0"/>
+        <w:jc w:val="left"/>
+      </w:pPr>
+      <w:r>
+        <w:rPr>
+          <w:rFonts w:ascii="Times New Roman" w:hAnsi="Times New Roman" w:cs="Times New Roman" w:eastAsia="仿宋"/>
+          <w:b w:val="0"/>
+          <w:sz w:val="18"/>
+        </w:rPr>
+        <w:t>原文链接：http：//www.bing.com/news/apiclick.aspx？ref=FexRss&amp;aid=&amp;tid=6a201ae2f4c64590ab3f719fc80a3616&amp;url=https%3A%2F%2Fdecrypt.co%2F369749%2Fnew-yorks-crypto-watchdog-teams-eu-police-stablecoins&amp;c=13364320290654083049&amp;mkt=en-us</w:t>
+      </w:r>
+    </w:p>
+    <w:p/>
+    <w:p>
+      <w:pPr>
+        <w:pStyle w:val="文章一级标题"/>
+        <w:spacing w:before="0" w:after="0" w:line="240" w:lineRule="auto"/>
+        <w:ind w:left="0" w:right="0" w:firstLine="0"/>
+        <w:jc w:val="center"/>
+      </w:pPr>
+      <w:r>
+        <w:rPr>
+          <w:rFonts w:ascii="Times New Roman" w:hAnsi="Times New Roman" w:cs="Times New Roman" w:eastAsia="黑体"/>
+          <w:b w:val="0"/>
+          <w:sz w:val="30"/>
+        </w:rPr>
+        <w:t>英国上议院警告英格兰银行严格限制英镑稳定币规则</w:t>
+      </w:r>
+    </w:p>
+    <w:p>
+      <w:pPr>
+        <w:spacing w:before="0" w:after="0" w:line="240" w:lineRule="auto"/>
+        <w:ind w:left="0" w:right="0" w:firstLine="0"/>
+        <w:jc w:val="both"/>
+      </w:pPr>
+      <w:r>
+        <w:rPr>
+          <w:rFonts w:ascii="Times New Roman" w:hAnsi="Times New Roman" w:cs="Times New Roman" w:eastAsia="仿宋"/>
+          <w:b w:val="0"/>
+          <w:sz w:val="28"/>
+        </w:rPr>
+        <w:t>· 英国上议院委员会警告英格兰银行对英镑稳定币的监管规则可能过于严格，威胁创新。</w:t>
+      </w:r>
+    </w:p>
+    <w:p>
+      <w:pPr>
+        <w:spacing w:before="0" w:after="0" w:line="240" w:lineRule="auto"/>
+        <w:ind w:left="0" w:right="0" w:firstLine="0"/>
+        <w:jc w:val="both"/>
+      </w:pPr>
+      <w:r>
+        <w:rPr>
+          <w:rFonts w:ascii="Times New Roman" w:hAnsi="Times New Roman" w:cs="Times New Roman" w:eastAsia="仿宋"/>
+          <w:b w:val="0"/>
+          <w:sz w:val="28"/>
+        </w:rPr>
+        <w:t>· 委员会呼吁平衡监管与行业增长，避免英国在数字资产领域落后。</w:t>
+      </w:r>
+    </w:p>
+    <w:p>
+      <w:pPr>
+        <w:spacing w:before="0" w:after="0" w:line="240" w:lineRule="auto"/>
+        <w:ind w:left="0" w:right="0" w:firstLine="0"/>
+        <w:jc w:val="both"/>
+      </w:pPr>
+      <w:r>
+        <w:rPr>
+          <w:rFonts w:ascii="Times New Roman" w:hAnsi="Times New Roman" w:cs="Times New Roman" w:eastAsia="仿宋"/>
+          <w:b w:val="0"/>
+          <w:sz w:val="28"/>
+        </w:rPr>
+        <w:t>· 此事件发生在2026年6月初，反映英国监管政策持续收紧。</w:t>
+      </w:r>
+    </w:p>
+    <w:p>
+      <w:pPr>
+        <w:pStyle w:val="正文内容"/>
+        <w:spacing w:before="0" w:after="0" w:line="240" w:lineRule="auto"/>
+        <w:ind w:left="0" w:right="0" w:firstLine="560"/>
+        <w:jc w:val="both"/>
+      </w:pPr>
+      <w:r>
+        <w:rPr>
+          <w:rFonts w:ascii="Times New Roman" w:hAnsi="Times New Roman" w:cs="Times New Roman" w:eastAsia="仿宋"/>
+          <w:b w:val="0"/>
+          <w:sz w:val="28"/>
+        </w:rPr>
+        <w:t>英国上议院委员会于2026年6月3日发布警告，敦促英格兰银行重新审视其对英镑稳定币的严格监管框架，认为现行规则可能扼杀金融创新并损害英国在数字资产领域的竞争力。</w:t>
+      </w:r>
+    </w:p>
+    <w:p>
+      <w:pPr>
+        <w:pStyle w:val="正文内容"/>
+        <w:spacing w:before="0" w:after="0" w:line="240" w:lineRule="auto"/>
+        <w:ind w:left="0" w:right="0" w:firstLine="560"/>
+        <w:jc w:val="both"/>
+      </w:pPr>
+      <w:r>
+        <w:rPr>
+          <w:rFonts w:ascii="Times New Roman" w:hAnsi="Times New Roman" w:cs="Times New Roman" w:eastAsia="仿宋"/>
+          <w:b w:val="0"/>
+          <w:sz w:val="28"/>
+        </w:rPr>
+        <w:t>2026年6月3日，英国上议院某委员会公开表达了对英格兰银行（Bank of England，BoE）针对英镑稳定币（sterling stablecoin）监管规则的担忧。该委员会认为，当前的监管框架可能过于严苛，从而抑制了创新并阻碍了英国在数字资产领域的领导地位。委员会指出，稳定币作为新兴支付工具，其潜在价值不容忽视，但过度监管可能适得其反。</w:t>
+      </w:r>
+    </w:p>
+    <w:p>
+      <w:pPr>
+        <w:pStyle w:val="正文内容"/>
+        <w:spacing w:before="0" w:after="0" w:line="240" w:lineRule="auto"/>
+        <w:ind w:left="0" w:right="0" w:firstLine="560"/>
+        <w:jc w:val="both"/>
+      </w:pPr>
+      <w:r>
+        <w:rPr>
+          <w:rFonts w:ascii="Times New Roman" w:hAnsi="Times New Roman" w:cs="Times New Roman" w:eastAsia="仿宋"/>
+          <w:b w:val="0"/>
+          <w:sz w:val="28"/>
+        </w:rPr>
+        <w:t>据悉，英格兰银行此前提出了一套针对英镑稳定币的严格规则，包括对发行方的资本要求、储备资产管理以及消费者保护措施。上议院委员会在一份报告中表示，这些规则虽然旨在维护金融稳定，但可能对小型企业和初创公司形成不合理的负担，导致创新活动向监管更宽松的司法管辖区转移。</w:t>
+      </w:r>
+    </w:p>
+    <w:p>
+      <w:pPr>
+        <w:pStyle w:val="正文内容"/>
+        <w:spacing w:before="0" w:after="0" w:line="240" w:lineRule="auto"/>
+        <w:ind w:left="0" w:right="0" w:firstLine="560"/>
+        <w:jc w:val="both"/>
+      </w:pPr>
+      <w:r>
+        <w:rPr>
+          <w:rFonts w:ascii="Times New Roman" w:hAnsi="Times New Roman" w:cs="Times New Roman" w:eastAsia="仿宋"/>
+          <w:b w:val="0"/>
+          <w:sz w:val="28"/>
+        </w:rPr>
+        <w:t>该警告反映了英国国内对加密货币监管路径的持续辩论。一方面，监管机构强调风险防控，包括反洗钱（Anti-Money Laundering，AML）和打击恐怖融资（Combating the Financing of Terrorism，CFT）；另一方面，行业参与者呼吁提供更清晰的监管框架，以促进投资和增长。上议院委员会的立场可能影响后续政策制定。</w:t>
+      </w:r>
+    </w:p>
+    <w:p>
+      <w:pPr>
+        <w:pStyle w:val="正文内容"/>
+        <w:spacing w:before="0" w:after="0" w:line="240" w:lineRule="auto"/>
+        <w:ind w:left="0" w:right="0" w:firstLine="560"/>
+        <w:jc w:val="both"/>
+      </w:pPr>
+      <w:r>
+        <w:rPr>
+          <w:rFonts w:ascii="Times New Roman" w:hAnsi="Times New Roman" w:cs="Times New Roman" w:eastAsia="仿宋"/>
+          <w:b w:val="0"/>
+          <w:sz w:val="28"/>
+        </w:rPr>
+        <w:t>市场参与者对此次警告反应不一。一些分析人士认为，这可能是监管放松的信号，有望提升英国对加密企业的吸引力；而另一些人则警告，任何监管变化都需谨慎平衡，避免系统性风险。截至2026年6月初，英镑稳定币市场尚处于早期阶段，监管不确定性仍是主要障碍。</w:t>
+      </w:r>
+    </w:p>
+    <w:p>
+      <w:pPr>
+        <w:pStyle w:val="正文内容"/>
+        <w:spacing w:before="0" w:after="0" w:line="240" w:lineRule="auto"/>
+        <w:ind w:left="0" w:right="0" w:firstLine="560"/>
+        <w:jc w:val="both"/>
+      </w:pPr>
+      <w:r>
+        <w:rPr>
+          <w:rFonts w:ascii="Times New Roman" w:hAnsi="Times New Roman" w:cs="Times New Roman" w:eastAsia="仿宋"/>
+          <w:b w:val="0"/>
+          <w:sz w:val="28"/>
+        </w:rPr>
+        <w:t>国际视角下，英国并非唯一面临此困境的国家。欧盟的《加密资产市场监管法案》（MiCA）已于2025年全面实施，美国也在推进稳定币立法。上议院委员会的警告可能促使英格兰银行在2026年下半年调整其规则草案，以保持英国在金融科技领域的竞争力。后续观察将聚焦于监管互动和行业反馈。</w:t>
+      </w:r>
+    </w:p>
+    <w:p>
+      <w:pPr>
+        <w:pStyle w:val="正文内容"/>
+        <w:spacing w:before="0" w:after="0" w:line="240" w:lineRule="auto"/>
+        <w:ind w:left="0" w:right="0" w:firstLine="560"/>
+        <w:jc w:val="both"/>
+      </w:pPr>
+      <w:r>
+        <w:rPr>
+          <w:rFonts w:ascii="Times New Roman" w:hAnsi="Times New Roman" w:cs="Times New Roman" w:eastAsia="仿宋"/>
+          <w:b w:val="0"/>
+          <w:sz w:val="28"/>
+        </w:rPr>
+        <w:t>该委员会还建议英格兰银行与业界进行更广泛的协商，并考虑引入“监管沙盒”（regulatory sandbox）机制，允许企业在受控环境中测试稳定币产品。此举若能实施，将为英国成为全球稳定币创新中心铺平道路。然而，英格兰银行尚未对警告作出正式回应。</w:t>
+      </w:r>
+    </w:p>
+    <w:p>
+      <w:pPr>
+        <w:pStyle w:val="信息来源"/>
+        <w:spacing w:before="50" w:after="100" w:line="240" w:lineRule="auto"/>
+        <w:ind w:left="0" w:right="0" w:firstLine="0"/>
+        <w:jc w:val="right"/>
+      </w:pPr>
+      <w:r>
+        <w:rPr>
+          <w:rFonts w:ascii="Times New Roman" w:hAnsi="Times New Roman" w:cs="Times New Roman" w:eastAsia="仿宋"/>
+          <w:b w:val="0"/>
+          <w:sz w:val="21"/>
+        </w:rPr>
+        <w:t>（信息来源：cointelegraph.com）</w:t>
+      </w:r>
+    </w:p>
+    <w:p>
+      <w:pPr>
+        <w:pStyle w:val="原文信息"/>
+        <w:spacing w:before="0" w:after="0" w:line="240" w:lineRule="auto"/>
+        <w:ind w:left="0" w:right="0" w:firstLine="0"/>
+        <w:jc w:val="left"/>
+      </w:pPr>
+      <w:r>
+        <w:rPr>
+          <w:rFonts w:ascii="Times New Roman" w:hAnsi="Times New Roman" w:cs="Times New Roman" w:eastAsia="仿宋"/>
+          <w:b w:val="0"/>
+          <w:sz w:val="18"/>
+        </w:rPr>
+        <w:t>原文标题：UK Lords Warn BoE on Strict GBP Stablecoin Rules</w:t>
+      </w:r>
+    </w:p>
+    <w:p>
+      <w:pPr>
+        <w:pStyle w:val="原文信息"/>
+        <w:spacing w:before="0" w:after="0" w:line="240" w:lineRule="auto"/>
+        <w:ind w:left="0" w:right="0" w:firstLine="0"/>
+        <w:jc w:val="left"/>
+      </w:pPr>
+      <w:r>
+        <w:rPr>
+          <w:rFonts w:ascii="Times New Roman" w:hAnsi="Times New Roman" w:cs="Times New Roman" w:eastAsia="仿宋"/>
+          <w:b w:val="0"/>
+          <w:sz w:val="18"/>
+        </w:rPr>
+        <w:t>原文链接：https：//www.google-analytics.com/analytics.js</w:t>
+      </w:r>
+    </w:p>
+    <w:p>
+      <w:pPr>
+        <w:sectPr>
+          <w:pgSz w:w="12240" w:h="15840"/>
+          <w:pgMar w:top="1440" w:right="1803" w:bottom="1440" w:left="1803" w:header="850" w:footer="992" w:gutter="0"/>
+          <w:cols w:space="720"/>
+          <w:docGrid w:type="lines" w:linePitch="312"/>
+        </w:sectPr>
+      </w:pPr>
+    </w:p>
+    <w:p>
+      <w:pPr>
+        <w:pStyle w:val="Heading1"/>
+      </w:pPr>
+      <w:r>
+        <w:rPr>
+          <w:rFonts w:ascii="Times New Roman" w:hAnsi="Times New Roman" w:cs="Times New Roman" w:eastAsia="黑体"/>
+          <w:b w:val="0"/>
+          <w:color w:val="2F5496"/>
+          <w:sz w:val="30"/>
+        </w:rPr>
+        <w:t>【行业前沿】</w:t>
+      </w:r>
+    </w:p>
+    <w:p>
+      <w:pPr>
+        <w:pStyle w:val="文章一级标题"/>
+        <w:spacing w:before="0" w:after="0" w:line="240" w:lineRule="auto"/>
+        <w:ind w:left="0" w:right="0" w:firstLine="0"/>
+        <w:jc w:val="center"/>
+      </w:pPr>
+      <w:r>
+        <w:rPr>
+          <w:rFonts w:ascii="Times New Roman" w:hAnsi="Times New Roman" w:cs="Times New Roman" w:eastAsia="黑体"/>
+          <w:b w:val="0"/>
+          <w:sz w:val="30"/>
+        </w:rPr>
+        <w:t>Orbs在以太坊和Arbitrum上推出V5版本降低十多个链上的成本</w:t>
+      </w:r>
+    </w:p>
+    <w:p>
+      <w:pPr>
+        <w:spacing w:before="0" w:after="0" w:line="240" w:lineRule="auto"/>
+        <w:ind w:left="0" w:right="0" w:firstLine="0"/>
+        <w:jc w:val="both"/>
+      </w:pPr>
+      <w:r>
+        <w:rPr>
+          <w:rFonts w:ascii="Times New Roman" w:hAnsi="Times New Roman" w:cs="Times New Roman" w:eastAsia="仿宋"/>
+          <w:b w:val="0"/>
+          <w:sz w:val="28"/>
+        </w:rPr>
+        <w:t>· Orbs推出V5版本，在以太坊和Arbitrum上运行，优化跨链交易成本。</w:t>
+      </w:r>
+    </w:p>
+    <w:p>
+      <w:pPr>
+        <w:spacing w:before="0" w:after="0" w:line="240" w:lineRule="auto"/>
+        <w:ind w:left="0" w:right="0" w:firstLine="0"/>
+        <w:jc w:val="both"/>
+      </w:pPr>
+      <w:r>
+        <w:rPr>
+          <w:rFonts w:ascii="Times New Roman" w:hAnsi="Times New Roman" w:cs="Times New Roman" w:eastAsia="仿宋"/>
+          <w:b w:val="0"/>
+          <w:sz w:val="28"/>
+        </w:rPr>
+        <w:t>· 该版本覆盖超过十条区块链，提升Layer 2互操作性效率。</w:t>
+      </w:r>
+    </w:p>
+    <w:p>
+      <w:pPr>
+        <w:spacing w:before="0" w:after="0" w:line="240" w:lineRule="auto"/>
+        <w:ind w:left="0" w:right="0" w:firstLine="0"/>
+        <w:jc w:val="both"/>
+      </w:pPr>
+      <w:r>
+        <w:rPr>
+          <w:rFonts w:ascii="Times New Roman" w:hAnsi="Times New Roman" w:cs="Times New Roman" w:eastAsia="仿宋"/>
+          <w:b w:val="0"/>
+          <w:sz w:val="28"/>
+        </w:rPr>
+        <w:t>· 作为基础设施升级，有望降低DeFi和多链应用的总开销。</w:t>
+      </w:r>
+    </w:p>
+    <w:p>
+      <w:pPr>
+        <w:pStyle w:val="正文内容"/>
+        <w:spacing w:before="0" w:after="0" w:line="240" w:lineRule="auto"/>
+        <w:ind w:left="0" w:right="0" w:firstLine="560"/>
+        <w:jc w:val="both"/>
+      </w:pPr>
+      <w:r>
+        <w:rPr>
+          <w:rFonts w:ascii="Times New Roman" w:hAnsi="Times New Roman" w:cs="Times New Roman" w:eastAsia="仿宋"/>
+          <w:b w:val="0"/>
+          <w:sz w:val="28"/>
+        </w:rPr>
+        <w:t>Orbs项目于2026年6月3日宣布正式推出V5版本，该版本在以太坊和Arbitrum网络上部署，旨在将交易成本削减覆盖至超过十条区块链，标志着混合区块链在跨链扩展领域的又一进步。</w:t>
+      </w:r>
+    </w:p>
+    <w:p>
+      <w:pPr>
+        <w:pStyle w:val="正文内容"/>
+        <w:spacing w:before="0" w:after="0" w:line="240" w:lineRule="auto"/>
+        <w:ind w:left="0" w:right="0" w:firstLine="560"/>
+        <w:jc w:val="both"/>
+      </w:pPr>
+      <w:r>
+        <w:rPr>
+          <w:rFonts w:ascii="Times New Roman" w:hAnsi="Times New Roman" w:cs="Times New Roman" w:eastAsia="仿宋"/>
+          <w:b w:val="0"/>
+          <w:sz w:val="28"/>
+        </w:rPr>
+        <w:t>Orbs是一个混合区块链项目，专注于作为第二层（Layer 2）解决方案增强以太坊等主链的性能。2026年6月3日，Orbs团队宣布推出其V5版本，该版本首先运行在以太坊（Ethereum）和Arbitrum网络上，并计划通过跨链协议将成本优化延伸至超过十条区块链。这一升级的核心是通过改进状态通道和链上验证机制，降低多链交互过程中的手续费和信息延迟。</w:t>
+      </w:r>
+    </w:p>
+    <w:p>
+      <w:pPr>
+        <w:pStyle w:val="正文内容"/>
+        <w:spacing w:before="0" w:after="0" w:line="240" w:lineRule="auto"/>
+        <w:ind w:left="0" w:right="0" w:firstLine="560"/>
+        <w:jc w:val="both"/>
+      </w:pPr>
+      <w:r>
+        <w:rPr>
+          <w:rFonts w:ascii="Times New Roman" w:hAnsi="Times New Roman" w:cs="Times New Roman" w:eastAsia="仿宋"/>
+          <w:b w:val="0"/>
+          <w:sz w:val="28"/>
+        </w:rPr>
+        <w:t>V5版本的设计重点在于解决多链生态中的‘成本碎片化’问题。在以太坊和Arbitrum上，Orbs利用其独特的‘混合共识’模式，将部分交易处理卸载到Orbs自己的链上，再通过零知识证明（Zero-Knowledge Proof，ZKP）汇总回主链。这一过程不仅减少了主链的拥堵，还使跨链调用费用下降约30%至50%。据Orbs官方公告，首批受益链包括以太坊主网、Arbitrum、Optimism、Polygon等主流Layer 2网络，以及部分侧链和定制化链。</w:t>
+      </w:r>
+    </w:p>
+    <w:p>
+      <w:pPr>
+        <w:pStyle w:val="正文内容"/>
+        <w:spacing w:before="0" w:after="0" w:line="240" w:lineRule="auto"/>
+        <w:ind w:left="0" w:right="0" w:firstLine="560"/>
+        <w:jc w:val="both"/>
+      </w:pPr>
+      <w:r>
+        <w:rPr>
+          <w:rFonts w:ascii="Times New Roman" w:hAnsi="Times New Roman" w:cs="Times New Roman" w:eastAsia="仿宋"/>
+          <w:b w:val="0"/>
+          <w:sz w:val="28"/>
+        </w:rPr>
+        <w:t>对于以太坊用户而言，V5版本意味着访问Arbitrum等二层网络时的转账和智能合约执行成本将显著降低。Orbs在以太坊上扮演‘缓存层’角色，允许用户将高频交易暂存于Orbs网络，待批量确认后再提交至以太坊。Arbitrum作为以太坊最活跃的Layer 2之一，与Orbs的整合进一步缩短了跨链桥的确认时间，同时减少了桥接费用。Orbs表示，V5版本还引入了动态费用调整算法，可根据网络拥堵情况自动优化收费策略。</w:t>
+      </w:r>
+    </w:p>
+    <w:p>
+      <w:pPr>
+        <w:pStyle w:val="正文内容"/>
+        <w:spacing w:before="0" w:after="0" w:line="240" w:lineRule="auto"/>
+        <w:ind w:left="0" w:right="0" w:firstLine="560"/>
+        <w:jc w:val="both"/>
+      </w:pPr>
+      <w:r>
+        <w:rPr>
+          <w:rFonts w:ascii="Times New Roman" w:hAnsi="Times New Roman" w:cs="Times New Roman" w:eastAsia="仿宋"/>
+          <w:b w:val="0"/>
+          <w:sz w:val="28"/>
+        </w:rPr>
+        <w:t>在超过十条链上同时部署V5，对Orbs的节点网络提出了更高要求。Orbs依赖其‘权益证明（Proof-of-Stake，PoS）’验证者集群来确保跨链数据的真实性。V5版本升级了节点调度协议，使验证者可以并行处理来自不同链的请求，避免了单一链拥堵导致的级联延迟。这一改进也提升了Orbs原生代币的使用价值，因为验证需要质押代币作为担保。市场分析人士认为，V5版本可能吸引更多DeFi协议将其部分逻辑迁移至Orbs，以降低运营成本。</w:t>
+      </w:r>
+    </w:p>
+    <w:p>
+      <w:pPr>
+        <w:pStyle w:val="正文内容"/>
+        <w:spacing w:before="0" w:after="0" w:line="240" w:lineRule="auto"/>
+        <w:ind w:left="0" w:right="0" w:firstLine="560"/>
+        <w:jc w:val="both"/>
+      </w:pPr>
+      <w:r>
+        <w:rPr>
+          <w:rFonts w:ascii="Times New Roman" w:hAnsi="Times New Roman" w:cs="Times New Roman" w:eastAsia="仿宋"/>
+          <w:b w:val="0"/>
+          <w:sz w:val="28"/>
+        </w:rPr>
+        <w:t>尽管V5版本的技术细节已经公布，但其实际效果仍需通过链上数据验证。Orbs团队计划在未来几个月内发布详细的性能报告，并逐步扩展支持链的数量。此外，监管层面尚未对这一混合架构产生明确态度，但多链成本降低有望推动更多机构采用去中心化金融（DeFi）服务。作为Bitcoin News报道的焦点，Orbs V5版本的推出被视为Layer 2基础设施成熟的重要标志，其后续在以太坊和Arbitrum上的表现将直接影响市场对跨链扩展方案的信心。</w:t>
+      </w:r>
+    </w:p>
+    <w:p>
+      <w:pPr>
+        <w:pStyle w:val="信息来源"/>
+        <w:spacing w:before="50" w:after="100" w:line="240" w:lineRule="auto"/>
+        <w:ind w:left="0" w:right="0" w:firstLine="0"/>
+        <w:jc w:val="right"/>
+      </w:pPr>
+      <w:r>
+        <w:rPr>
+          <w:rFonts w:ascii="Times New Roman" w:hAnsi="Times New Roman" w:cs="Times New Roman" w:eastAsia="仿宋"/>
+          <w:b w:val="0"/>
+          <w:sz w:val="21"/>
+        </w:rPr>
+        <w:t>（信息来源：Bitcoin News）</w:t>
+      </w:r>
+    </w:p>
+    <w:p>
+      <w:pPr>
+        <w:pStyle w:val="原文信息"/>
+        <w:spacing w:before="0" w:after="0" w:line="240" w:lineRule="auto"/>
+        <w:ind w:left="0" w:right="0" w:firstLine="0"/>
+        <w:jc w:val="left"/>
+      </w:pPr>
+      <w:r>
+        <w:rPr>
+          <w:rFonts w:ascii="Times New Roman" w:hAnsi="Times New Roman" w:cs="Times New Roman" w:eastAsia="仿宋"/>
+          <w:b w:val="0"/>
+          <w:sz w:val="18"/>
+        </w:rPr>
+        <w:t>原文标题：Orbs Rolls out V5 on Ethereum and Arbitrum， Cutting Costs Across 10+ Chains</w:t>
       </w:r>
     </w:p>
     <w:p>
@@ -738,7 +1096,7 @@
           <w:b w:val="0"/>
           <w:sz w:val="30"/>
         </w:rPr>
-        <w:t>区块链协会联合160名前安全官员致信参议院敦促通过《清晰法案》</w:t>
+        <w:t>以太坊首个后量子迁移规范发布</w:t>
       </w:r>
     </w:p>
     <w:p>
@@ -753,7 +1111,7 @@
           <w:b w:val="0"/>
           <w:sz w:val="28"/>
         </w:rPr>
-        <w:t>· 区块链协会与160名前美国安全官员联名致信参议院，敦促通过《清晰法案》。</w:t>
+        <w:t>· 以太坊核心开发者发布首个后量子迁移规范，以应对量子计算威胁。</w:t>
       </w:r>
     </w:p>
     <w:p>
@@ -768,7 +1126,7 @@
           <w:b w:val="0"/>
           <w:sz w:val="28"/>
         </w:rPr>
-        <w:t>· 该法案旨在为数字资产提供明确监管分类，消除法律不确定性。</w:t>
+        <w:t>· 规范定义了从当前椭圆曲线密码学向抗量子算法的过渡路径。</w:t>
       </w:r>
     </w:p>
     <w:p>
@@ -783,7 +1141,7 @@
           <w:b w:val="0"/>
           <w:sz w:val="28"/>
         </w:rPr>
-        <w:t>· 前安全官员认为监管缺失可能影响国家安全和技术竞争力。</w:t>
+        <w:t>· 该升级为长期安全储备，目前量子攻击尚未构成实际风险。</w:t>
       </w:r>
     </w:p>
     <w:p>
@@ -799,7 +1157,7 @@
           <w:b w:val="0"/>
           <w:sz w:val="28"/>
         </w:rPr>
-        <w:t>区块链协会联合160名美国前国家安全与执法官员于2026年6月3日致信参议院，强烈呼吁立法者尽快通过《数字资产清晰法案》（Clarity Act），以建立明确的联邦数字资产监管框架。</w:t>
+        <w:t>以太坊核心开发者于2026年6月3日发布了首个后量子迁移规范，旨在为以太坊网络应对未来量子计算机可能带来的密码学威胁铺平道路。该规范详细说明了如何将现有基于椭圆曲线的签名方案逐步替换为抗量子算法。</w:t>
       </w:r>
     </w:p>
     <w:p>
@@ -815,7 +1173,7 @@
           <w:b w:val="0"/>
           <w:sz w:val="28"/>
         </w:rPr>
-        <w:t>区块链协会于2026年6月3日宣布，该组织联合160名美国前任国家安全与执法官员共同签署了一封公开信，致信美国参议院全体议员，敦促其支持并通过《清晰法案》。该法案全称为《数字资产清晰法案》，旨在为数字资产提供法律上的明确分类，解决长期以来监管机构之间对于数字资产属性的分歧。</w:t>
+        <w:t>以太坊（Ethereum）核心开发团队于2026年6月3日正式发布了首个后量子迁移规范，标志着区块链网络在密码学抗量子化方向上迈出关键一步。该规范由以太坊基金会的研究人员与社区开发者共同起草，旨在为未来量子计算机可能破解当前公钥密码系统提供一套标准化的迁移流程。</w:t>
       </w:r>
     </w:p>
     <w:p>
@@ -831,7 +1189,7 @@
           <w:b w:val="0"/>
           <w:sz w:val="28"/>
         </w:rPr>
-        <w:t>参与联署的160名前官员包括来自中央情报局、联邦调查局、国家安全局以及国土安全部的前高级代表。信中指出，当前美国缺乏统一的数字资产联邦法律，导致监管碎片化和司法不确定性，这不仅阻碍了创新，还可能被恶意行为者利用，对国家安全构成潜在风险。</w:t>
+        <w:t>量子计算技术的发展对现有区块链加密体系构成潜在威胁，尤其是依赖椭圆曲线密码学（Elliptic Curve Cryptography，ECC）的签名算法，如以太坊目前使用的椭圆曲线数字签名算法（Elliptic Curve Digital Signature Algorithm，ECDSA）。一旦量子计算机达到足够算力，理论上可快速破解私钥，导致资产被盗或交易伪造。</w:t>
       </w:r>
     </w:p>
     <w:p>
@@ -847,7 +1205,7 @@
           <w:b w:val="0"/>
           <w:sz w:val="28"/>
         </w:rPr>
-        <w:t>《清晰法案》的核心内容包括将数字资产分为商品、证券或其他类别，并由相应联邦机构监管。区块链协会首席执行官Kristin Smith表示，该法案将为企业提供急需的法律确定性，释放数字资产行业的增长潜力，同时加强反洗钱和消费者保护措施。</w:t>
+        <w:t>该规范提出了一种分阶段迁移策略：首先在测试网上部署抗量子签名方案，如基于格密码的Falcon和CRYSTALS-Dilithium，并通过软分叉（soft fork）逐步引入新地址格式。用户需主动将资产从旧地址转移至新地址，以享受抗量子保护。规范同时保留了向后兼容性，避免因升级导致现有智能合约失效。</w:t>
       </w:r>
     </w:p>
     <w:p>
@@ -863,7 +1221,7 @@
           <w:b w:val="0"/>
           <w:sz w:val="28"/>
         </w:rPr>
-        <w:t>前官员们在信中强调，清晰的监管框架对于维持美国在全球金融科技领域的领导地位至关重要。他们指出，其他国家如英国和新加坡已经采取了明确的数字资产立法，而美国的监管模糊正在促使企业和人才外流，这直接影响了国家经济安全和执法能力。</w:t>
+        <w:t>以太坊基金会研究员Justin Drake表示，后量子迁移是‘网络安全保险’的重要组成部分，虽然目前量子计算机远未达到威胁级别，但提前制定标准可避免未来仓促升级带来的风险。Drake强调，规范目前仍处于草案阶段，社区反馈将决定最终落地时间。</w:t>
       </w:r>
     </w:p>
     <w:p>
@@ -879,7 +1237,252 @@
           <w:b w:val="0"/>
           <w:sz w:val="28"/>
         </w:rPr>
-        <w:t>目前，《清晰法案》已在众议院获得两党支持，但参议院审议进度缓慢。区块链协会表示将继续与立法者合作，推动法案在2026年国会会期内通过。行业观察人士认为，该法案若获通过，将重塑美国数字资产市场格局，并可能成为全球监管参考标准。</w:t>
+        <w:t>市场对此反应平静，以太币（ETH）价格在消息发布后小幅波动。分析人士指出，该升级属于长期技术储备，短期内对网络性能和用户体验无直接影响。监管层面，美国国家标准与技术研究院（National Institute of Standards and Technology，NIST）已选定多个后量子密码算法，以太坊的迁移规范与之保持兼容。</w:t>
+      </w:r>
+    </w:p>
+    <w:p>
+      <w:pPr>
+        <w:pStyle w:val="正文内容"/>
+        <w:spacing w:before="0" w:after="0" w:line="240" w:lineRule="auto"/>
+        <w:ind w:left="0" w:right="0" w:firstLine="560"/>
+        <w:jc w:val="both"/>
+      </w:pPr>
+      <w:r>
+        <w:rPr>
+          <w:rFonts w:ascii="Times New Roman" w:hAnsi="Times New Roman" w:cs="Times New Roman" w:eastAsia="仿宋"/>
+          <w:b w:val="0"/>
+          <w:sz w:val="28"/>
+        </w:rPr>
+        <w:t>后续观察点包括：测试网迁移试验的时间表、用户迁移意愿以及潜在的分叉风险。若迁移顺利，以太坊将成为首批在后量子时代具备安全升级路径的主流公链之一，为整个行业树立范本。</w:t>
+      </w:r>
+    </w:p>
+    <w:p>
+      <w:pPr>
+        <w:pStyle w:val="信息来源"/>
+        <w:spacing w:before="50" w:after="100" w:line="240" w:lineRule="auto"/>
+        <w:ind w:left="0" w:right="0" w:firstLine="0"/>
+        <w:jc w:val="right"/>
+      </w:pPr>
+      <w:r>
+        <w:rPr>
+          <w:rFonts w:ascii="Times New Roman" w:hAnsi="Times New Roman" w:cs="Times New Roman" w:eastAsia="仿宋"/>
+          <w:b w:val="0"/>
+          <w:sz w:val="21"/>
+        </w:rPr>
+        <w:t>（信息来源：thedefiant.io）</w:t>
+      </w:r>
+    </w:p>
+    <w:p>
+      <w:pPr>
+        <w:pStyle w:val="原文信息"/>
+        <w:spacing w:before="0" w:after="0" w:line="240" w:lineRule="auto"/>
+        <w:ind w:left="0" w:right="0" w:firstLine="0"/>
+        <w:jc w:val="left"/>
+      </w:pPr>
+      <w:r>
+        <w:rPr>
+          <w:rFonts w:ascii="Times New Roman" w:hAnsi="Times New Roman" w:cs="Times New Roman" w:eastAsia="仿宋"/>
+          <w:b w:val="0"/>
+          <w:sz w:val="18"/>
+        </w:rPr>
+        <w:t>原文标题：Ethereum's First Post-Quantum Migration Spec Lands</w:t>
+      </w:r>
+    </w:p>
+    <w:p>
+      <w:pPr>
+        <w:pStyle w:val="原文信息"/>
+        <w:spacing w:before="0" w:after="0" w:line="240" w:lineRule="auto"/>
+        <w:ind w:left="0" w:right="0" w:firstLine="0"/>
+        <w:jc w:val="left"/>
+      </w:pPr>
+      <w:r>
+        <w:rPr>
+          <w:rFonts w:ascii="Times New Roman" w:hAnsi="Times New Roman" w:cs="Times New Roman" w:eastAsia="仿宋"/>
+          <w:b w:val="0"/>
+          <w:sz w:val="18"/>
+        </w:rPr>
+        <w:t>原文链接：https：//www.google-analytics.com/analytics.js</w:t>
+      </w:r>
+    </w:p>
+    <w:p>
+      <w:pPr>
+        <w:sectPr>
+          <w:pgSz w:w="12240" w:h="15840"/>
+          <w:pgMar w:top="1440" w:right="1803" w:bottom="1440" w:left="1803" w:header="850" w:footer="992" w:gutter="0"/>
+          <w:cols w:space="720"/>
+          <w:docGrid w:type="lines" w:linePitch="312"/>
+        </w:sectPr>
+      </w:pPr>
+    </w:p>
+    <w:p>
+      <w:pPr>
+        <w:pStyle w:val="Heading1"/>
+      </w:pPr>
+      <w:r>
+        <w:rPr>
+          <w:rFonts w:ascii="Times New Roman" w:hAnsi="Times New Roman" w:cs="Times New Roman" w:eastAsia="黑体"/>
+          <w:b w:val="0"/>
+          <w:color w:val="2F5496"/>
+          <w:sz w:val="30"/>
+        </w:rPr>
+        <w:t>【市场动态】</w:t>
+      </w:r>
+    </w:p>
+    <w:p>
+      <w:pPr>
+        <w:pStyle w:val="文章一级标题"/>
+        <w:spacing w:before="0" w:after="0" w:line="240" w:lineRule="auto"/>
+        <w:ind w:left="0" w:right="0" w:firstLine="0"/>
+        <w:jc w:val="center"/>
+      </w:pPr>
+      <w:r>
+        <w:rPr>
+          <w:rFonts w:ascii="Times New Roman" w:hAnsi="Times New Roman" w:cs="Times New Roman" w:eastAsia="黑体"/>
+          <w:b w:val="0"/>
+          <w:sz w:val="30"/>
+        </w:rPr>
+        <w:t>万事达卡扩展稳定币结算选项支持USDC、PYUSD和RLUSD</w:t>
+      </w:r>
+    </w:p>
+    <w:p>
+      <w:pPr>
+        <w:spacing w:before="0" w:after="0" w:line="240" w:lineRule="auto"/>
+        <w:ind w:left="0" w:right="0" w:firstLine="0"/>
+        <w:jc w:val="both"/>
+      </w:pPr>
+      <w:r>
+        <w:rPr>
+          <w:rFonts w:ascii="Times New Roman" w:hAnsi="Times New Roman" w:cs="Times New Roman" w:eastAsia="仿宋"/>
+          <w:b w:val="0"/>
+          <w:sz w:val="28"/>
+        </w:rPr>
+        <w:t>· 万事达卡Mastercard于2026年6月3日宣布扩展其稳定币结算网络，新增支持USDC、PYUSD和RLUSD三种稳定币。</w:t>
+      </w:r>
+    </w:p>
+    <w:p>
+      <w:pPr>
+        <w:spacing w:before="0" w:after="0" w:line="240" w:lineRule="auto"/>
+        <w:ind w:left="0" w:right="0" w:firstLine="0"/>
+        <w:jc w:val="both"/>
+      </w:pPr>
+      <w:r>
+        <w:rPr>
+          <w:rFonts w:ascii="Times New Roman" w:hAnsi="Times New Roman" w:cs="Times New Roman" w:eastAsia="仿宋"/>
+          <w:b w:val="0"/>
+          <w:sz w:val="28"/>
+        </w:rPr>
+        <w:t>· 此举旨在提升跨境支付效率，为金融机构和企业提供更灵活的结算选择，推动数字货币与传统金融融合。</w:t>
+      </w:r>
+    </w:p>
+    <w:p>
+      <w:pPr>
+        <w:spacing w:before="0" w:after="0" w:line="240" w:lineRule="auto"/>
+        <w:ind w:left="0" w:right="0" w:firstLine="0"/>
+        <w:jc w:val="both"/>
+      </w:pPr>
+      <w:r>
+        <w:rPr>
+          <w:rFonts w:ascii="Times New Roman" w:hAnsi="Times New Roman" w:cs="Times New Roman" w:eastAsia="仿宋"/>
+          <w:b w:val="0"/>
+          <w:sz w:val="28"/>
+        </w:rPr>
+        <w:t>· 新增稳定币分别来自Circle、PayPal和Ripple，反映主流支付机构对多元化稳定币生态的接纳。</w:t>
+      </w:r>
+    </w:p>
+    <w:p>
+      <w:pPr>
+        <w:pStyle w:val="正文内容"/>
+        <w:spacing w:before="0" w:after="0" w:line="240" w:lineRule="auto"/>
+        <w:ind w:left="0" w:right="0" w:firstLine="560"/>
+        <w:jc w:val="both"/>
+      </w:pPr>
+      <w:r>
+        <w:rPr>
+          <w:rFonts w:ascii="Times New Roman" w:hAnsi="Times New Roman" w:cs="Times New Roman" w:eastAsia="仿宋"/>
+          <w:b w:val="0"/>
+          <w:sz w:val="28"/>
+        </w:rPr>
+        <w:t>万事达卡Mastercard于2026年6月3日宣布扩展其稳定币结算网络，新增支持USD Coin（USDC）、PayPal USD（PYUSD）和Ripple USD（RLUSD）三种稳定币，进一步推动数字货币在支付结算领域的应用。</w:t>
+      </w:r>
+    </w:p>
+    <w:p>
+      <w:pPr>
+        <w:pStyle w:val="正文内容"/>
+        <w:spacing w:before="0" w:after="0" w:line="240" w:lineRule="auto"/>
+        <w:ind w:left="0" w:right="0" w:firstLine="560"/>
+        <w:jc w:val="both"/>
+      </w:pPr>
+      <w:r>
+        <w:rPr>
+          <w:rFonts w:ascii="Times New Roman" w:hAnsi="Times New Roman" w:cs="Times New Roman" w:eastAsia="仿宋"/>
+          <w:b w:val="0"/>
+          <w:sz w:val="28"/>
+        </w:rPr>
+        <w:t>支付巨头Mastercard于当地时间2026年6月3日宣布，其稳定币结算网络（Mastercard Settlement Network）将新增对三种稳定币的支持，包括Circle发行的USD Coin（USDC）、PayPal发行的PayPal USD（PYUSD）以及Ripple发行的Ripple USD（RLUSD）。Mastercard此前已支持USDC进行结算，本次扩展标志着其稳定币基础设施的进一步成熟，旨在满足全球金融机构和企业对多样化数字资产结算的需求。</w:t>
+      </w:r>
+    </w:p>
+    <w:p>
+      <w:pPr>
+        <w:pStyle w:val="正文内容"/>
+        <w:spacing w:before="0" w:after="0" w:line="240" w:lineRule="auto"/>
+        <w:ind w:left="0" w:right="0" w:firstLine="560"/>
+        <w:jc w:val="both"/>
+      </w:pPr>
+      <w:r>
+        <w:rPr>
+          <w:rFonts w:ascii="Times New Roman" w:hAnsi="Times New Roman" w:cs="Times New Roman" w:eastAsia="仿宋"/>
+          <w:b w:val="0"/>
+          <w:sz w:val="28"/>
+        </w:rPr>
+        <w:t>Mastercard的稳定币结算网络于2023年首次推出，最初仅支持USDC。该网络允许商业银行通过Mastercard的专用通道直接发送和接收稳定币，而无需依赖传统银行系统。新增PYUSD和RLUSD后，参与者可以在不同稳定币之间进行结算，提高了互操作性。Mastercard表示，这一举措将帮助发行方和金融机构更高效地处理跨境支付、流动性管理和合规结算。</w:t>
+      </w:r>
+    </w:p>
+    <w:p>
+      <w:pPr>
+        <w:pStyle w:val="正文内容"/>
+        <w:spacing w:before="0" w:after="0" w:line="240" w:lineRule="auto"/>
+        <w:ind w:left="0" w:right="0" w:firstLine="560"/>
+        <w:jc w:val="both"/>
+      </w:pPr>
+      <w:r>
+        <w:rPr>
+          <w:rFonts w:ascii="Times New Roman" w:hAnsi="Times New Roman" w:cs="Times New Roman" w:eastAsia="仿宋"/>
+          <w:b w:val="0"/>
+          <w:sz w:val="28"/>
+        </w:rPr>
+        <w:t>USDC是目前市值第二大的美元稳定币，由Circle发行，广泛用于DeFi和传统金融场景。PYUSD由支付平台PayPal于2023年推出，旨在简化电子商务和点对点支付。RLUSD则是Ripple Labs于2025年推出的合规稳定币，专注于跨境汇款和机构用例。Mastercard同时支持这三种稳定币，反映了其对市场多元化趋势的认可，并试图建立统一的结算标准。</w:t>
+      </w:r>
+    </w:p>
+    <w:p>
+      <w:pPr>
+        <w:pStyle w:val="正文内容"/>
+        <w:spacing w:before="0" w:after="0" w:line="240" w:lineRule="auto"/>
+        <w:ind w:left="0" w:right="0" w:firstLine="560"/>
+        <w:jc w:val="both"/>
+      </w:pPr>
+      <w:r>
+        <w:rPr>
+          <w:rFonts w:ascii="Times New Roman" w:hAnsi="Times New Roman" w:cs="Times New Roman" w:eastAsia="仿宋"/>
+          <w:b w:val="0"/>
+          <w:sz w:val="28"/>
+        </w:rPr>
+        <w:t>市场分析师认为，Mastercard的扩展将加速稳定币在主流支付中的采用。传统金融机构往往对单一稳定币依赖存在风险顾虑，多币种支持降低了这种不确定性。此外，Mastercard的结算网络自带合规框架，有助于满足不同司法管辖区的监管要求。例如，PYUSD受纽约金融服务部监管，RLUSD则遵循Ripple与多个监管机构的合作框架，USDC已获得广泛合规认可。</w:t>
+      </w:r>
+    </w:p>
+    <w:p>
+      <w:pPr>
+        <w:pStyle w:val="正文内容"/>
+        <w:spacing w:before="0" w:after="0" w:line="240" w:lineRule="auto"/>
+        <w:ind w:left="0" w:right="0" w:firstLine="560"/>
+        <w:jc w:val="both"/>
+      </w:pPr>
+      <w:r>
+        <w:rPr>
+          <w:rFonts w:ascii="Times New Roman" w:hAnsi="Times New Roman" w:cs="Times New Roman" w:eastAsia="仿宋"/>
+          <w:b w:val="0"/>
+          <w:sz w:val="28"/>
+        </w:rPr>
+        <w:t>Mastercard 数字资产和区块链高级副总裁 Raj Dhamodharan 在声明中表示，公司的目标是“创建一个开放、可互操作的稳定币生态系统”，让客户能够“无缝地使用他们信任的稳定币”。此次扩展将于2026年第三季度全面上线，届时参与者可通过Mastercard的API直接访问。这一进展可能进一步挑战SWIFT等传统跨境结算系统，并为代币化存款和央行数字货币的融合铺平道路。</w:t>
       </w:r>
     </w:p>
     <w:p>
@@ -911,7 +1514,7 @@
           <w:b w:val="0"/>
           <w:sz w:val="18"/>
         </w:rPr>
-        <w:t>原文标题：Blockchain Association urges Senate to pass Clarity Act with letter from 160 former security officials</w:t>
+        <w:t>原文标题：Mastercard expands stablecoin settlement options with USDC， PYUSD and RLUSD</w:t>
       </w:r>
     </w:p>
     <w:p>
@@ -927,7 +1530,213 @@
           <w:b w:val="0"/>
           <w:sz w:val="18"/>
         </w:rPr>
-        <w:t>原文链接：https：//www.google-analytics.com/analytics.js</w:t>
+        <w:t>原文链接：https：//www.theblock.co/</w:t>
+      </w:r>
+    </w:p>
+    <w:p/>
+    <w:p>
+      <w:pPr>
+        <w:pStyle w:val="文章一级标题"/>
+        <w:spacing w:before="0" w:after="0" w:line="240" w:lineRule="auto"/>
+        <w:ind w:left="0" w:right="0" w:firstLine="0"/>
+        <w:jc w:val="center"/>
+      </w:pPr>
+      <w:r>
+        <w:rPr>
+          <w:rFonts w:ascii="Times New Roman" w:hAnsi="Times New Roman" w:cs="Times New Roman" w:eastAsia="黑体"/>
+          <w:b w:val="0"/>
+          <w:sz w:val="30"/>
+        </w:rPr>
+        <w:t>Symbiotic推出新流动性网络简化代币化资产兑现</w:t>
+      </w:r>
+    </w:p>
+    <w:p>
+      <w:pPr>
+        <w:spacing w:before="0" w:after="0" w:line="240" w:lineRule="auto"/>
+        <w:ind w:left="0" w:right="0" w:firstLine="0"/>
+        <w:jc w:val="both"/>
+      </w:pPr>
+      <w:r>
+        <w:rPr>
+          <w:rFonts w:ascii="Times New Roman" w:hAnsi="Times New Roman" w:cs="Times New Roman" w:eastAsia="仿宋"/>
+          <w:b w:val="0"/>
+          <w:sz w:val="28"/>
+        </w:rPr>
+        <w:t>· Symbiotic协议发布流动性网络，旨在解决代币化资产流动性不足问题。</w:t>
+      </w:r>
+    </w:p>
+    <w:p>
+      <w:pPr>
+        <w:spacing w:before="0" w:after="0" w:line="240" w:lineRule="auto"/>
+        <w:ind w:left="0" w:right="0" w:firstLine="0"/>
+        <w:jc w:val="both"/>
+      </w:pPr>
+      <w:r>
+        <w:rPr>
+          <w:rFonts w:ascii="Times New Roman" w:hAnsi="Times New Roman" w:cs="Times New Roman" w:eastAsia="仿宋"/>
+          <w:b w:val="0"/>
+          <w:sz w:val="28"/>
+        </w:rPr>
+        <w:t>· 该网络聚合多链流动性，允许用户更高效地将代币化资产兑换为稳定币。</w:t>
+      </w:r>
+    </w:p>
+    <w:p>
+      <w:pPr>
+        <w:spacing w:before="0" w:after="0" w:line="240" w:lineRule="auto"/>
+        <w:ind w:left="0" w:right="0" w:firstLine="0"/>
+        <w:jc w:val="both"/>
+      </w:pPr>
+      <w:r>
+        <w:rPr>
+          <w:rFonts w:ascii="Times New Roman" w:hAnsi="Times New Roman" w:cs="Times New Roman" w:eastAsia="仿宋"/>
+          <w:b w:val="0"/>
+          <w:sz w:val="28"/>
+        </w:rPr>
+        <w:t>· 此举被视为DeFi基础设施的重要创新，有望推动真实世界资产代币化采用。</w:t>
+      </w:r>
+    </w:p>
+    <w:p>
+      <w:pPr>
+        <w:pStyle w:val="正文内容"/>
+        <w:spacing w:before="0" w:after="0" w:line="240" w:lineRule="auto"/>
+        <w:ind w:left="0" w:right="0" w:firstLine="560"/>
+        <w:jc w:val="both"/>
+      </w:pPr>
+      <w:r>
+        <w:rPr>
+          <w:rFonts w:ascii="Times New Roman" w:hAnsi="Times New Roman" w:cs="Times New Roman" w:eastAsia="仿宋"/>
+          <w:b w:val="0"/>
+          <w:sz w:val="28"/>
+        </w:rPr>
+        <w:t>去中心化协议Symbiotic于2026年6月3日宣布推出全新的流动性网络，旨在解决代币化资产（Tokenized Assets）流动性不足的痛点，让用户能够更便捷地将代币化资产兑换为现金等价物。</w:t>
+      </w:r>
+    </w:p>
+    <w:p>
+      <w:pPr>
+        <w:pStyle w:val="正文内容"/>
+        <w:spacing w:before="0" w:after="0" w:line="240" w:lineRule="auto"/>
+        <w:ind w:left="0" w:right="0" w:firstLine="560"/>
+        <w:jc w:val="both"/>
+      </w:pPr>
+      <w:r>
+        <w:rPr>
+          <w:rFonts w:ascii="Times New Roman" w:hAnsi="Times New Roman" w:cs="Times New Roman" w:eastAsia="仿宋"/>
+          <w:b w:val="0"/>
+          <w:sz w:val="28"/>
+        </w:rPr>
+        <w:t>去中心化协议Symbiotic在2026年6月3日宣布推出其全新的流动性网络（Liquidity Network），该网络旨在解决代币化资产（Tokenized Assets）长期面临的流动性瓶颈。代币化资产指将房地产、债券、大宗商品等真实世界资产（Real World Assets，RWA）通过区块链技术转化为数字代币，但这类资产通常缺乏活跃的二级市场，导致持有者难以快速变现。Symbiotic的流动性网络通过聚合多条区块链的流动性池，允许用户以较低滑点和手续费将代币化资产兑换为USDC、DAI等稳定币，从而简化兑现流程。</w:t>
+      </w:r>
+    </w:p>
+    <w:p>
+      <w:pPr>
+        <w:pStyle w:val="正文内容"/>
+        <w:spacing w:before="0" w:after="0" w:line="240" w:lineRule="auto"/>
+        <w:ind w:left="0" w:right="0" w:firstLine="560"/>
+        <w:jc w:val="both"/>
+      </w:pPr>
+      <w:r>
+        <w:rPr>
+          <w:rFonts w:ascii="Times New Roman" w:hAnsi="Times New Roman" w:cs="Times New Roman" w:eastAsia="仿宋"/>
+          <w:b w:val="0"/>
+          <w:sz w:val="28"/>
+        </w:rPr>
+        <w:t>这一设计基于Symbiotic此前开发的模块化加密原生网络（Modular Cryptonative Network），该网络支持多种代币标准（如ERC-20、BEP-20）和跨链桥技术。Symbiotic在其官方博客中表示，流动性网络初期将支持以太坊（Ethereum）、Solana和Polkadot生态系统中的主要代币化资产，未来计划扩展至Layer 2网络如Arbitrum和Optimism。用户可通过智能合约（Smart Contract）直接发起兑换请求，系统自动匹配最优流动性路径，整个过程无需依赖中心化交易所。</w:t>
+      </w:r>
+    </w:p>
+    <w:p>
+      <w:pPr>
+        <w:pStyle w:val="正文内容"/>
+        <w:spacing w:before="0" w:after="0" w:line="240" w:lineRule="auto"/>
+        <w:ind w:left="0" w:right="0" w:firstLine="560"/>
+        <w:jc w:val="both"/>
+      </w:pPr>
+      <w:r>
+        <w:rPr>
+          <w:rFonts w:ascii="Times New Roman" w:hAnsi="Times New Roman" w:cs="Times New Roman" w:eastAsia="仿宋"/>
+          <w:b w:val="0"/>
+          <w:sz w:val="28"/>
+        </w:rPr>
+        <w:t>Symbiotic的联合创始人Alex Miller在接受CoinDesk采访时指出：“代币化资产的市场规模已超过500亿美元，但流动性分散且深度不足，导致许多机构投资者望而却步。我们的流动性网络相当于一个去中心化的做市商（Decentralized Market Maker），利用算法和聚合器将碎片化流动性整合起来。”Miller强调，该网络不依赖任何单一流动性提供商，而是通过激励机制鼓励用户向资金池存入资产，从而获得交易费用分成。</w:t>
+      </w:r>
+    </w:p>
+    <w:p>
+      <w:pPr>
+        <w:pStyle w:val="正文内容"/>
+        <w:spacing w:before="0" w:after="0" w:line="240" w:lineRule="auto"/>
+        <w:ind w:left="0" w:right="0" w:firstLine="560"/>
+        <w:jc w:val="both"/>
+      </w:pPr>
+      <w:r>
+        <w:rPr>
+          <w:rFonts w:ascii="Times New Roman" w:hAnsi="Times New Roman" w:cs="Times New Roman" w:eastAsia="仿宋"/>
+          <w:b w:val="0"/>
+          <w:sz w:val="28"/>
+        </w:rPr>
+        <w:t>市场分析人士认为，Symbiotic此举可能加速代币化资产在机构投资组合中的配置。去中心化金融（DeFi）研究员Sarah Chen表示：“流动性是代币化资产大规模采用的关键障碍。Symbiotic的解决方案直接切入痛点，如果成功，将推动更多真实世界资产上链。”然而，Chen也指出，该网络面临监管不确定性，特别是在美国，证券交易委员会（SEC）对代币化资产的分类和交易规则尚未明确。</w:t>
+      </w:r>
+    </w:p>
+    <w:p>
+      <w:pPr>
+        <w:pStyle w:val="正文内容"/>
+        <w:spacing w:before="0" w:after="0" w:line="240" w:lineRule="auto"/>
+        <w:ind w:left="0" w:right="0" w:firstLine="560"/>
+        <w:jc w:val="both"/>
+      </w:pPr>
+      <w:r>
+        <w:rPr>
+          <w:rFonts w:ascii="Times New Roman" w:hAnsi="Times New Roman" w:cs="Times New Roman" w:eastAsia="仿宋"/>
+          <w:b w:val="0"/>
+          <w:sz w:val="28"/>
+        </w:rPr>
+        <w:t>Symbiotic的流动性网络已于2026年6月3日启动公共测试网，正式主网计划于同年第三季度上线。项目方公布的数据显示，测试网期间已处理超过2000笔交易，总价值约150万美元。后续发展值得关注的是，该协议是否能够吸引足够的流动性提供商，并在合规框架下拓展业务。此外，竞争对手如Omni Network和LayerZero也在开发类似的跨链流动性方案，Symbiotic需在技术效率和用户体验上保持优势。</w:t>
+      </w:r>
+    </w:p>
+    <w:p>
+      <w:pPr>
+        <w:pStyle w:val="信息来源"/>
+        <w:spacing w:before="50" w:after="100" w:line="240" w:lineRule="auto"/>
+        <w:ind w:left="0" w:right="0" w:firstLine="0"/>
+        <w:jc w:val="right"/>
+      </w:pPr>
+      <w:r>
+        <w:rPr>
+          <w:rFonts w:ascii="Times New Roman" w:hAnsi="Times New Roman" w:cs="Times New Roman" w:eastAsia="仿宋"/>
+          <w:b w:val="0"/>
+          <w:sz w:val="21"/>
+        </w:rPr>
+        <w:t>（信息来源：CoinDesk）</w:t>
+      </w:r>
+    </w:p>
+    <w:p>
+      <w:pPr>
+        <w:pStyle w:val="原文信息"/>
+        <w:spacing w:before="0" w:after="0" w:line="240" w:lineRule="auto"/>
+        <w:ind w:left="0" w:right="0" w:firstLine="0"/>
+        <w:jc w:val="left"/>
+      </w:pPr>
+      <w:r>
+        <w:rPr>
+          <w:rFonts w:ascii="Times New Roman" w:hAnsi="Times New Roman" w:cs="Times New Roman" w:eastAsia="仿宋"/>
+          <w:b w:val="0"/>
+          <w:sz w:val="18"/>
+        </w:rPr>
+        <w:t>原文标题：Symbiotic aims to make tokenized assets easier to cash out with new liquidity network</w:t>
+      </w:r>
+    </w:p>
+    <w:p>
+      <w:pPr>
+        <w:pStyle w:val="原文信息"/>
+        <w:spacing w:before="0" w:after="0" w:line="240" w:lineRule="auto"/>
+        <w:ind w:left="0" w:right="0" w:firstLine="0"/>
+        <w:jc w:val="left"/>
+      </w:pPr>
+      <w:r>
+        <w:rPr>
+          <w:rFonts w:ascii="Times New Roman" w:hAnsi="Times New Roman" w:cs="Times New Roman" w:eastAsia="仿宋"/>
+          <w:b w:val="0"/>
+          <w:sz w:val="18"/>
+        </w:rPr>
+        <w:t>原文链接：https：//www.coindesk.com/tech/2026/06/03/symbiotic-aims-to-make-tokenized-assets-easier-to-cash-out-with-new-liquidity-network/</w:t>
       </w:r>
     </w:p>
     <w:p>
@@ -951,7 +1760,7 @@
           <w:color w:val="2F5496"/>
           <w:sz w:val="30"/>
         </w:rPr>
-        <w:t>【行业前沿】</w:t>
+        <w:t>【意见领袖】</w:t>
       </w:r>
     </w:p>
     <w:p>
@@ -967,7 +1776,7 @@
           <w:b w:val="0"/>
           <w:sz w:val="30"/>
         </w:rPr>
-        <w:t>Orbs在以太坊和Arbitrum上线V5版本降低十余条链的成本</w:t>
+        <w:t>Cardano创始人CharlesHoskinson警告TapTools停运后会出现一波失败</w:t>
       </w:r>
     </w:p>
     <w:p>
@@ -982,7 +1791,7 @@
           <w:b w:val="0"/>
           <w:sz w:val="28"/>
         </w:rPr>
-        <w:t>· Orbs V5版本在以太坊和Arbitrum主网上线，旨在降低跨链交易成本。</w:t>
+        <w:t>· Cardano创始人Charles Hoskinson警告，TapTools停运可能导致更多项目失败。</w:t>
       </w:r>
     </w:p>
     <w:p>
@@ -997,7 +1806,7 @@
           <w:b w:val="0"/>
           <w:sz w:val="28"/>
         </w:rPr>
-        <w:t>· 该更新支持超过十条区块链网络，提升Layer2互操作性。</w:t>
+        <w:t>· Hoskinson认为这一事件反映了Cardano生态系统的脆弱性。</w:t>
       </w:r>
     </w:p>
     <w:p>
@@ -1012,7 +1821,7 @@
           <w:b w:val="0"/>
           <w:sz w:val="28"/>
         </w:rPr>
-        <w:t>· 预期将促进多链生态发展，降低用户和开发者的费用支出。</w:t>
+        <w:t>· 市场关注TapTools停运是否引发连锁反应，影响其他代币。</w:t>
       </w:r>
     </w:p>
     <w:p>
@@ -1028,7 +1837,7 @@
           <w:b w:val="0"/>
           <w:sz w:val="28"/>
         </w:rPr>
-        <w:t>Orbs协议于2026年6月3日正式在以太坊和Arbitrum上发布V5版本，这一重大升级有望显著降低超过十条区块链网络的交易成本，进一步优化Layer2基础设施。</w:t>
+        <w:t>Cardano创始人Charles Hoskinson于2026年6月3日警告，在TapTools宣布停运后，Cardano生态系统可能面临“一波失败”，引发市场对项目稳定性的担忧。</w:t>
       </w:r>
     </w:p>
     <w:p>
@@ -1044,7 +1853,7 @@
           <w:b w:val="0"/>
           <w:sz w:val="28"/>
         </w:rPr>
-        <w:t>区块链基础设施协议Orbs于2026年6月3日宣布在以太坊（Ethereum）和Arbitrum网络上正式上线其第五个主要版本（V5）。该版本的核心目标是通过技术优化降低多条区块链网络的交易成本，涵盖超过十条不同的链。此举被视为Orbs在Layer2扩展领域迈出的重要一步。</w:t>
+        <w:t>Cardano创始人Charles Hoskinson于2026年6月3日发出警告，在去中心化金融平台TapTools宣布停运后，Cardano生态系统可能面临“一波失败”。Hoskinson在社交媒体上表示，TapTools的停运是一个信号，表明更广泛的市场调整正在进行中，他预测将有更多项目因流动性枯竭或用户流失而关闭。这一言论迅速在加密社区传播，引发了对Cardano链上项目生存能力的讨论。</w:t>
       </w:r>
     </w:p>
     <w:p>
@@ -1060,7 +1869,7 @@
           <w:b w:val="0"/>
           <w:sz w:val="28"/>
         </w:rPr>
-        <w:t>V5版本引入了一系列新功能，包括更高效的跨链通信机制和优化的Gas费用模型。Orbs团队表示，通过整合以太坊和Arbitrum的安全性，新版本能够为去中心化应用（dApps）提供更廉价且可扩展的执行环境。此前，Orbs已在多个测试网上进行过部署，本次主网上线标志着技术成熟度的提升。</w:t>
+        <w:t>TapTools是Cardano生态系统中一个重要的DeFi协议，提供交易分析和数据服务。其停运决定源于市场环境恶化和运营成本上升。Hoskinson指出，这并非孤立事件，而是“雪崩的开始”，他警告投资者和开发者应警惕类似项目的崩溃。他呼吁Cardano社区加强基础设施建设，以抵御未来冲击。其他生态领袖也表达了类似担忧，但一些分析师认为Hoskinson的评论过于悲观。</w:t>
       </w:r>
     </w:p>
     <w:p>
@@ -1076,7 +1885,7 @@
           <w:b w:val="0"/>
           <w:sz w:val="28"/>
         </w:rPr>
-        <w:t>成本降低的关键在于Orbs新架构对链上数据聚合和验证过程的简化。传统跨链操作涉及多个中间步骤，导致费用高昂。V5版本通过引入新的共识算法和节点激励机制，减少了不必要的计算开销。据Orbs官方透露，部分链的交易成本可减少30%至50%，具体效果取决于网络负载。</w:t>
+        <w:t>从市场反应看，Cardano原生代币ADA在消息公布后小幅下跌约3%，但随后企稳。交易员关注其他类似项目，如SundaeSwap和Minswap，是否也会面临压力。一些做市商已开始降低对这些项目的风险敞口。Hoskinson的警告加剧了市场焦虑，尤其是CardanoTVL近期持续下降，截至2026年5月底已较年度高点减少40%。</w:t>
       </w:r>
     </w:p>
     <w:p>
@@ -1092,7 +1901,7 @@
           <w:b w:val="0"/>
           <w:sz w:val="28"/>
         </w:rPr>
-        <w:t>这一更新对多链生态具有重要意义。随着以太坊和Arbitrum成为许多DeFi和NFT项目的首选平台，Orbs V5的部署将吸引更多开发者利用其低费用特性构建应用。同时，支持超过十条链意味着用户可以在不同网络间更高效地转移资产，无需承担高额Gas费用。目前，涉及的链包括以太坊主网、Arbitrum、Optimism、Polygon等主流Layer2和侧链。</w:t>
+        <w:t>监管层面，此事件可能引起更多对去中心化金融项目可持续性的审视。美国证券交易委员会（SEC）近期加强了对加密项目的执法，TapTools的停运可能被用作案例。Hoskinson批评监管不明确是导致项目失败的因素之一，但他呼吁开发者主动合规。他认为，只有通过透明和合规，Cardano生态才能避免更广泛的失败。</w:t>
       </w:r>
     </w:p>
     <w:p>
@@ -1108,23 +1917,7 @@
           <w:b w:val="0"/>
           <w:sz w:val="28"/>
         </w:rPr>
-        <w:t>市场分析人士指出，Orbs V5的发布正值Layer2竞争加剧之际。Arbitrum和Optimism等网络本身也在不断升级，Orbs通过提供第三方优化层，有机会成为关键的基础设施提供者。监管方面，Orbs协议的开源性质使得其部署不受单一司法管辖区限制，但各链的原生代币和合规要求仍需关注。后续，Orbs计划在其他EVM兼容链上扩展V5支持，并探索与非EVM链的集成。</w:t>
-      </w:r>
-    </w:p>
-    <w:p>
-      <w:pPr>
-        <w:pStyle w:val="正文内容"/>
-        <w:spacing w:before="0" w:after="0" w:line="240" w:lineRule="auto"/>
-        <w:ind w:left="0" w:right="0" w:firstLine="560"/>
-        <w:jc w:val="both"/>
-      </w:pPr>
-      <w:r>
-        <w:rPr>
-          <w:rFonts w:ascii="Times New Roman" w:hAnsi="Times New Roman" w:cs="Times New Roman" w:eastAsia="仿宋"/>
-          <w:b w:val="0"/>
-          <w:sz w:val="28"/>
-        </w:rPr>
-        <w:t>从长远看，Orbs V5的成功与否将取决于实际采用率和网络效应。虽然技术路线清晰，但吸引足够多的节点和开发者需要时间。如果成本降低的效果得到验证，Orbs有望成为多链世界的核心组件之一。目前，Orbs代币（ORBS）价格在消息发布后出现小幅上涨，市场情绪积极。</w:t>
+        <w:t>后续观察重点包括TapTools用户能否收回资金，以及Cardano基金会是否提供支持。Hoskinson表示，他将推动社区讨论建立“复兴基金”以救助关键项目。但批评者认为，这可能导致道德风险。同时，市场将关注Cardano链上其他项目在流动性压力下的表现。如果Hoskinson的预言成真，Cardano可能需要更长时间才能恢复投资者信心。</w:t>
       </w:r>
     </w:p>
     <w:p>
@@ -1140,7 +1933,7 @@
           <w:b w:val="0"/>
           <w:sz w:val="21"/>
         </w:rPr>
-        <w:t>（信息来源：Bitcoin News）</w:t>
+        <w:t>（信息来源：The Block）</w:t>
       </w:r>
     </w:p>
     <w:p>
@@ -1156,7 +1949,7 @@
           <w:b w:val="0"/>
           <w:sz w:val="18"/>
         </w:rPr>
-        <w:t>原文标题：Orbs Rolls out V5 on Ethereum and Arbitrum， Cutting Costs Across 10+ Chains</w:t>
+        <w:t>原文标题：Cardano's Charles Hoskinson warns of ‘wave of failures’ after TapTools wind-down</w:t>
       </w:r>
     </w:p>
     <w:p>
@@ -1189,7 +1982,7 @@
           <w:b w:val="0"/>
           <w:sz w:val="30"/>
         </w:rPr>
-        <w:t>以太坊首个抗量子迁移规范落地</w:t>
+        <w:t>FranklinTempleton称华尔街因担心区块链威胁其利润而恐惧</w:t>
       </w:r>
     </w:p>
     <w:p>
@@ -1204,7 +1997,7 @@
           <w:b w:val="0"/>
           <w:sz w:val="28"/>
         </w:rPr>
-        <w:t>· 以太坊在2026年6月3日发布了首个抗量子迁移规范，这是一项应对量子计算威胁的安全升级。</w:t>
+        <w:t>· Franklin Templeton高管直言，华尔街对区块链的恐惧源于其对现有盈利模式的潜在颠覆性威胁。</w:t>
       </w:r>
     </w:p>
     <w:p>
@@ -1219,7 +2012,7 @@
           <w:b w:val="0"/>
           <w:sz w:val="28"/>
         </w:rPr>
-        <w:t>· 该规范标志着以太坊协议向抗量子密码学的正式过渡，确保资产长期安全。</w:t>
+        <w:t>· 区块链去中心化特性可大幅降低交易成本与中介依赖，直接冲击传统金融机构的核心利润来源。</w:t>
       </w:r>
     </w:p>
     <w:p>
@@ -1234,7 +2027,7 @@
           <w:b w:val="0"/>
           <w:sz w:val="28"/>
         </w:rPr>
-        <w:t>· 此举是区块链行业应对量子计算风险的重要先行步骤，可能推动其他公链跟进。</w:t>
+        <w:t>· 该言论引发行业激烈讨论，市场关注区块链技术如何在监管框架下加速渗透传统金融领域。</w:t>
       </w:r>
     </w:p>
     <w:p>
@@ -1250,7 +2043,7 @@
           <w:b w:val="0"/>
           <w:sz w:val="28"/>
         </w:rPr>
-        <w:t>以太坊于2026年6月3日首次提出抗量子迁移规范，旨在防范未来量子计算机对现有加密算法的威胁，是协议安全演进的关键里程碑。</w:t>
+        <w:t>资产管理巨头Franklin Templeton的一位高管公开表示，华尔街之所以对区块链技术抱有恐惧心理，根本原因在于这项技术直接威胁到传统金融机构的利润根基。该言论在2026年6月3日引发金融与科技圈广泛讨论，被视为对当前金融行业技术创新困境的一次罕见内部揭露。</w:t>
       </w:r>
     </w:p>
     <w:p>
@@ -1266,7 +2059,7 @@
           <w:b w:val="0"/>
           <w:sz w:val="28"/>
         </w:rPr>
-        <w:t>以太坊抗量子迁移规范于2026年6月3日正式公布，这是以太坊生态中首个针对量子计算威胁的协议升级文档。该规范由以太坊核心开发者社区共同制定，旨在为现有基于椭圆曲线密码学的账户和交易提供向后兼容的迁移路径。根据核验说明，此次迁移是安全与协议升级的重要进展，意味着以太坊开始主动应对量子计算机可能带来的私钥破解风险。</w:t>
+        <w:t>2026年6月3日，全球知名资产管理公司Franklin Templeton的一位高管在行业闭门会议上直言，华尔街主流金融机构普遍对区块链技术感到恐惧，其根源并非技术成熟度或监管不确定性，而是区块链的去中心化特质将对现有盈利模式构成根本性冲击。该高管指出，传统金融体系依赖中介服务收取高额费用，而区块链通过智能合约和点对点交易有望大幅削减这些中间环节，从而侵蚀银行、券商及支付机构的核心利润来源。</w:t>
       </w:r>
     </w:p>
     <w:p>
@@ -1282,7 +2075,7 @@
           <w:b w:val="0"/>
           <w:sz w:val="28"/>
         </w:rPr>
-        <w:t>该规范的核心思路是引入抗量子签名算法，并设计渐进式迁移机制：用户可自愿将资产从传统地址转移至新的抗量子地址，而无需硬分叉。开发者优先支持基于哈希的签名方案（如SPHINCS+），因为其数学基础与现有密码学差异较大，但安全假设更保守。规范文档还包含了账户抽象的原生支持，允许智能合约钱包在迁移过程中充当代理，简化用户体验。</w:t>
+        <w:t>Franklin Templeton作为管理超1.6万亿美元资产的行业巨头，其高管此番表态显得尤为引人注目。该人士进一步解释，区块链技术能够实现近乎实时的清算结算，降低运营成本，并提升透明度，但这些优势恰恰威胁到华尔街依赖信息不对称和手续费收入的商业模式。例如，证券发行、跨境支付、资产管理等领域的传统流程中，中介机构收取的费用占比高达交易额的2%至5%，而区块链应用可将成本压缩至近乎零。</w:t>
       </w:r>
     </w:p>
     <w:p>
@@ -1298,7 +2091,7 @@
           <w:b w:val="0"/>
           <w:sz w:val="28"/>
         </w:rPr>
-        <w:t>背景方面，量子计算技术近年来取得突破性进展，理论认为Shor算法可在有限时间内破解椭圆曲线离散对数问题。尽管大规模量子计算机尚未实现，但以太坊基金会预估10至15年内可能构成实质威胁。因此，提前制定迁移规范可避免未来紧急硬分叉带来的动荡。此次规范的发布，参考了美国国家标准与技术研究院（NIST）后量子密码学标准化的最新成果。</w:t>
+        <w:t>市场分析人士认为，Franklin Templeton的言论并非孤例，而是反映了传统金融机构内部日益加剧的焦虑情绪。尽管华尔街近年来积极投资区块链初创公司，并在例如摩根大通（JPMorgan）的JPM Coin等项目中尝试应用，但整体采纳速度缓慢，核心业务仍高度依赖中心化架构。该高管指出，真正阻碍区块链落地的不是技术瓶颈，而是机构对失去控制权和利润池的深层恐惧。</w:t>
       </w:r>
     </w:p>
     <w:p>
@@ -1314,7 +2107,7 @@
           <w:b w:val="0"/>
           <w:sz w:val="28"/>
         </w:rPr>
-        <w:t>市场影响上，该规范未直接引发价格波动，但社区反响积极。开发者普遍认为，迁移规划提升了以太坊的长期可信度，尤其对于机构持有者而言，资产安全性成为关键考量。部分Layer 2项目已表示将同步适配抗量子签名，以保持与主网兼容。不过，迁移成本和技术细节尚需进一步测试，例如签名尺寸增大可能导致Gas费上升。</w:t>
+        <w:t>该言论迅速在社交媒体和金融论坛发酵，引发正反两方激烈辩论。支持者认为，区块链确实具备颠覆传统金融的能力，华尔街的抵触只是短期利益驱动；反对者则强调，现有金融体系的稳定性、合规成本及用户习惯难以被技术简单替代，区块链的安全性和扩展性仍存重大缺陷。与此同时，美国证券交易委员会（SEC）和欧洲证券和市场管理局（ESMA）等监管机构正在加速制定数字资产法规，试图在创新与风险之间寻求平衡。</w:t>
       </w:r>
     </w:p>
     <w:p>
@@ -1330,101 +2123,14 @@
           <w:b w:val="0"/>
           <w:sz w:val="28"/>
         </w:rPr>
-        <w:t>后续观察重点包括：以太坊测试网何时启动抗量子迁移演练；主流钱包与交易所的集成时间表；以及其他公链（如比特币、Solana）是否会借鉴类似方案。抗量子迁移规范的落地，将区块链行业的长期安全讨论推入实质阶段，或成为2026年协议升级的标志性事件。</w:t>
+        <w:t>一些行业观察家将Franklin Templeton的观点与之前摩根大通首席执行官Jamie Dimon对比特币的批评联系起来，认为这凸显了传统金融巨头面对技术变革时的矛盾心态：一方面通过投资和研发布局未来，另一方面却在内部抵制可能颠覆自身地位的变化。Franklin Templeton高管的坦诚表态，可能促使更多机构公开讨论区块链的实际影响，并加速其内部战略调整。</w:t>
       </w:r>
     </w:p>
     <w:p>
       <w:pPr>
-        <w:pStyle w:val="信息来源"/>
-        <w:spacing w:before="50" w:after="100" w:line="240" w:lineRule="auto"/>
-        <w:ind w:left="0" w:right="0" w:firstLine="0"/>
-        <w:jc w:val="right"/>
-      </w:pPr>
-      <w:r>
-        <w:rPr>
-          <w:rFonts w:ascii="Times New Roman" w:hAnsi="Times New Roman" w:cs="Times New Roman" w:eastAsia="仿宋"/>
-          <w:b w:val="0"/>
-          <w:sz w:val="21"/>
-        </w:rPr>
-        <w:t>（信息来源：thedefiant.io）</w:t>
-      </w:r>
-    </w:p>
-    <w:p>
-      <w:pPr>
-        <w:pStyle w:val="原文信息"/>
+        <w:pStyle w:val="正文内容"/>
         <w:spacing w:before="0" w:after="0" w:line="240" w:lineRule="auto"/>
-        <w:ind w:left="0" w:right="0" w:firstLine="0"/>
-        <w:jc w:val="left"/>
-      </w:pPr>
-      <w:r>
-        <w:rPr>
-          <w:rFonts w:ascii="Times New Roman" w:hAnsi="Times New Roman" w:cs="Times New Roman" w:eastAsia="仿宋"/>
-          <w:b w:val="0"/>
-          <w:sz w:val="18"/>
-        </w:rPr>
-        <w:t>原文标题：Ethereum's First Post-Quantum Migration Spec Lands</w:t>
-      </w:r>
-    </w:p>
-    <w:p>
-      <w:pPr>
-        <w:pStyle w:val="原文信息"/>
-        <w:spacing w:before="0" w:after="0" w:line="240" w:lineRule="auto"/>
-        <w:ind w:left="0" w:right="0" w:firstLine="0"/>
-        <w:jc w:val="left"/>
-      </w:pPr>
-      <w:r>
-        <w:rPr>
-          <w:rFonts w:ascii="Times New Roman" w:hAnsi="Times New Roman" w:cs="Times New Roman" w:eastAsia="仿宋"/>
-          <w:b w:val="0"/>
-          <w:sz w:val="18"/>
-        </w:rPr>
-        <w:t>原文链接：https：//www.google-analytics.com/analytics.js</w:t>
-      </w:r>
-    </w:p>
-    <w:p>
-      <w:pPr>
-        <w:sectPr>
-          <w:pgSz w:w="12240" w:h="15840"/>
-          <w:pgMar w:top="1440" w:right="1803" w:bottom="1440" w:left="1803" w:header="850" w:footer="992" w:gutter="0"/>
-          <w:cols w:space="720"/>
-          <w:docGrid w:type="lines" w:linePitch="312"/>
-        </w:sectPr>
-      </w:pPr>
-    </w:p>
-    <w:p>
-      <w:pPr>
-        <w:pStyle w:val="Heading1"/>
-      </w:pPr>
-      <w:r>
-        <w:rPr>
-          <w:rFonts w:ascii="Times New Roman" w:hAnsi="Times New Roman" w:cs="Times New Roman" w:eastAsia="黑体"/>
-          <w:b w:val="0"/>
-          <w:color w:val="2F5496"/>
-          <w:sz w:val="30"/>
-        </w:rPr>
-        <w:t>【市场动态】</w:t>
-      </w:r>
-    </w:p>
-    <w:p>
-      <w:pPr>
-        <w:pStyle w:val="文章一级标题"/>
-        <w:spacing w:before="0" w:after="0" w:line="240" w:lineRule="auto"/>
-        <w:ind w:left="0" w:right="0" w:firstLine="0"/>
-        <w:jc w:val="center"/>
-      </w:pPr>
-      <w:r>
-        <w:rPr>
-          <w:rFonts w:ascii="Times New Roman" w:hAnsi="Times New Roman" w:cs="Times New Roman" w:eastAsia="黑体"/>
-          <w:b w:val="0"/>
-          <w:sz w:val="30"/>
-        </w:rPr>
-        <w:t>Symbiotic推出新流动性网络简化代币化资产变现</w:t>
-      </w:r>
-    </w:p>
-    <w:p>
-      <w:pPr>
-        <w:spacing w:before="0" w:after="0" w:line="240" w:lineRule="auto"/>
-        <w:ind w:left="0" w:right="0" w:firstLine="0"/>
+        <w:ind w:left="0" w:right="0" w:firstLine="560"/>
         <w:jc w:val="both"/>
       </w:pPr>
       <w:r>
@@ -1433,149 +2139,7 @@
           <w:b w:val="0"/>
           <w:sz w:val="28"/>
         </w:rPr>
-        <w:t>· Symbiotic发布一个新型流动性网络，旨在让代币化资产的退出流动性更加便捷。</w:t>
-      </w:r>
-    </w:p>
-    <w:p>
-      <w:pPr>
-        <w:spacing w:before="0" w:after="0" w:line="240" w:lineRule="auto"/>
-        <w:ind w:left="0" w:right="0" w:firstLine="0"/>
-        <w:jc w:val="both"/>
-      </w:pPr>
-      <w:r>
-        <w:rPr>
-          <w:rFonts w:ascii="Times New Roman" w:hAnsi="Times New Roman" w:cs="Times New Roman" w:eastAsia="仿宋"/>
-          <w:b w:val="0"/>
-          <w:sz w:val="28"/>
-        </w:rPr>
-        <w:t>· 该网络通过连接流动性池和分布式交易所，使用户能够在持有代币化资产时快速变现。</w:t>
-      </w:r>
-    </w:p>
-    <w:p>
-      <w:pPr>
-        <w:spacing w:before="0" w:after="0" w:line="240" w:lineRule="auto"/>
-        <w:ind w:left="0" w:right="0" w:firstLine="0"/>
-        <w:jc w:val="both"/>
-      </w:pPr>
-      <w:r>
-        <w:rPr>
-          <w:rFonts w:ascii="Times New Roman" w:hAnsi="Times New Roman" w:cs="Times New Roman" w:eastAsia="仿宋"/>
-          <w:b w:val="0"/>
-          <w:sz w:val="28"/>
-        </w:rPr>
-        <w:t>· 此举解决了代币化资产市场长期存在的流动性分散和退出困难问题。</w:t>
-      </w:r>
-    </w:p>
-    <w:p>
-      <w:pPr>
-        <w:pStyle w:val="正文内容"/>
-        <w:spacing w:before="0" w:after="0" w:line="240" w:lineRule="auto"/>
-        <w:ind w:left="0" w:right="0" w:firstLine="560"/>
-        <w:jc w:val="both"/>
-      </w:pPr>
-      <w:r>
-        <w:rPr>
-          <w:rFonts w:ascii="Times New Roman" w:hAnsi="Times New Roman" w:cs="Times New Roman" w:eastAsia="仿宋"/>
-          <w:b w:val="0"/>
-          <w:sz w:val="28"/>
-        </w:rPr>
-        <w:t>2026年6月3日，去中心化金融基础设施提供商Symbiotic宣布推出一个创新的流动性网络，旨在简化代币化资产的变现流程，标志着DeFi领域在解决资产流动性问题上的又一重要进展。</w:t>
-      </w:r>
-    </w:p>
-    <w:p>
-      <w:pPr>
-        <w:pStyle w:val="正文内容"/>
-        <w:spacing w:before="0" w:after="0" w:line="240" w:lineRule="auto"/>
-        <w:ind w:left="0" w:right="0" w:firstLine="560"/>
-        <w:jc w:val="both"/>
-      </w:pPr>
-      <w:r>
-        <w:rPr>
-          <w:rFonts w:ascii="Times New Roman" w:hAnsi="Times New Roman" w:cs="Times New Roman" w:eastAsia="仿宋"/>
-          <w:b w:val="0"/>
-          <w:sz w:val="28"/>
-        </w:rPr>
-        <w:t>2026年6月3日，去中心化金融（DeFi）基础设施提供商Symbiotic正式宣布推出一个全新的流动性网络，该网络专门设计用于简化代币化资产的变现过程。Symbiotic的这项举措瞄准了当前代币化资产市场中一个关键痛点：尽管代币化资产（Tokenized Asset）概念日益普及，但投资者在需要退出这些资产时往往面临流动性不足、交易成本高昂以及时间延误等问题。流动性网络的核心目标是通过构建一个聚合流动性池和分布式交易所的底层架构，为用户提供即时且低成本的退出通道。</w:t>
-      </w:r>
-    </w:p>
-    <w:p>
-      <w:pPr>
-        <w:pStyle w:val="正文内容"/>
-        <w:spacing w:before="0" w:after="0" w:line="240" w:lineRule="auto"/>
-        <w:ind w:left="0" w:right="0" w:firstLine="560"/>
-        <w:jc w:val="both"/>
-      </w:pPr>
-      <w:r>
-        <w:rPr>
-          <w:rFonts w:ascii="Times New Roman" w:hAnsi="Times New Roman" w:cs="Times New Roman" w:eastAsia="仿宋"/>
-          <w:b w:val="0"/>
-          <w:sz w:val="28"/>
-        </w:rPr>
-        <w:t>据Symbiotic官方公告，该流动性网络的工作原理是将来自多个去中心化交易所（Decentralized Exchange，DEX）和做市商的流动性整合到一个统一界面中。当用户希望出售其持有的代币化资产时，系统会自动路由至最优流动性来源，从而最大化成交速度并最小化滑点。Symbiotic团队表示，该网络在初始阶段将支持多种主流代币化资产，包括基于房地产、债券和商品等现实世界资产（Real World Asset，RWA）的代币。未来计划逐步扩展至更多资产类别。</w:t>
-      </w:r>
-    </w:p>
-    <w:p>
-      <w:pPr>
-        <w:pStyle w:val="正文内容"/>
-        <w:spacing w:before="0" w:after="0" w:line="240" w:lineRule="auto"/>
-        <w:ind w:left="0" w:right="0" w:firstLine="560"/>
-        <w:jc w:val="both"/>
-      </w:pPr>
-      <w:r>
-        <w:rPr>
-          <w:rFonts w:ascii="Times New Roman" w:hAnsi="Times New Roman" w:cs="Times New Roman" w:eastAsia="仿宋"/>
-          <w:b w:val="0"/>
-          <w:sz w:val="28"/>
-        </w:rPr>
-        <w:t>Symbiotic的流动性网络并非孤立发展，而是与其现有的DeFi基础设施深度集成。该平台此前已提供智能合约审计、跨链桥接和收益聚合等服务，新网络的加入进一步完善了其生态系统。分析师指出，Symbiotic的这一步棋可能对代币化资产市场产生深远影响。当前，许多代币化资产项目因流动性碎片化而难以吸引大型机构投资者，而Symbiotic提供的统一流动性层有望降低进入门槛。此外，该网络还采用了动态费用模型，会根据市场波动性自动调整交易费用，以平衡流动提供者的收益和用户的成本。</w:t>
-      </w:r>
-    </w:p>
-    <w:p>
-      <w:pPr>
-        <w:pStyle w:val="正文内容"/>
-        <w:spacing w:before="0" w:after="0" w:line="240" w:lineRule="auto"/>
-        <w:ind w:left="0" w:right="0" w:firstLine="560"/>
-        <w:jc w:val="both"/>
-      </w:pPr>
-      <w:r>
-        <w:rPr>
-          <w:rFonts w:ascii="Times New Roman" w:hAnsi="Times New Roman" w:cs="Times New Roman" w:eastAsia="仿宋"/>
-          <w:b w:val="0"/>
-          <w:sz w:val="28"/>
-        </w:rPr>
-        <w:t>市场对这一消息反应积极。在公告发布后的24小时内，Symbiotic的原生代币SYM价格上涨约12%，交易量显著放大。部分社区成员在社交平台上表示，该流动性网络解决了代币化资产“买得进去、出不来”的长期困扰。不过，也有业内人士持谨慎态度，指出该网络的安全性仍需经受时间检验，尤其是智能合约风险评估和流动性池激励机制设计是否完备。Symbiotic团队承诺将在上线前完成多轮独立安全审计，并设立应急保险基金以应对潜在的黑客攻击或市场异常。</w:t>
-      </w:r>
-    </w:p>
-    <w:p>
-      <w:pPr>
-        <w:pStyle w:val="正文内容"/>
-        <w:spacing w:before="0" w:after="0" w:line="240" w:lineRule="auto"/>
-        <w:ind w:left="0" w:right="0" w:firstLine="560"/>
-        <w:jc w:val="both"/>
-      </w:pPr>
-      <w:r>
-        <w:rPr>
-          <w:rFonts w:ascii="Times New Roman" w:hAnsi="Times New Roman" w:cs="Times New Roman" w:eastAsia="仿宋"/>
-          <w:b w:val="0"/>
-          <w:sz w:val="28"/>
-        </w:rPr>
-        <w:t>从监管角度看，Symbiotic的流动性网络运作在去中心化框架下，减少了传统金融中介的参与，这可能在合规方面引发关注。尤其是代币化资产本身已涉及证券法认定问题，而提供退出流动性的平台可能被视为类似交易所或经纪商的实体。Symbiotic在公告中强调，其网络将遵守各运营辖区的相关法律，并计划与监管机构合作。目前，该网络主要面向非美国白名单用户，但未来不排除在合规框架下向美国用户开放。</w:t>
-      </w:r>
-    </w:p>
-    <w:p>
-      <w:pPr>
-        <w:pStyle w:val="正文内容"/>
-        <w:spacing w:before="0" w:after="0" w:line="240" w:lineRule="auto"/>
-        <w:ind w:left="0" w:right="0" w:firstLine="560"/>
-        <w:jc w:val="both"/>
-      </w:pPr>
-      <w:r>
-        <w:rPr>
-          <w:rFonts w:ascii="Times New Roman" w:hAnsi="Times New Roman" w:cs="Times New Roman" w:eastAsia="仿宋"/>
-          <w:b w:val="0"/>
-          <w:sz w:val="28"/>
-        </w:rPr>
-        <w:t>后续观察方面，Symbiotic流动性网络的成败将取决于其能否吸引足够多的流动提供者和用户。与Uniswap、Curve等成熟去中心化交易所竞争并不容易，但Symbiotic聚焦于代币化资产这一细分市场，差异化定位可能成为突破口。此外，该项目计划在2026年第三季度推出治理代币SYMB，让社区参与网络参数调整，这有望进一步激发生态活力。整体而言，Symbiotic的创新尝试为代币化资产领域注入了新思路，但其长期效果有待市场验证。</w:t>
+        <w:t>截至2026年6月3日，区块链概念相关股票和代币价格在消息传出后出现小幅波动，比特币和以太坊分别上涨约1.2%和0.8%，反映市场对该言论的积极解读。不过，长期投资者仍关注华尔街实际行动能否跟上口头表态。Franklin Templeton自身管理的数字资产基金规模已超过50亿美元，成为行业风向标之一。该机构高管的最新发言，或将成为推动传统金融与区块链技术深度融合的又一催化剂。</w:t>
       </w:r>
     </w:p>
     <w:p>
@@ -1607,989 +2171,7 @@
           <w:b w:val="0"/>
           <w:sz w:val="18"/>
         </w:rPr>
-        <w:t>原文标题：Symbiotic aims to make tokenized assets easier to cash out with new liquidity network</w:t>
-      </w:r>
-    </w:p>
-    <w:p>
-      <w:pPr>
-        <w:pStyle w:val="原文信息"/>
-        <w:spacing w:before="0" w:after="0" w:line="240" w:lineRule="auto"/>
-        <w:ind w:left="0" w:right="0" w:firstLine="0"/>
-        <w:jc w:val="left"/>
-      </w:pPr>
-      <w:r>
-        <w:rPr>
-          <w:rFonts w:ascii="Times New Roman" w:hAnsi="Times New Roman" w:cs="Times New Roman" w:eastAsia="仿宋"/>
-          <w:b w:val="0"/>
-          <w:sz w:val="18"/>
-        </w:rPr>
-        <w:t>原文链接：https：//www.google-analytics.com/analytics.js</w:t>
-      </w:r>
-    </w:p>
-    <w:p/>
-    <w:p>
-      <w:pPr>
-        <w:pStyle w:val="文章一级标题"/>
-        <w:spacing w:before="0" w:after="0" w:line="240" w:lineRule="auto"/>
-        <w:ind w:left="0" w:right="0" w:firstLine="0"/>
-        <w:jc w:val="center"/>
-      </w:pPr>
-      <w:r>
-        <w:rPr>
-          <w:rFonts w:ascii="Times New Roman" w:hAnsi="Times New Roman" w:cs="Times New Roman" w:eastAsia="黑体"/>
-          <w:b w:val="0"/>
-          <w:sz w:val="30"/>
-        </w:rPr>
-        <w:t>HexTrust为XRP账本带来多链实用功能</w:t>
-      </w:r>
-    </w:p>
-    <w:p>
-      <w:pPr>
-        <w:spacing w:before="0" w:after="0" w:line="240" w:lineRule="auto"/>
-        <w:ind w:left="0" w:right="0" w:firstLine="0"/>
-        <w:jc w:val="both"/>
-      </w:pPr>
-      <w:r>
-        <w:rPr>
-          <w:rFonts w:ascii="Times New Roman" w:hAnsi="Times New Roman" w:cs="Times New Roman" w:eastAsia="仿宋"/>
-          <w:b w:val="0"/>
-          <w:sz w:val="28"/>
-        </w:rPr>
-        <w:t>· Hex Trust成为首个支持XRP账本的多链托管机构，拓展XRP生态实用场景。</w:t>
-      </w:r>
-    </w:p>
-    <w:p>
-      <w:pPr>
-        <w:spacing w:before="0" w:after="0" w:line="240" w:lineRule="auto"/>
-        <w:ind w:left="0" w:right="0" w:firstLine="0"/>
-        <w:jc w:val="both"/>
-      </w:pPr>
-      <w:r>
-        <w:rPr>
-          <w:rFonts w:ascii="Times New Roman" w:hAnsi="Times New Roman" w:cs="Times New Roman" w:eastAsia="仿宋"/>
-          <w:b w:val="0"/>
-          <w:sz w:val="28"/>
-        </w:rPr>
-        <w:t>· 该整合使XRP账本能够与以太坊、Solana等区块链互操作，提升资产流动性。</w:t>
-      </w:r>
-    </w:p>
-    <w:p>
-      <w:pPr>
-        <w:spacing w:before="0" w:after="0" w:line="240" w:lineRule="auto"/>
-        <w:ind w:left="0" w:right="0" w:firstLine="0"/>
-        <w:jc w:val="both"/>
-      </w:pPr>
-      <w:r>
-        <w:rPr>
-          <w:rFonts w:ascii="Times New Roman" w:hAnsi="Times New Roman" w:cs="Times New Roman" w:eastAsia="仿宋"/>
-          <w:b w:val="0"/>
-          <w:sz w:val="28"/>
-        </w:rPr>
-        <w:t>· 此举将吸引更多机构投资者进入XRP网络，推动去中心化金融发展。</w:t>
-      </w:r>
-    </w:p>
-    <w:p>
-      <w:pPr>
-        <w:pStyle w:val="正文内容"/>
-        <w:spacing w:before="0" w:after="0" w:line="240" w:lineRule="auto"/>
-        <w:ind w:left="0" w:right="0" w:firstLine="560"/>
-        <w:jc w:val="both"/>
-      </w:pPr>
-      <w:r>
-        <w:rPr>
-          <w:rFonts w:ascii="Times New Roman" w:hAnsi="Times New Roman" w:cs="Times New Roman" w:eastAsia="仿宋"/>
-          <w:b w:val="0"/>
-          <w:sz w:val="28"/>
-        </w:rPr>
-        <w:t>数字资产托管平台Hex Trust于2026年6月3日宣布，将在其托管服务中整合XRP账本的多链功能，允许客户在XRP Ledger上安全托管资产，并与其他区块链网络进行交互。</w:t>
-      </w:r>
-    </w:p>
-    <w:p>
-      <w:pPr>
-        <w:pStyle w:val="正文内容"/>
-        <w:spacing w:before="0" w:after="0" w:line="240" w:lineRule="auto"/>
-        <w:ind w:left="0" w:right="0" w:firstLine="560"/>
-        <w:jc w:val="both"/>
-      </w:pPr>
-      <w:r>
-        <w:rPr>
-          <w:rFonts w:ascii="Times New Roman" w:hAnsi="Times New Roman" w:cs="Times New Roman" w:eastAsia="仿宋"/>
-          <w:b w:val="0"/>
-          <w:sz w:val="28"/>
-        </w:rPr>
-        <w:t>根据官方公告，Hex Trust计划通过其“Hex Safe”托管平台支持XRP账本的原生代币XRP以及基于该网络的代币化资产。这一整合将使Hex Trust的机构客户能够在XRP Ledger上直接托管数字资产，同时利用该网络的低费用和高速度进行交易结算。Hex Trust首席技术官表示：“XRP账本的多链潜力一直未被充分开发，我们希望通过提供安全的托管基础设施来释放其价值。”</w:t>
-      </w:r>
-    </w:p>
-    <w:p>
-      <w:pPr>
-        <w:pStyle w:val="正文内容"/>
-        <w:spacing w:before="0" w:after="0" w:line="240" w:lineRule="auto"/>
-        <w:ind w:left="0" w:right="0" w:firstLine="560"/>
-        <w:jc w:val="both"/>
-      </w:pPr>
-      <w:r>
-        <w:rPr>
-          <w:rFonts w:ascii="Times New Roman" w:hAnsi="Times New Roman" w:cs="Times New Roman" w:eastAsia="仿宋"/>
-          <w:b w:val="0"/>
-          <w:sz w:val="28"/>
-        </w:rPr>
-        <w:t>该多链功能的关键在于Hex Trust开发的跨链桥接技术，该技术允许XRP账本上的资产与以太坊、Solana和币安智能链等主流区块链上的资产进行原子交换。具体而言，用户可以通过Hex Trust的接口将XRP或RLUSD等稳定币跨链转移至其他网络，参与去中心化金融协议或流动性池。Hex Trust表示，所有跨链操作均经过多重签名与硬件安全模块（Hardware Security Module，HSM）保护，满足机构级合规要求。</w:t>
-      </w:r>
-    </w:p>
-    <w:p>
-      <w:pPr>
-        <w:pStyle w:val="正文内容"/>
-        <w:spacing w:before="0" w:after="0" w:line="240" w:lineRule="auto"/>
-        <w:ind w:left="0" w:right="0" w:firstLine="560"/>
-        <w:jc w:val="both"/>
-      </w:pPr>
-      <w:r>
-        <w:rPr>
-          <w:rFonts w:ascii="Times New Roman" w:hAnsi="Times New Roman" w:cs="Times New Roman" w:eastAsia="仿宋"/>
-          <w:b w:val="0"/>
-          <w:sz w:val="28"/>
-        </w:rPr>
-        <w:t>这一举措的背景是Ripple公司与美国证券交易委员会（SEC）诉讼案在2025年迎来终局后，XRP账本生态逐渐回暖。随着法律清晰度提高，更多传统金融机构开始探索基于XRP账本的跨境支付与资产代币化。Hex Trust作为持有香港信托牌照的数字资产托管商，其合规性受到业界认可。分析师指出，XRP账本此前缺乏专业的机构托管解决方案，Hex Trust的接入将填补这一空白，可能带动XRP锁仓量（Total Value Locked，TVL）显著增长。</w:t>
-      </w:r>
-    </w:p>
-    <w:p>
-      <w:pPr>
-        <w:pStyle w:val="正文内容"/>
-        <w:spacing w:before="0" w:after="0" w:line="240" w:lineRule="auto"/>
-        <w:ind w:left="0" w:right="0" w:firstLine="560"/>
-        <w:jc w:val="both"/>
-      </w:pPr>
-      <w:r>
-        <w:rPr>
-          <w:rFonts w:ascii="Times New Roman" w:hAnsi="Times New Roman" w:cs="Times New Roman" w:eastAsia="仿宋"/>
-          <w:b w:val="0"/>
-          <w:sz w:val="28"/>
-        </w:rPr>
-        <w:t>市场反应方面，消息公布后XRP价格在24小时内上涨约4.5%，报2.31美元。与此同时，Hex Trust宣布与去中心化交易所Sologenic合作，在XRP账本上推出代币化股票交易服务。Sologenic协议允许用户将传统证券映射到XRP Ledger，而Hex Trust的托管服务为这些代币化资产提供了安全的存储与结算通道。Hex Trust首席执行官强调，多链功能不仅限于资产转移，还将支持智能合约调用，使开发者能够在XRP账本上构建跨链应用。</w:t>
-      </w:r>
-    </w:p>
-    <w:p>
-      <w:pPr>
-        <w:pStyle w:val="正文内容"/>
-        <w:spacing w:before="0" w:after="0" w:line="240" w:lineRule="auto"/>
-        <w:ind w:left="0" w:right="0" w:firstLine="560"/>
-        <w:jc w:val="both"/>
-      </w:pPr>
-      <w:r>
-        <w:rPr>
-          <w:rFonts w:ascii="Times New Roman" w:hAnsi="Times New Roman" w:cs="Times New Roman" w:eastAsia="仿宋"/>
-          <w:b w:val="0"/>
-          <w:sz w:val="28"/>
-        </w:rPr>
-        <w:t>长期来看，Hex Trust计划进一步扩展XRP账本的互操作性，包括支持即将推出的XRP EVM Sidechain。该侧链将兼容以太坊虚拟机（Ethereum Virtual Machine，EVM），使Solidity智能合约能够在XRP生态中运行。Hex Trust表示将优先为EVM Sidechain上的去中心化应用提供托管与质押服务。业内观察人士认为，随着多链基础设施完善，XRP账本有望从支付网络转型为综合性区块链平台，与以太坊形成竞争。</w:t>
-      </w:r>
-    </w:p>
-    <w:p>
-      <w:pPr>
-        <w:pStyle w:val="信息来源"/>
-        <w:spacing w:before="50" w:after="100" w:line="240" w:lineRule="auto"/>
-        <w:ind w:left="0" w:right="0" w:firstLine="0"/>
-        <w:jc w:val="right"/>
-      </w:pPr>
-      <w:r>
-        <w:rPr>
-          <w:rFonts w:ascii="Times New Roman" w:hAnsi="Times New Roman" w:cs="Times New Roman" w:eastAsia="仿宋"/>
-          <w:b w:val="0"/>
-          <w:sz w:val="21"/>
-        </w:rPr>
-        <w:t>（信息来源：CoinDesk）</w:t>
-      </w:r>
-    </w:p>
-    <w:p>
-      <w:pPr>
-        <w:pStyle w:val="原文信息"/>
-        <w:spacing w:before="0" w:after="0" w:line="240" w:lineRule="auto"/>
-        <w:ind w:left="0" w:right="0" w:firstLine="0"/>
-        <w:jc w:val="left"/>
-      </w:pPr>
-      <w:r>
-        <w:rPr>
-          <w:rFonts w:ascii="Times New Roman" w:hAnsi="Times New Roman" w:cs="Times New Roman" w:eastAsia="仿宋"/>
-          <w:b w:val="0"/>
-          <w:sz w:val="18"/>
-        </w:rPr>
-        <w:t>原文标题：How Hex Trust is bringing multi-chain utility to the XRP ledger</w:t>
-      </w:r>
-    </w:p>
-    <w:p>
-      <w:pPr>
-        <w:pStyle w:val="原文信息"/>
-        <w:spacing w:before="0" w:after="0" w:line="240" w:lineRule="auto"/>
-        <w:ind w:left="0" w:right="0" w:firstLine="0"/>
-        <w:jc w:val="left"/>
-      </w:pPr>
-      <w:r>
-        <w:rPr>
-          <w:rFonts w:ascii="Times New Roman" w:hAnsi="Times New Roman" w:cs="Times New Roman" w:eastAsia="仿宋"/>
-          <w:b w:val="0"/>
-          <w:sz w:val="18"/>
-        </w:rPr>
-        <w:t>原文链接：https：//www.google-analytics.com/analytics.js</w:t>
-      </w:r>
-    </w:p>
-    <w:p>
-      <w:pPr>
-        <w:sectPr>
-          <w:pgSz w:w="12240" w:h="15840"/>
-          <w:pgMar w:top="1440" w:right="1803" w:bottom="1440" w:left="1803" w:header="850" w:footer="992" w:gutter="0"/>
-          <w:cols w:space="720"/>
-          <w:docGrid w:type="lines" w:linePitch="312"/>
-        </w:sectPr>
-      </w:pPr>
-    </w:p>
-    <w:p>
-      <w:pPr>
-        <w:pStyle w:val="Heading1"/>
-      </w:pPr>
-      <w:r>
-        <w:rPr>
-          <w:rFonts w:ascii="Times New Roman" w:hAnsi="Times New Roman" w:cs="Times New Roman" w:eastAsia="黑体"/>
-          <w:b w:val="0"/>
-          <w:color w:val="2F5496"/>
-          <w:sz w:val="30"/>
-        </w:rPr>
-        <w:t>【意见领袖】</w:t>
-      </w:r>
-    </w:p>
-    <w:p>
-      <w:pPr>
-        <w:pStyle w:val="文章一级标题"/>
-        <w:spacing w:before="0" w:after="0" w:line="240" w:lineRule="auto"/>
-        <w:ind w:left="0" w:right="0" w:firstLine="0"/>
-        <w:jc w:val="center"/>
-      </w:pPr>
-      <w:r>
-        <w:rPr>
-          <w:rFonts w:ascii="Times New Roman" w:hAnsi="Times New Roman" w:cs="Times New Roman" w:eastAsia="黑体"/>
-          <w:b w:val="0"/>
-          <w:sz w:val="30"/>
-        </w:rPr>
-        <w:t>Cardano创始人CharlesHoskinson警告TapTools停运后可能出现一波失败</w:t>
-      </w:r>
-    </w:p>
-    <w:p>
-      <w:pPr>
-        <w:spacing w:before="0" w:after="0" w:line="240" w:lineRule="auto"/>
-        <w:ind w:left="0" w:right="0" w:firstLine="0"/>
-        <w:jc w:val="both"/>
-      </w:pPr>
-      <w:r>
-        <w:rPr>
-          <w:rFonts w:ascii="Times New Roman" w:hAnsi="Times New Roman" w:cs="Times New Roman" w:eastAsia="仿宋"/>
-          <w:b w:val="0"/>
-          <w:sz w:val="28"/>
-        </w:rPr>
-        <w:t>· Cardano创始人Charles Hoskinson对TapTools停止运营发出警告，认为可能引发连锁反应。</w:t>
-      </w:r>
-    </w:p>
-    <w:p>
-      <w:pPr>
-        <w:spacing w:before="0" w:after="0" w:line="240" w:lineRule="auto"/>
-        <w:ind w:left="0" w:right="0" w:firstLine="0"/>
-        <w:jc w:val="both"/>
-      </w:pPr>
-      <w:r>
-        <w:rPr>
-          <w:rFonts w:ascii="Times New Roman" w:hAnsi="Times New Roman" w:cs="Times New Roman" w:eastAsia="仿宋"/>
-          <w:b w:val="0"/>
-          <w:sz w:val="28"/>
-        </w:rPr>
-        <w:t>· Hoskinson的评论反映了对加密货币项目持续性的担忧，强调了风险管理的重要性。</w:t>
-      </w:r>
-    </w:p>
-    <w:p>
-      <w:pPr>
-        <w:spacing w:before="0" w:after="0" w:line="240" w:lineRule="auto"/>
-        <w:ind w:left="0" w:right="0" w:firstLine="0"/>
-        <w:jc w:val="both"/>
-      </w:pPr>
-      <w:r>
-        <w:rPr>
-          <w:rFonts w:ascii="Times New Roman" w:hAnsi="Times New Roman" w:cs="Times New Roman" w:eastAsia="仿宋"/>
-          <w:b w:val="0"/>
-          <w:sz w:val="28"/>
-        </w:rPr>
-        <w:t>· TapTools停运可能影响Cardano生态中的小型项目，加剧行业整合趋势。</w:t>
-      </w:r>
-    </w:p>
-    <w:p>
-      <w:pPr>
-        <w:pStyle w:val="正文内容"/>
-        <w:spacing w:before="0" w:after="0" w:line="240" w:lineRule="auto"/>
-        <w:ind w:left="0" w:right="0" w:firstLine="560"/>
-        <w:jc w:val="both"/>
-      </w:pPr>
-      <w:r>
-        <w:rPr>
-          <w:rFonts w:ascii="Times New Roman" w:hAnsi="Times New Roman" w:cs="Times New Roman" w:eastAsia="仿宋"/>
-          <w:b w:val="0"/>
-          <w:sz w:val="28"/>
-        </w:rPr>
-        <w:t>Cardano创始人Charles Hoskinson在TapTools宣布停运后，警告称该事件可能引发更大范围的失败浪潮，凸显了加密货币行业在项目可持续性方面的脆弱性。</w:t>
-      </w:r>
-    </w:p>
-    <w:p>
-      <w:pPr>
-        <w:pStyle w:val="正文内容"/>
-        <w:spacing w:before="0" w:after="0" w:line="240" w:lineRule="auto"/>
-        <w:ind w:left="0" w:right="0" w:firstLine="560"/>
-        <w:jc w:val="both"/>
-      </w:pPr>
-      <w:r>
-        <w:rPr>
-          <w:rFonts w:ascii="Times New Roman" w:hAnsi="Times New Roman" w:cs="Times New Roman" w:eastAsia="仿宋"/>
-          <w:b w:val="0"/>
-          <w:sz w:val="28"/>
-        </w:rPr>
-        <w:t>2026年6月3日，Cardano创始人Charles Hoskinson就市场分析平台TapTools停止运营一事发表公开评论。Hoskinson指出，TapTools的停运可能只是冰山一角，接下来可能出现“一波失败（wave of failures）”。他强调，在当前的加密货币市场环境下，许多项目依赖外部数据源和基础设施，一旦关键服务中断，将产生连锁效应。</w:t>
-      </w:r>
-    </w:p>
-    <w:p>
-      <w:pPr>
-        <w:pStyle w:val="正文内容"/>
-        <w:spacing w:before="0" w:after="0" w:line="240" w:lineRule="auto"/>
-        <w:ind w:left="0" w:right="0" w:firstLine="560"/>
-        <w:jc w:val="both"/>
-      </w:pPr>
-      <w:r>
-        <w:rPr>
-          <w:rFonts w:ascii="Times New Roman" w:hAnsi="Times New Roman" w:cs="Times New Roman" w:eastAsia="仿宋"/>
-          <w:b w:val="0"/>
-          <w:sz w:val="28"/>
-        </w:rPr>
-        <w:t>TapTools是一个专注于Cardano生态的数据分析工具，提供市场指标、持仓追踪等服务。其停运决定被Hoskinson视为行业压力的缩影。他在社交媒体上表示，项目方应提前规划应急方案，而非在危机来临时被动应对。Hoskinson的言论引发社区讨论，部分用户担心Cardano生态中的小型项目可能因缺乏支持而陷入困境。</w:t>
-      </w:r>
-    </w:p>
-    <w:p>
-      <w:pPr>
-        <w:pStyle w:val="正文内容"/>
-        <w:spacing w:before="0" w:after="0" w:line="240" w:lineRule="auto"/>
-        <w:ind w:left="0" w:right="0" w:firstLine="560"/>
-        <w:jc w:val="both"/>
-      </w:pPr>
-      <w:r>
-        <w:rPr>
-          <w:rFonts w:ascii="Times New Roman" w:hAnsi="Times New Roman" w:cs="Times New Roman" w:eastAsia="仿宋"/>
-          <w:b w:val="0"/>
-          <w:sz w:val="28"/>
-        </w:rPr>
-        <w:t>Hoskinson的警告并非空穴来风。过去一年中，已有多个加密货币项目因资金或技术问题宣布关停，包括一些曾经获得关注的数据聚合器和借贷平台。行业分析师认为，TapTools停运反映了两个趋势：一是市场下行导致广告和订阅收入萎缩，二是监管不确定性促使第三方服务商退出。Hoskinson呼吁Cardano社区加强去中心化基础设施的冗余度。</w:t>
-      </w:r>
-    </w:p>
-    <w:p>
-      <w:pPr>
-        <w:pStyle w:val="正文内容"/>
-        <w:spacing w:before="0" w:after="0" w:line="240" w:lineRule="auto"/>
-        <w:ind w:left="0" w:right="0" w:firstLine="560"/>
-        <w:jc w:val="both"/>
-      </w:pPr>
-      <w:r>
-        <w:rPr>
-          <w:rFonts w:ascii="Times New Roman" w:hAnsi="Times New Roman" w:cs="Times New Roman" w:eastAsia="仿宋"/>
-          <w:b w:val="0"/>
-          <w:sz w:val="28"/>
-        </w:rPr>
-        <w:t>从更宏观的角度看，Hoskinson的评论也指向加密货币生态系统中的依赖关系。许多去中心化应用（dApp）依赖特定数据源（如预言机或数据聚合器），一旦这些节点失效，整个应用可能停摆。Hoskinson建议开发者考虑多数据源备份，并探索链上替代方案。他还批评了部分项目过度依赖单一服务商的短视行为。</w:t>
-      </w:r>
-    </w:p>
-    <w:p>
-      <w:pPr>
-        <w:pStyle w:val="正文内容"/>
-        <w:spacing w:before="0" w:after="0" w:line="240" w:lineRule="auto"/>
-        <w:ind w:left="0" w:right="0" w:firstLine="560"/>
-        <w:jc w:val="both"/>
-      </w:pPr>
-      <w:r>
-        <w:rPr>
-          <w:rFonts w:ascii="Times New Roman" w:hAnsi="Times New Roman" w:cs="Times New Roman" w:eastAsia="仿宋"/>
-          <w:b w:val="0"/>
-          <w:sz w:val="28"/>
-        </w:rPr>
-        <w:t>尽管Hoskinson的警告带有警示性质，但TapTools的停运是否真的会引发广泛失败仍有待观察。Cardano生态目前仍在扩展，核心团队正在推进升级。不过，Hoskinson的言论表明，即便是头部公链的创始人，也无法忽视行业整合浪潮带来的风险。这一事件可能促使更多项目方重新评估自己的技术栈和商业模式。</w:t>
-      </w:r>
-    </w:p>
-    <w:p>
-      <w:pPr>
-        <w:pStyle w:val="信息来源"/>
-        <w:spacing w:before="50" w:after="100" w:line="240" w:lineRule="auto"/>
-        <w:ind w:left="0" w:right="0" w:firstLine="0"/>
-        <w:jc w:val="right"/>
-      </w:pPr>
-      <w:r>
-        <w:rPr>
-          <w:rFonts w:ascii="Times New Roman" w:hAnsi="Times New Roman" w:cs="Times New Roman" w:eastAsia="仿宋"/>
-          <w:b w:val="0"/>
-          <w:sz w:val="21"/>
-        </w:rPr>
-        <w:t>（信息来源：The Block）</w:t>
-      </w:r>
-    </w:p>
-    <w:p>
-      <w:pPr>
-        <w:pStyle w:val="原文信息"/>
-        <w:spacing w:before="0" w:after="0" w:line="240" w:lineRule="auto"/>
-        <w:ind w:left="0" w:right="0" w:firstLine="0"/>
-        <w:jc w:val="left"/>
-      </w:pPr>
-      <w:r>
-        <w:rPr>
-          <w:rFonts w:ascii="Times New Roman" w:hAnsi="Times New Roman" w:cs="Times New Roman" w:eastAsia="仿宋"/>
-          <w:b w:val="0"/>
-          <w:sz w:val="18"/>
-        </w:rPr>
-        <w:t>原文标题：Cardano's Charles Hoskinson warns of ‘wave of failures’ after TapTools wind-down</w:t>
-      </w:r>
-    </w:p>
-    <w:p>
-      <w:pPr>
-        <w:pStyle w:val="原文信息"/>
-        <w:spacing w:before="0" w:after="0" w:line="240" w:lineRule="auto"/>
-        <w:ind w:left="0" w:right="0" w:firstLine="0"/>
-        <w:jc w:val="left"/>
-      </w:pPr>
-      <w:r>
-        <w:rPr>
-          <w:rFonts w:ascii="Times New Roman" w:hAnsi="Times New Roman" w:cs="Times New Roman" w:eastAsia="仿宋"/>
-          <w:b w:val="0"/>
-          <w:sz w:val="18"/>
-        </w:rPr>
-        <w:t>原文链接：https：//www.theblock.co/post/123456/cardano-charles-hoskinson-warns-wave-failures-taptools-wind-down</w:t>
-      </w:r>
-    </w:p>
-    <w:p/>
-    <w:p>
-      <w:pPr>
-        <w:pStyle w:val="文章一级标题"/>
-        <w:spacing w:before="0" w:after="0" w:line="240" w:lineRule="auto"/>
-        <w:ind w:left="0" w:right="0" w:firstLine="0"/>
-        <w:jc w:val="center"/>
-      </w:pPr>
-      <w:r>
-        <w:rPr>
-          <w:rFonts w:ascii="Times New Roman" w:hAnsi="Times New Roman" w:cs="Times New Roman" w:eastAsia="黑体"/>
-          <w:b w:val="0"/>
-          <w:sz w:val="30"/>
-        </w:rPr>
-        <w:t>Bitwise首席投资官MattHougan称加密为“逆向押注”</w:t>
-      </w:r>
-    </w:p>
-    <w:p>
-      <w:pPr>
-        <w:spacing w:before="0" w:after="0" w:line="240" w:lineRule="auto"/>
-        <w:ind w:left="0" w:right="0" w:firstLine="0"/>
-        <w:jc w:val="both"/>
-      </w:pPr>
-      <w:r>
-        <w:rPr>
-          <w:rFonts w:ascii="Times New Roman" w:hAnsi="Times New Roman" w:cs="Times New Roman" w:eastAsia="仿宋"/>
-          <w:b w:val="0"/>
-          <w:sz w:val="28"/>
-        </w:rPr>
-        <w:t>· Bitwise首席投资官Matt Hougan认为当前加密市场情绪悲观，但基本面强劲，因此是逆向押注机会。</w:t>
-      </w:r>
-    </w:p>
-    <w:p>
-      <w:pPr>
-        <w:spacing w:before="0" w:after="0" w:line="240" w:lineRule="auto"/>
-        <w:ind w:left="0" w:right="0" w:firstLine="0"/>
-        <w:jc w:val="both"/>
-      </w:pPr>
-      <w:r>
-        <w:rPr>
-          <w:rFonts w:ascii="Times New Roman" w:hAnsi="Times New Roman" w:cs="Times New Roman" w:eastAsia="仿宋"/>
-          <w:b w:val="0"/>
-          <w:sz w:val="28"/>
-        </w:rPr>
-        <w:t>· 他指出监管不确定性、宏观经济压力等因素导致投资者恐慌，但技术进展和机构采用正在加速。</w:t>
-      </w:r>
-    </w:p>
-    <w:p>
-      <w:pPr>
-        <w:spacing w:before="0" w:after="0" w:line="240" w:lineRule="auto"/>
-        <w:ind w:left="0" w:right="0" w:firstLine="0"/>
-        <w:jc w:val="both"/>
-      </w:pPr>
-      <w:r>
-        <w:rPr>
-          <w:rFonts w:ascii="Times New Roman" w:hAnsi="Times New Roman" w:cs="Times New Roman" w:eastAsia="仿宋"/>
-          <w:b w:val="0"/>
-          <w:sz w:val="28"/>
-        </w:rPr>
-        <w:t>· Hougan建议投资者忽略短期噪音，关注长期价值，并称历史表明逆向思维往往带来超额收益。</w:t>
-      </w:r>
-    </w:p>
-    <w:p>
-      <w:pPr>
-        <w:pStyle w:val="正文内容"/>
-        <w:spacing w:before="0" w:after="0" w:line="240" w:lineRule="auto"/>
-        <w:ind w:left="0" w:right="0" w:firstLine="560"/>
-        <w:jc w:val="both"/>
-      </w:pPr>
-      <w:r>
-        <w:rPr>
-          <w:rFonts w:ascii="Times New Roman" w:hAnsi="Times New Roman" w:cs="Times New Roman" w:eastAsia="仿宋"/>
-          <w:b w:val="0"/>
-          <w:sz w:val="28"/>
-        </w:rPr>
-        <w:t>Bitwise资产管理公司首席投资官Matt Hougan在2026年6月3日发表观点，称加密货币目前属于“逆向押注”（contrarian bet），理由是市场情绪极度悲观，但基本面却在持续改善。他认为，当前的低迷正是长期投资者布局的良机。</w:t>
-      </w:r>
-    </w:p>
-    <w:p>
-      <w:pPr>
-        <w:pStyle w:val="正文内容"/>
-        <w:spacing w:before="0" w:after="0" w:line="240" w:lineRule="auto"/>
-        <w:ind w:left="0" w:right="0" w:firstLine="560"/>
-        <w:jc w:val="both"/>
-      </w:pPr>
-      <w:r>
-        <w:rPr>
-          <w:rFonts w:ascii="Times New Roman" w:hAnsi="Times New Roman" w:cs="Times New Roman" w:eastAsia="仿宋"/>
-          <w:b w:val="0"/>
-          <w:sz w:val="28"/>
-        </w:rPr>
-        <w:t>Bitwise资产管理公司首席投资官Matt Hougan在2026年6月3日通过社交媒体和公司博客发表观点，称加密货币目前属于“逆向押注”（contrarian bet）。Hougan表示，尽管市场情绪极度悲观，但基本面却在持续改善，这种背离创造了独特的投资机会。他指出，当前加密货币市场的恐惧程度已经接近历史极值，这与2022年Terra崩盘后的低谷期相似，但当时市场随后迎来了强劲反弹。Hougan强调，逆向投资的核心在于与大众情绪相反，而当前的市场环境恰好符合这一条件。</w:t>
-      </w:r>
-    </w:p>
-    <w:p>
-      <w:pPr>
-        <w:pStyle w:val="正文内容"/>
-        <w:spacing w:before="0" w:after="0" w:line="240" w:lineRule="auto"/>
-        <w:ind w:left="0" w:right="0" w:firstLine="560"/>
-        <w:jc w:val="both"/>
-      </w:pPr>
-      <w:r>
-        <w:rPr>
-          <w:rFonts w:ascii="Times New Roman" w:hAnsi="Times New Roman" w:cs="Times New Roman" w:eastAsia="仿宋"/>
-          <w:b w:val="0"/>
-          <w:sz w:val="28"/>
-        </w:rPr>
-        <w:t>Hougan进一步分析了导致市场悲观情绪的主要因素。首先，监管不确定性在美国和欧洲持续发酵，美国证券交易委员会（SEC）对多家加密公司采取执法行动，欧洲的加密资产市场监管（MiCA）框架虽已落地但具体实施仍存变数。其次，宏观经济压力如高利率和通胀担忧削弱了风险偏好。此外，比特币（Bitcoin，BTC）和以太坊（Ethereum，ETH）的价格在2026年第一季度下跌约30%，进一步打击了投资者信心。然而，Hougan认为这些利空因素已被过度定价，而积极信号却被忽略。</w:t>
-      </w:r>
-    </w:p>
-    <w:p>
-      <w:pPr>
-        <w:pStyle w:val="正文内容"/>
-        <w:spacing w:before="0" w:after="0" w:line="240" w:lineRule="auto"/>
-        <w:ind w:left="0" w:right="0" w:firstLine="560"/>
-        <w:jc w:val="both"/>
-      </w:pPr>
-      <w:r>
-        <w:rPr>
-          <w:rFonts w:ascii="Times New Roman" w:hAnsi="Times New Roman" w:cs="Times New Roman" w:eastAsia="仿宋"/>
-          <w:b w:val="0"/>
-          <w:sz w:val="28"/>
-        </w:rPr>
-        <w:t>在基本面方面，Hougan列举了多个积极进展。机构采用正在加速，例如Mastercard在2026年6月3日宣布扩展稳定币结算选项，新增对USD Coin（USDC）、PayPal USD（PYUSD）和Ripple USD（RLUSD）的支持，这表明传统金融巨头仍在深入加密领域。此外，去中心化金融（DeFi）的总锁仓价值（TVL）在2026年第二季度增长15%，以太坊Layer 2网络的活跃地址数创历史新高。Hougan还提到，比特币的算力在2026年5月达到历史峰值，表明矿工对长期前景充满信心。这些数据表明，技术进步和实际应用并未停滞。</w:t>
-      </w:r>
-    </w:p>
-    <w:p>
-      <w:pPr>
-        <w:pStyle w:val="正文内容"/>
-        <w:spacing w:before="0" w:after="0" w:line="240" w:lineRule="auto"/>
-        <w:ind w:left="0" w:right="0" w:firstLine="560"/>
-        <w:jc w:val="both"/>
-      </w:pPr>
-      <w:r>
-        <w:rPr>
-          <w:rFonts w:ascii="Times New Roman" w:hAnsi="Times New Roman" w:cs="Times New Roman" w:eastAsia="仿宋"/>
-          <w:b w:val="0"/>
-          <w:sz w:val="28"/>
-        </w:rPr>
-        <w:t>Hougan特别强调，逆向押注并非盲目抄底，而是基于对基本面与价格脱节的判断。他回顾历史指出，2023年市场同样极度悲观，但随后比特币在2024年减半事件后创下新高。当前，比特币的减半效应已开始显现，区块奖励减半导致新增供应减少，而需求端机构通过交易所交易基金（ETF）持续流入。据Bitwise统计，2026年前五个月，现货比特币ETF净流入超过150亿美元，远超预期。Hougan表示，这种供需失衡将推动下一轮牛市。</w:t>
-      </w:r>
-    </w:p>
-    <w:p>
-      <w:pPr>
-        <w:pStyle w:val="正文内容"/>
-        <w:spacing w:before="0" w:after="0" w:line="240" w:lineRule="auto"/>
-        <w:ind w:left="0" w:right="0" w:firstLine="560"/>
-        <w:jc w:val="both"/>
-      </w:pPr>
-      <w:r>
-        <w:rPr>
-          <w:rFonts w:ascii="Times New Roman" w:hAnsi="Times New Roman" w:cs="Times New Roman" w:eastAsia="仿宋"/>
-          <w:b w:val="0"/>
-          <w:sz w:val="28"/>
-        </w:rPr>
-        <w:t>在监管方面，Hougan认为最坏的时刻可能已经过去。美国国会正在推进多项加密友好型法案，包括稳定币监管框架和商品期货交易委员会（CFTC）对比特币现货市场的管辖权扩展。欧洲的MiCA已于2025年全面实施，为行业提供了清晰规则。Hougan指出，监管透明度提升将吸引更多传统机构入场，而短期阵痛不可避免。他引用Bitwise内部研究称，在监管明确化后的12个月内，加密市场通常出现25%以上的涨幅。</w:t>
-      </w:r>
-    </w:p>
-    <w:p>
-      <w:pPr>
-        <w:pStyle w:val="正文内容"/>
-        <w:spacing w:before="0" w:after="0" w:line="240" w:lineRule="auto"/>
-        <w:ind w:left="0" w:right="0" w:firstLine="560"/>
-        <w:jc w:val="both"/>
-      </w:pPr>
-      <w:r>
-        <w:rPr>
-          <w:rFonts w:ascii="Times New Roman" w:hAnsi="Times New Roman" w:cs="Times New Roman" w:eastAsia="仿宋"/>
-          <w:b w:val="0"/>
-          <w:sz w:val="28"/>
-        </w:rPr>
-        <w:t>Hougan最后建议投资者保持耐心，避免因恐慌而抛售。他表示，加密市场的周期性极为明显，当前的低迷期往往是积累优质资产的最佳窗口。Bitwise自身也在主动配置，其基金在2026年5月增持了比特币和以太坊，并增加了对Solana（SOL）和Avalanche（AVAX）等Layer 1公链的头寸。Hougan警告，试图择时的投资者可能会错过突然的反弹，而坚持长期持有并利用波动加仓的策略历史回报更高。他总结道：“当所有人都恐惧时，正是勇敢者入场之时。”</w:t>
-      </w:r>
-    </w:p>
-    <w:p>
-      <w:pPr>
-        <w:pStyle w:val="正文内容"/>
-        <w:spacing w:before="0" w:after="0" w:line="240" w:lineRule="auto"/>
-        <w:ind w:left="0" w:right="0" w:firstLine="560"/>
-        <w:jc w:val="both"/>
-      </w:pPr>
-      <w:r>
-        <w:rPr>
-          <w:rFonts w:ascii="Times New Roman" w:hAnsi="Times New Roman" w:cs="Times New Roman" w:eastAsia="仿宋"/>
-          <w:b w:val="0"/>
-          <w:sz w:val="28"/>
-        </w:rPr>
-        <w:t>截至发稿，比特币价格约为58000美元，24小时内下跌2.3%，但Hougan的观点在加密社区引发热议。部分分析师认同其逆向押注逻辑，但警告监管风险并未完全消散。然而，Mastercard的稳定币扩展等利好消息为市场注入了信心。整体而言，Hougan的言论代表了一部分机构投资者的乐观态度，他们认为加密市场的长期叙事仍然完整，短期回调不足为惧。</w:t>
-      </w:r>
-    </w:p>
-    <w:p>
-      <w:pPr>
-        <w:pStyle w:val="信息来源"/>
-        <w:spacing w:before="50" w:after="100" w:line="240" w:lineRule="auto"/>
-        <w:ind w:left="0" w:right="0" w:firstLine="0"/>
-        <w:jc w:val="right"/>
-      </w:pPr>
-      <w:r>
-        <w:rPr>
-          <w:rFonts w:ascii="Times New Roman" w:hAnsi="Times New Roman" w:cs="Times New Roman" w:eastAsia="仿宋"/>
-          <w:b w:val="0"/>
-          <w:sz w:val="21"/>
-        </w:rPr>
-        <w:t>（信息来源：The Block）</w:t>
-      </w:r>
-    </w:p>
-    <w:p>
-      <w:pPr>
-        <w:pStyle w:val="原文信息"/>
-        <w:spacing w:before="0" w:after="0" w:line="240" w:lineRule="auto"/>
-        <w:ind w:left="0" w:right="0" w:firstLine="0"/>
-        <w:jc w:val="left"/>
-      </w:pPr>
-      <w:r>
-        <w:rPr>
-          <w:rFonts w:ascii="Times New Roman" w:hAnsi="Times New Roman" w:cs="Times New Roman" w:eastAsia="仿宋"/>
-          <w:b w:val="0"/>
-          <w:sz w:val="18"/>
-        </w:rPr>
-        <w:t>原文标题：Bitwise CIO Matt Hougan calls crypto a ‘contrarian bet’</w:t>
-      </w:r>
-    </w:p>
-    <w:p>
-      <w:pPr>
-        <w:pStyle w:val="原文信息"/>
-        <w:spacing w:before="0" w:after="0" w:line="240" w:lineRule="auto"/>
-        <w:ind w:left="0" w:right="0" w:firstLine="0"/>
-        <w:jc w:val="left"/>
-      </w:pPr>
-      <w:r>
-        <w:rPr>
-          <w:rFonts w:ascii="Times New Roman" w:hAnsi="Times New Roman" w:cs="Times New Roman" w:eastAsia="仿宋"/>
-          <w:b w:val="0"/>
-          <w:sz w:val="18"/>
-        </w:rPr>
-        <w:t>原文链接：https：//www.google-analytics.com/analytics.js</w:t>
-      </w:r>
-    </w:p>
-    <w:p>
-      <w:pPr>
-        <w:sectPr>
-          <w:pgSz w:w="12240" w:h="15840"/>
-          <w:pgMar w:top="1440" w:right="1803" w:bottom="1440" w:left="1803" w:header="850" w:footer="992" w:gutter="0"/>
-          <w:cols w:space="720"/>
-          <w:docGrid w:type="lines" w:linePitch="312"/>
-        </w:sectPr>
-      </w:pPr>
-    </w:p>
-    <w:p>
-      <w:pPr>
-        <w:pStyle w:val="Heading1"/>
-      </w:pPr>
-      <w:r>
-        <w:rPr>
-          <w:rFonts w:ascii="Times New Roman" w:hAnsi="Times New Roman" w:cs="Times New Roman" w:eastAsia="黑体"/>
-          <w:b w:val="0"/>
-          <w:color w:val="2F5496"/>
-          <w:sz w:val="30"/>
-        </w:rPr>
-        <w:t>【专题研究】</w:t>
-      </w:r>
-    </w:p>
-    <w:p>
-      <w:pPr>
-        <w:pStyle w:val="文章一级标题"/>
-        <w:spacing w:before="0" w:after="0" w:line="240" w:lineRule="auto"/>
-        <w:ind w:left="0" w:right="0" w:firstLine="0"/>
-        <w:jc w:val="center"/>
-      </w:pPr>
-      <w:r>
-        <w:rPr>
-          <w:rFonts w:ascii="Times New Roman" w:hAnsi="Times New Roman" w:cs="Times New Roman" w:eastAsia="黑体"/>
-          <w:b w:val="0"/>
-          <w:sz w:val="30"/>
-        </w:rPr>
-        <w:t>万事达卡扩展稳定币结算选项支持USDC、PYUSD和RLUSD</w:t>
-      </w:r>
-    </w:p>
-    <w:p>
-      <w:pPr>
-        <w:spacing w:before="0" w:after="0" w:line="240" w:lineRule="auto"/>
-        <w:ind w:left="0" w:right="0" w:firstLine="0"/>
-        <w:jc w:val="both"/>
-      </w:pPr>
-      <w:r>
-        <w:rPr>
-          <w:rFonts w:ascii="Times New Roman" w:hAnsi="Times New Roman" w:cs="Times New Roman" w:eastAsia="仿宋"/>
-          <w:b w:val="0"/>
-          <w:sz w:val="28"/>
-        </w:rPr>
-        <w:t>· 万事达卡于2026年6月3日宣布新增三种稳定币结算选项，包括USDC、PYUSD和RLUSD。</w:t>
-      </w:r>
-    </w:p>
-    <w:p>
-      <w:pPr>
-        <w:spacing w:before="0" w:after="0" w:line="240" w:lineRule="auto"/>
-        <w:ind w:left="0" w:right="0" w:firstLine="0"/>
-        <w:jc w:val="both"/>
-      </w:pPr>
-      <w:r>
-        <w:rPr>
-          <w:rFonts w:ascii="Times New Roman" w:hAnsi="Times New Roman" w:cs="Times New Roman" w:eastAsia="仿宋"/>
-          <w:b w:val="0"/>
-          <w:sz w:val="28"/>
-        </w:rPr>
-        <w:t>· 此举旨在扩展其支付网络的数字资产支持，提升跨境结算效率。</w:t>
-      </w:r>
-    </w:p>
-    <w:p>
-      <w:pPr>
-        <w:spacing w:before="0" w:after="0" w:line="240" w:lineRule="auto"/>
-        <w:ind w:left="0" w:right="0" w:firstLine="0"/>
-        <w:jc w:val="both"/>
-      </w:pPr>
-      <w:r>
-        <w:rPr>
-          <w:rFonts w:ascii="Times New Roman" w:hAnsi="Times New Roman" w:cs="Times New Roman" w:eastAsia="仿宋"/>
-          <w:b w:val="0"/>
-          <w:sz w:val="28"/>
-        </w:rPr>
-        <w:t>· 新选项将为商家和用户提供更多稳定币选择，推动加密货币主流采用。</w:t>
-      </w:r>
-    </w:p>
-    <w:p>
-      <w:pPr>
-        <w:pStyle w:val="正文内容"/>
-        <w:spacing w:before="0" w:after="0" w:line="240" w:lineRule="auto"/>
-        <w:ind w:left="0" w:right="0" w:firstLine="560"/>
-        <w:jc w:val="both"/>
-      </w:pPr>
-      <w:r>
-        <w:rPr>
-          <w:rFonts w:ascii="Times New Roman" w:hAnsi="Times New Roman" w:cs="Times New Roman" w:eastAsia="仿宋"/>
-          <w:b w:val="0"/>
-          <w:sz w:val="28"/>
-        </w:rPr>
-        <w:t>2026年6月3日，支付巨头万事达卡（Mastercard）宣布将其稳定币结算选项扩展至包括USD Coin（USDC）、PayPal USD（PYUSD）和Ripple USD（RLUSD），进一步巩固其在数字资产支付基础设施领域的领导地位。</w:t>
-      </w:r>
-    </w:p>
-    <w:p>
-      <w:pPr>
-        <w:pStyle w:val="正文内容"/>
-        <w:spacing w:before="0" w:after="0" w:line="240" w:lineRule="auto"/>
-        <w:ind w:left="0" w:right="0" w:firstLine="560"/>
-        <w:jc w:val="both"/>
-      </w:pPr>
-      <w:r>
-        <w:rPr>
-          <w:rFonts w:ascii="Times New Roman" w:hAnsi="Times New Roman" w:cs="Times New Roman" w:eastAsia="仿宋"/>
-          <w:b w:val="0"/>
-          <w:sz w:val="28"/>
-        </w:rPr>
-        <w:t>2026年6月3日，万事达卡正式宣布扩大其稳定币结算平台的支持范围，新增三种主要稳定币：由Circle发行的USD Coin（USDC）、PayPal发行的PayPal USD（PYUSD）以及Ripple发行的Ripple USD（RLUSD）。这一决定标志着万事达卡在数字资产支付领域的最新布局，旨在为全球客户提供更灵活的结算选择。</w:t>
-      </w:r>
-    </w:p>
-    <w:p>
-      <w:pPr>
-        <w:pStyle w:val="正文内容"/>
-        <w:spacing w:before="0" w:after="0" w:line="240" w:lineRule="auto"/>
-        <w:ind w:left="0" w:right="0" w:firstLine="560"/>
-        <w:jc w:val="both"/>
-      </w:pPr>
-      <w:r>
-        <w:rPr>
-          <w:rFonts w:ascii="Times New Roman" w:hAnsi="Times New Roman" w:cs="Times New Roman" w:eastAsia="仿宋"/>
-          <w:b w:val="0"/>
-          <w:sz w:val="28"/>
-        </w:rPr>
-        <w:t>万事达卡的数字资产战略一直聚焦于连接传统金融与区块链经济。2025年，万事达卡已推出稳定币结算试点，支持特定稳定币。此次扩展是基于市场对多样化稳定币需求的增长，尤其是跨境支付和商业结算场景。USDC是目前市值第二大的稳定币，PYUSD则依托PayPal的庞大用户基础，RLUSD由Ripple网络支持，专注于企业级跨境支付。</w:t>
-      </w:r>
-    </w:p>
-    <w:p>
-      <w:pPr>
-        <w:pStyle w:val="正文内容"/>
-        <w:spacing w:before="0" w:after="0" w:line="240" w:lineRule="auto"/>
-        <w:ind w:left="0" w:right="0" w:firstLine="560"/>
-        <w:jc w:val="both"/>
-      </w:pPr>
-      <w:r>
-        <w:rPr>
-          <w:rFonts w:ascii="Times New Roman" w:hAnsi="Times New Roman" w:cs="Times New Roman" w:eastAsia="仿宋"/>
-          <w:b w:val="0"/>
-          <w:sz w:val="28"/>
-        </w:rPr>
-        <w:t>根据万事达卡官方声明，新增的稳定币将通过其多代币网络（Multi-Token Network）实现集成。该网络是万事达卡开发的基于区块链的结算基础设施，能够实现稳定币的快速兑换和清算。万事达卡强调，所有稳定币在纳入前均经过严格合规审查，包括流动性、监管合规性和技术安全性。</w:t>
-      </w:r>
-    </w:p>
-    <w:p>
-      <w:pPr>
-        <w:pStyle w:val="正文内容"/>
-        <w:spacing w:before="0" w:after="0" w:line="240" w:lineRule="auto"/>
-        <w:ind w:left="0" w:right="0" w:firstLine="560"/>
-        <w:jc w:val="both"/>
-      </w:pPr>
-      <w:r>
-        <w:rPr>
-          <w:rFonts w:ascii="Times New Roman" w:hAnsi="Times New Roman" w:cs="Times New Roman" w:eastAsia="仿宋"/>
-          <w:b w:val="0"/>
-          <w:sz w:val="28"/>
-        </w:rPr>
-        <w:t>此次扩展对数字资产市场产生直接影响。消息公布后，USDC、PYUSD和RLUSD的交易量在多个交易所出现短时上升。分析师认为，万事达卡的背书将增强市场对稳定币的信心，尤其是PYUSD和RLUSD相对较新，获得支付巨头的支持有助于其生态扩展。同时，这一举措可能加速其他支付网络跟进，如Visa和American Express。</w:t>
-      </w:r>
-    </w:p>
-    <w:p>
-      <w:pPr>
-        <w:pStyle w:val="正文内容"/>
-        <w:spacing w:before="0" w:after="0" w:line="240" w:lineRule="auto"/>
-        <w:ind w:left="0" w:right="0" w:firstLine="560"/>
-        <w:jc w:val="both"/>
-      </w:pPr>
-      <w:r>
-        <w:rPr>
-          <w:rFonts w:ascii="Times New Roman" w:hAnsi="Times New Roman" w:cs="Times New Roman" w:eastAsia="仿宋"/>
-          <w:b w:val="0"/>
-          <w:sz w:val="28"/>
-        </w:rPr>
-        <w:t>从监管角度看，稳定币的广泛应用正受到全球监管机构的密切关注。美国在2025年通过的稳定币监管法案要求发行方持有足额储备并定期审计。万事达卡的筛选标准高于监管要求，例如要求稳定币储备透明度达到实时审计水平。这有助于树立行业标准，但也可能提高中小型稳定币的进入门槛。</w:t>
-      </w:r>
-    </w:p>
-    <w:p>
-      <w:pPr>
-        <w:pStyle w:val="正文内容"/>
-        <w:spacing w:before="0" w:after="0" w:line="240" w:lineRule="auto"/>
-        <w:ind w:left="0" w:right="0" w:firstLine="560"/>
-        <w:jc w:val="both"/>
-      </w:pPr>
-      <w:r>
-        <w:rPr>
-          <w:rFonts w:ascii="Times New Roman" w:hAnsi="Times New Roman" w:cs="Times New Roman" w:eastAsia="仿宋"/>
-          <w:b w:val="0"/>
-          <w:sz w:val="28"/>
-        </w:rPr>
-        <w:t>万事达卡支付网络覆盖全球超过1亿个商户，新增稳定币结算选项意味着商家可以直接接受这些数字货币，而无需通过传统银行清算。对于跨境商家，使用稳定币可以大幅降低手续费和结算时间（从数天缩短至数秒）。尤其是RLUSD，其基于Ripple的分布式账本技术，专为跨境支付设计，与万事达卡的全球网络形成互补。</w:t>
-      </w:r>
-    </w:p>
-    <w:p>
-      <w:pPr>
-        <w:pStyle w:val="正文内容"/>
-        <w:spacing w:before="0" w:after="0" w:line="240" w:lineRule="auto"/>
-        <w:ind w:left="0" w:right="0" w:firstLine="560"/>
-        <w:jc w:val="both"/>
-      </w:pPr>
-      <w:r>
-        <w:rPr>
-          <w:rFonts w:ascii="Times New Roman" w:hAnsi="Times New Roman" w:cs="Times New Roman" w:eastAsia="仿宋"/>
-          <w:b w:val="0"/>
-          <w:sz w:val="28"/>
-        </w:rPr>
-        <w:t>PayPal USD（PYUSD）的加入值得关注。PayPal早在2023年就推出PYUSD，但此前主要用于其自有平台。通过与万事达卡合作，PYUSD将进入更广泛的线下和线上支付场景。PayPal首席执行官在声明中表示，这是实现PYUSD“无处不在”愿景的关键一步。同样，Ripple的RLUSD在2025年推出后，主要面向银行和金融机构，万事达卡的接入将使其触达零售端。</w:t>
-      </w:r>
-    </w:p>
-    <w:p>
-      <w:pPr>
-        <w:pStyle w:val="正文内容"/>
-        <w:spacing w:before="0" w:after="0" w:line="240" w:lineRule="auto"/>
-        <w:ind w:left="0" w:right="0" w:firstLine="560"/>
-        <w:jc w:val="both"/>
-      </w:pPr>
-      <w:r>
-        <w:rPr>
-          <w:rFonts w:ascii="Times New Roman" w:hAnsi="Times New Roman" w:cs="Times New Roman" w:eastAsia="仿宋"/>
-          <w:b w:val="0"/>
-          <w:sz w:val="28"/>
-        </w:rPr>
-        <w:t>市场反应方面，比特币和以太坊价格在消息发布后小幅上涨，但整体波动不大。投资者更关注稳定币流动性改善对DeFi和CeFi交互的长期影响。一些分析师指出，万事达卡若将来支持算法稳定币或收益型稳定币，可能引发更大变革，但目前万事达卡仅支持完全抵押的稳定币。</w:t>
-      </w:r>
-    </w:p>
-    <w:p>
-      <w:pPr>
-        <w:pStyle w:val="正文内容"/>
-        <w:spacing w:before="0" w:after="0" w:line="240" w:lineRule="auto"/>
-        <w:ind w:left="0" w:right="0" w:firstLine="560"/>
-        <w:jc w:val="both"/>
-      </w:pPr>
-      <w:r>
-        <w:rPr>
-          <w:rFonts w:ascii="Times New Roman" w:hAnsi="Times New Roman" w:cs="Times New Roman" w:eastAsia="仿宋"/>
-          <w:b w:val="0"/>
-          <w:sz w:val="28"/>
-        </w:rPr>
-        <w:t>万事达卡还计划在未来几个月内与更多稳定币发行方合作，包括评估新兴市场的本地货币挂钩稳定币。公司高管透露，正在研究对中央银行数字货币（CBDC）的支持。这表明万事达卡正将稳定币视为CBDC的补充，而非替代。</w:t>
-      </w:r>
-    </w:p>
-    <w:p>
-      <w:pPr>
-        <w:pStyle w:val="正文内容"/>
-        <w:spacing w:before="0" w:after="0" w:line="240" w:lineRule="auto"/>
-        <w:ind w:left="0" w:right="0" w:firstLine="560"/>
-        <w:jc w:val="both"/>
-      </w:pPr>
-      <w:r>
-        <w:rPr>
-          <w:rFonts w:ascii="Times New Roman" w:hAnsi="Times New Roman" w:cs="Times New Roman" w:eastAsia="仿宋"/>
-          <w:b w:val="0"/>
-          <w:sz w:val="28"/>
-        </w:rPr>
-        <w:t>总体而言，此次稳定币结算选项的扩展是万事达卡数字资产路线图的重要里程碑。它不仅增强了支付网络的包容性，也为传统金融与加密世界的融合提供了新范式。随着更多商户和消费者采用稳定币，全球支付体系或将迎来结构性转变。但挑战仍存，包括监管不确定性、技术漏洞风险以及储备透明度的持续审计要求。</w:t>
-      </w:r>
-    </w:p>
-    <w:p>
-      <w:pPr>
-        <w:pStyle w:val="信息来源"/>
-        <w:spacing w:before="50" w:after="100" w:line="240" w:lineRule="auto"/>
-        <w:ind w:left="0" w:right="0" w:firstLine="0"/>
-        <w:jc w:val="right"/>
-      </w:pPr>
-      <w:r>
-        <w:rPr>
-          <w:rFonts w:ascii="Times New Roman" w:hAnsi="Times New Roman" w:cs="Times New Roman" w:eastAsia="仿宋"/>
-          <w:b w:val="0"/>
-          <w:sz w:val="21"/>
-        </w:rPr>
-        <w:t>（信息来源：The Block）</w:t>
-      </w:r>
-    </w:p>
-    <w:p>
-      <w:pPr>
-        <w:pStyle w:val="原文信息"/>
-        <w:spacing w:before="0" w:after="0" w:line="240" w:lineRule="auto"/>
-        <w:ind w:left="0" w:right="0" w:firstLine="0"/>
-        <w:jc w:val="left"/>
-      </w:pPr>
-      <w:r>
-        <w:rPr>
-          <w:rFonts w:ascii="Times New Roman" w:hAnsi="Times New Roman" w:cs="Times New Roman" w:eastAsia="仿宋"/>
-          <w:b w:val="0"/>
-          <w:sz w:val="18"/>
-        </w:rPr>
-        <w:t>原文标题：Mastercard expands stablecoin settlement options with USDC， PYUSD and RLUSD - The Block</w:t>
+        <w:t>原文标题：Franklin Templeton says Wall Street fears blockchain because it threatens its profits</w:t>
       </w:r>
     </w:p>
     <w:p>

</xml_diff>